<commit_message>
Added Happiness "memory" trap + Changed GDD + Devlog
- Added Happiness "memory" trap. Meant to gradually increase the happiness of the player for as long as they stay there.
- Changed GDD: New low-fidelity level designs for tutorial + gameplay level, now includes description of what the player needs to do to beat the levels + changed traps names
- Added new Dev Log
</commit_message>
<xml_diff>
--- a/COMP3000 GDD.docx
+++ b/COMP3000 GDD.docx
@@ -1269,7 +1269,7 @@
           <w:sz w:val="22"/>
           <w:shd w:fill="auto" w:val="clear"/>
         </w:rPr>
-        <w:t xml:space="preserve">Each level will have certain areas unlocked that the player must unlock in order to progress. Certain elements found while exploring include:</w:t>
+        <w:t xml:space="preserve">Each level will have certain areas locked that the player must unlock in order to progress. Certain elements found while exploring include:</w:t>
       </w:r>
     </w:p>
     <w:p>
@@ -1342,18 +1342,18 @@
           <w:u w:val="single"/>
           <w:shd w:fill="auto" w:val="clear"/>
         </w:rPr>
-        <w:t xml:space="preserve">Buttons:</w:t>
-      </w:r>
-      <w:r>
-        <w:rPr>
-          <w:rFonts w:ascii="Arial" w:hAnsi="Arial" w:cs="Arial" w:eastAsia="Arial"/>
-          <w:color w:val="auto"/>
-          <w:spacing w:val="0"/>
-          <w:position w:val="0"/>
-          <w:sz w:val="22"/>
-          <w:shd w:fill="auto" w:val="clear"/>
-        </w:rPr>
-        <w:t xml:space="preserve"> Temporarily open passages to certain places</w:t>
+        <w:t xml:space="preserve">Fuses:</w:t>
+      </w:r>
+      <w:r>
+        <w:rPr>
+          <w:rFonts w:ascii="Arial" w:hAnsi="Arial" w:cs="Arial" w:eastAsia="Arial"/>
+          <w:color w:val="auto"/>
+          <w:spacing w:val="0"/>
+          <w:position w:val="0"/>
+          <w:sz w:val="22"/>
+          <w:shd w:fill="auto" w:val="clear"/>
+        </w:rPr>
+        <w:t xml:space="preserve"> Can be inserted to unlock certain doors</w:t>
       </w:r>
     </w:p>
     <w:p>
@@ -1384,6 +1384,48 @@
           <w:u w:val="single"/>
           <w:shd w:fill="auto" w:val="clear"/>
         </w:rPr>
+        <w:t xml:space="preserve">Crowbar:</w:t>
+      </w:r>
+      <w:r>
+        <w:rPr>
+          <w:rFonts w:ascii="Arial" w:hAnsi="Arial" w:cs="Arial" w:eastAsia="Arial"/>
+          <w:color w:val="auto"/>
+          <w:spacing w:val="0"/>
+          <w:position w:val="0"/>
+          <w:sz w:val="22"/>
+          <w:shd w:fill="auto" w:val="clear"/>
+        </w:rPr>
+        <w:t xml:space="preserve"> Used to remove wooden planks that block access to certain areas</w:t>
+      </w:r>
+    </w:p>
+    <w:p>
+      <w:pPr>
+        <w:numPr>
+          <w:ilvl w:val="0"/>
+          <w:numId w:val="20"/>
+        </w:numPr>
+        <w:spacing w:before="0" w:after="0" w:line="276"/>
+        <w:ind w:right="0" w:left="720" w:hanging="360"/>
+        <w:jc w:val="both"/>
+        <w:rPr>
+          <w:rFonts w:ascii="Arial" w:hAnsi="Arial" w:cs="Arial" w:eastAsia="Arial"/>
+          <w:color w:val="auto"/>
+          <w:spacing w:val="0"/>
+          <w:position w:val="0"/>
+          <w:sz w:val="22"/>
+          <w:shd w:fill="auto" w:val="clear"/>
+        </w:rPr>
+      </w:pPr>
+      <w:r>
+        <w:rPr>
+          <w:rFonts w:ascii="Arial" w:hAnsi="Arial" w:cs="Arial" w:eastAsia="Arial"/>
+          <w:color w:val="auto"/>
+          <w:spacing w:val="0"/>
+          <w:position w:val="0"/>
+          <w:sz w:val="22"/>
+          <w:u w:val="single"/>
+          <w:shd w:fill="auto" w:val="clear"/>
+        </w:rPr>
         <w:t xml:space="preserve">Codes:</w:t>
       </w:r>
       <w:r>
@@ -1395,7 +1437,7 @@
           <w:sz w:val="22"/>
           <w:shd w:fill="auto" w:val="clear"/>
         </w:rPr>
-        <w:t xml:space="preserve"> Hidden strings of numbers that can be inserted in certain locks to unlock them.</w:t>
+        <w:t xml:space="preserve"> Hidden strings of numbers that can be inserted in keypads</w:t>
       </w:r>
     </w:p>
     <w:p>
@@ -1747,6 +1789,101 @@
         <w:jc w:val="both"/>
         <w:rPr>
           <w:rFonts w:ascii="Arial" w:hAnsi="Arial" w:cs="Arial" w:eastAsia="Arial"/>
+          <w:color w:val="auto"/>
+          <w:spacing w:val="0"/>
+          <w:position w:val="0"/>
+          <w:sz w:val="22"/>
+          <w:shd w:fill="auto" w:val="clear"/>
+        </w:rPr>
+      </w:pPr>
+      <w:r>
+        <w:rPr>
+          <w:rFonts w:ascii="Arial" w:hAnsi="Arial" w:cs="Arial" w:eastAsia="Arial"/>
+          <w:color w:val="auto"/>
+          <w:spacing w:val="0"/>
+          <w:position w:val="0"/>
+          <w:sz w:val="22"/>
+          <w:shd w:fill="auto" w:val="clear"/>
+        </w:rPr>
+        <w:t xml:space="preserve">(Tomorrow expand)</w:t>
+      </w:r>
+    </w:p>
+    <w:p>
+      <w:pPr>
+        <w:spacing w:before="0" w:after="0" w:line="276"/>
+        <w:ind w:right="0" w:left="0" w:firstLine="0"/>
+        <w:jc w:val="both"/>
+        <w:rPr>
+          <w:rFonts w:ascii="Arial" w:hAnsi="Arial" w:cs="Arial" w:eastAsia="Arial"/>
+          <w:color w:val="auto"/>
+          <w:spacing w:val="0"/>
+          <w:position w:val="0"/>
+          <w:sz w:val="22"/>
+          <w:shd w:fill="auto" w:val="clear"/>
+        </w:rPr>
+      </w:pPr>
+      <w:r>
+        <w:rPr>
+          <w:rFonts w:ascii="Arial" w:hAnsi="Arial" w:cs="Arial" w:eastAsia="Arial"/>
+          <w:color w:val="auto"/>
+          <w:spacing w:val="0"/>
+          <w:position w:val="0"/>
+          <w:sz w:val="22"/>
+          <w:shd w:fill="auto" w:val="clear"/>
+        </w:rPr>
+        <w:t xml:space="preserve">- Enemy one: Some sort of ghost. Inflicts damage on the player when touched, and reacts sound</w:t>
+      </w:r>
+    </w:p>
+    <w:p>
+      <w:pPr>
+        <w:spacing w:before="0" w:after="0" w:line="276"/>
+        <w:ind w:right="0" w:left="0" w:firstLine="0"/>
+        <w:jc w:val="both"/>
+        <w:rPr>
+          <w:rFonts w:ascii="Arial" w:hAnsi="Arial" w:cs="Arial" w:eastAsia="Arial"/>
+          <w:b/>
+          <w:color w:val="auto"/>
+          <w:spacing w:val="0"/>
+          <w:position w:val="0"/>
+          <w:sz w:val="22"/>
+          <w:shd w:fill="auto" w:val="clear"/>
+        </w:rPr>
+      </w:pPr>
+      <w:r>
+        <w:rPr>
+          <w:rFonts w:ascii="Arial" w:hAnsi="Arial" w:cs="Arial" w:eastAsia="Arial"/>
+          <w:color w:val="auto"/>
+          <w:spacing w:val="0"/>
+          <w:position w:val="0"/>
+          <w:sz w:val="22"/>
+          <w:shd w:fill="auto" w:val="clear"/>
+        </w:rPr>
+        <w:t xml:space="preserve">- Enemy Two: Some sort of monster that feeds on damage (Looks for names). When touching the player, inflicts happiness. Does not react to sound</w:t>
+      </w:r>
+    </w:p>
+    <w:p>
+      <w:pPr>
+        <w:spacing w:before="0" w:after="0" w:line="276"/>
+        <w:ind w:right="0" w:left="0" w:firstLine="0"/>
+        <w:jc w:val="both"/>
+        <w:rPr>
+          <w:rFonts w:ascii="Arial" w:hAnsi="Arial" w:cs="Arial" w:eastAsia="Arial"/>
+          <w:b/>
+          <w:color w:val="auto"/>
+          <w:spacing w:val="0"/>
+          <w:position w:val="0"/>
+          <w:sz w:val="22"/>
+          <w:shd w:fill="auto" w:val="clear"/>
+        </w:rPr>
+      </w:pPr>
+    </w:p>
+    <w:p>
+      <w:pPr>
+        <w:spacing w:before="0" w:after="0" w:line="276"/>
+        <w:ind w:right="0" w:left="0" w:firstLine="0"/>
+        <w:jc w:val="both"/>
+        <w:rPr>
+          <w:rFonts w:ascii="Arial" w:hAnsi="Arial" w:cs="Arial" w:eastAsia="Arial"/>
           <w:b/>
           <w:color w:val="auto"/>
           <w:spacing w:val="0"/>
@@ -1822,18 +1959,18 @@
           <w:u w:val="single"/>
           <w:shd w:fill="auto" w:val="clear"/>
         </w:rPr>
-        <w:t xml:space="preserve">Happiness Trap</w:t>
-      </w:r>
-      <w:r>
-        <w:rPr>
-          <w:rFonts w:ascii="Arial" w:hAnsi="Arial" w:cs="Arial" w:eastAsia="Arial"/>
-          <w:color w:val="auto"/>
-          <w:spacing w:val="0"/>
-          <w:position w:val="0"/>
-          <w:sz w:val="22"/>
-          <w:shd w:fill="auto" w:val="clear"/>
-        </w:rPr>
-        <w:t xml:space="preserve">: Increases the happiness threshold by 2. activation.</w:t>
+        <w:t xml:space="preserve">Happy Memory</w:t>
+      </w:r>
+      <w:r>
+        <w:rPr>
+          <w:rFonts w:ascii="Arial" w:hAnsi="Arial" w:cs="Arial" w:eastAsia="Arial"/>
+          <w:color w:val="auto"/>
+          <w:spacing w:val="0"/>
+          <w:position w:val="0"/>
+          <w:sz w:val="22"/>
+          <w:shd w:fill="auto" w:val="clear"/>
+        </w:rPr>
+        <w:t xml:space="preserve">: Gradually increases the happiness threshold of the player when in close proximity.</w:t>
       </w:r>
     </w:p>
     <w:p>
@@ -1865,18 +2002,18 @@
           <w:u w:val="single"/>
           <w:shd w:fill="auto" w:val="clear"/>
         </w:rPr>
-        <w:t xml:space="preserve">Slowdown Trap</w:t>
-      </w:r>
-      <w:r>
-        <w:rPr>
-          <w:rFonts w:ascii="Arial" w:hAnsi="Arial" w:cs="Arial" w:eastAsia="Arial"/>
-          <w:color w:val="auto"/>
-          <w:spacing w:val="0"/>
-          <w:position w:val="0"/>
-          <w:sz w:val="22"/>
-          <w:shd w:fill="auto" w:val="clear"/>
-        </w:rPr>
-        <w:t xml:space="preserve">: Decreases player movement speed. </w:t>
+        <w:t xml:space="preserve">Happiness Spray:</w:t>
+      </w:r>
+      <w:r>
+        <w:rPr>
+          <w:rFonts w:ascii="Arial" w:hAnsi="Arial" w:cs="Arial" w:eastAsia="Arial"/>
+          <w:color w:val="auto"/>
+          <w:spacing w:val="0"/>
+          <w:position w:val="0"/>
+          <w:sz w:val="22"/>
+          <w:shd w:fill="auto" w:val="clear"/>
+        </w:rPr>
+        <w:t xml:space="preserve"> Immediatly increases the happiness threshold by 2.</w:t>
       </w:r>
     </w:p>
     <w:p>
@@ -1908,18 +2045,18 @@
           <w:u w:val="single"/>
           <w:shd w:fill="auto" w:val="clear"/>
         </w:rPr>
-        <w:t xml:space="preserve">Damage Trap</w:t>
-      </w:r>
-      <w:r>
-        <w:rPr>
-          <w:rFonts w:ascii="Arial" w:hAnsi="Arial" w:cs="Arial" w:eastAsia="Arial"/>
-          <w:color w:val="auto"/>
-          <w:spacing w:val="0"/>
-          <w:position w:val="0"/>
-          <w:sz w:val="22"/>
-          <w:shd w:fill="auto" w:val="clear"/>
-        </w:rPr>
-        <w:t xml:space="preserve">: Inflicts damage on the player. </w:t>
+        <w:t xml:space="preserve">Trip-wire</w:t>
+      </w:r>
+      <w:r>
+        <w:rPr>
+          <w:rFonts w:ascii="Arial" w:hAnsi="Arial" w:cs="Arial" w:eastAsia="Arial"/>
+          <w:color w:val="auto"/>
+          <w:spacing w:val="0"/>
+          <w:position w:val="0"/>
+          <w:sz w:val="22"/>
+          <w:shd w:fill="auto" w:val="clear"/>
+        </w:rPr>
+        <w:t xml:space="preserve">: Once triggered, inflicts a slowdown on the player. </w:t>
       </w:r>
     </w:p>
     <w:p>
@@ -2003,7 +2140,7 @@
           <w:sz w:val="22"/>
           <w:shd w:fill="auto" w:val="clear"/>
         </w:rPr>
-        <w:t xml:space="preserve">When exploring, the player might find some useful items along the way to aid them in their journey (Note: Names are not final)</w:t>
+        <w:t xml:space="preserve">When exploring, the player might find some useful items along the way to aid them in their journey (Note: Names are not final). The player must interact with the item to use it, and cannot bring it with them.</w:t>
       </w:r>
     </w:p>
     <w:p>
@@ -2146,25 +2283,624 @@
           <w:color w:val="auto"/>
           <w:spacing w:val="0"/>
           <w:position w:val="0"/>
-          <w:sz w:val="24"/>
-          <w:shd w:fill="auto" w:val="clear"/>
-        </w:rPr>
-      </w:pPr>
-    </w:p>
-    <w:p>
-      <w:pPr>
-        <w:spacing w:before="0" w:after="0" w:line="276"/>
-        <w:ind w:right="0" w:left="0" w:firstLine="0"/>
-        <w:jc w:val="both"/>
-        <w:rPr>
-          <w:rFonts w:ascii="Arial" w:hAnsi="Arial" w:cs="Arial" w:eastAsia="Arial"/>
-          <w:color w:val="auto"/>
-          <w:spacing w:val="0"/>
-          <w:position w:val="0"/>
-          <w:sz w:val="22"/>
-          <w:shd w:fill="auto" w:val="clear"/>
-        </w:rPr>
-      </w:pPr>
+          <w:sz w:val="22"/>
+          <w:shd w:fill="auto" w:val="clear"/>
+        </w:rPr>
+      </w:pPr>
+    </w:p>
+    <w:p>
+      <w:pPr>
+        <w:spacing w:before="0" w:after="0" w:line="276"/>
+        <w:ind w:right="0" w:left="0" w:firstLine="0"/>
+        <w:jc w:val="both"/>
+        <w:rPr>
+          <w:rFonts w:ascii="Arial" w:hAnsi="Arial" w:cs="Arial" w:eastAsia="Arial"/>
+          <w:color w:val="auto"/>
+          <w:spacing w:val="0"/>
+          <w:position w:val="0"/>
+          <w:sz w:val="22"/>
+          <w:shd w:fill="auto" w:val="clear"/>
+        </w:rPr>
+      </w:pPr>
+    </w:p>
+    <w:p>
+      <w:pPr>
+        <w:spacing w:before="0" w:after="0" w:line="276"/>
+        <w:ind w:right="0" w:left="0" w:firstLine="0"/>
+        <w:jc w:val="both"/>
+        <w:rPr>
+          <w:rFonts w:ascii="Calibri Light" w:hAnsi="Calibri Light" w:cs="Calibri Light" w:eastAsia="Calibri Light"/>
+          <w:color w:val="2F5496"/>
+          <w:spacing w:val="0"/>
+          <w:position w:val="0"/>
+          <w:sz w:val="36"/>
+          <w:shd w:fill="auto" w:val="clear"/>
+        </w:rPr>
+      </w:pPr>
+      <w:r>
+        <w:rPr>
+          <w:rFonts w:ascii="Calibri Light" w:hAnsi="Calibri Light" w:cs="Calibri Light" w:eastAsia="Calibri Light"/>
+          <w:color w:val="2F5496"/>
+          <w:spacing w:val="0"/>
+          <w:position w:val="0"/>
+          <w:sz w:val="36"/>
+          <w:shd w:fill="auto" w:val="clear"/>
+        </w:rPr>
+        <w:t xml:space="preserve">LEVEL DESIGN</w:t>
+      </w:r>
+    </w:p>
+    <w:p>
+      <w:pPr>
+        <w:spacing w:before="0" w:after="0" w:line="276"/>
+        <w:ind w:right="0" w:left="0" w:firstLine="0"/>
+        <w:jc w:val="both"/>
+        <w:rPr>
+          <w:rFonts w:ascii="Calibri Light" w:hAnsi="Calibri Light" w:cs="Calibri Light" w:eastAsia="Calibri Light"/>
+          <w:color w:val="2F5496"/>
+          <w:spacing w:val="0"/>
+          <w:position w:val="0"/>
+          <w:sz w:val="36"/>
+          <w:shd w:fill="auto" w:val="clear"/>
+        </w:rPr>
+      </w:pPr>
+      <w:r>
+        <w:rPr>
+          <w:rFonts w:ascii="Calibri Light" w:hAnsi="Calibri Light" w:cs="Calibri Light" w:eastAsia="Calibri Light"/>
+          <w:color w:val="2F5496"/>
+          <w:spacing w:val="0"/>
+          <w:position w:val="0"/>
+          <w:sz w:val="28"/>
+          <w:shd w:fill="auto" w:val="clear"/>
+        </w:rPr>
+        <w:t xml:space="preserve">Asthethics</w:t>
+      </w:r>
+    </w:p>
+    <w:p>
+      <w:pPr>
+        <w:spacing w:before="0" w:after="0" w:line="276"/>
+        <w:ind w:right="0" w:left="0" w:firstLine="0"/>
+        <w:jc w:val="both"/>
+        <w:rPr>
+          <w:rFonts w:ascii="Arial" w:hAnsi="Arial" w:cs="Arial" w:eastAsia="Arial"/>
+          <w:color w:val="auto"/>
+          <w:spacing w:val="0"/>
+          <w:position w:val="0"/>
+          <w:sz w:val="22"/>
+          <w:shd w:fill="auto" w:val="clear"/>
+        </w:rPr>
+      </w:pPr>
+      <w:r>
+        <w:rPr>
+          <w:rFonts w:ascii="Arial" w:hAnsi="Arial" w:cs="Arial" w:eastAsia="Arial"/>
+          <w:color w:val="auto"/>
+          <w:spacing w:val="0"/>
+          <w:position w:val="0"/>
+          <w:sz w:val="22"/>
+          <w:shd w:fill="auto" w:val="clear"/>
+        </w:rPr>
+        <w:t xml:space="preserve">As discussed in the narrative section, the game happens in the mind of our main character. The environment is going to resemble the appearance of an art college, as that is what the main characters attends lore-wise. For some minor parts, it might deviate from the theme as to support narrative elements such as certain rooms resembling important memories from the player (e.g. childhood memories)</w:t>
+      </w:r>
+    </w:p>
+    <w:p>
+      <w:pPr>
+        <w:spacing w:before="0" w:after="0" w:line="276"/>
+        <w:ind w:right="0" w:left="0" w:firstLine="0"/>
+        <w:jc w:val="both"/>
+        <w:rPr>
+          <w:rFonts w:ascii="Calibri Light" w:hAnsi="Calibri Light" w:cs="Calibri Light" w:eastAsia="Calibri Light"/>
+          <w:color w:val="2F5496"/>
+          <w:spacing w:val="0"/>
+          <w:position w:val="0"/>
+          <w:sz w:val="36"/>
+          <w:shd w:fill="auto" w:val="clear"/>
+        </w:rPr>
+      </w:pPr>
+    </w:p>
+    <w:p>
+      <w:pPr>
+        <w:spacing w:before="0" w:after="0" w:line="276"/>
+        <w:ind w:right="0" w:left="0" w:firstLine="0"/>
+        <w:jc w:val="both"/>
+        <w:rPr>
+          <w:rFonts w:ascii="Calibri Light" w:hAnsi="Calibri Light" w:cs="Calibri Light" w:eastAsia="Calibri Light"/>
+          <w:color w:val="2F5496"/>
+          <w:spacing w:val="0"/>
+          <w:position w:val="0"/>
+          <w:sz w:val="36"/>
+          <w:shd w:fill="auto" w:val="clear"/>
+        </w:rPr>
+      </w:pPr>
+      <w:r>
+        <w:rPr>
+          <w:rFonts w:ascii="Calibri Light" w:hAnsi="Calibri Light" w:cs="Calibri Light" w:eastAsia="Calibri Light"/>
+          <w:color w:val="2F5496"/>
+          <w:spacing w:val="0"/>
+          <w:position w:val="0"/>
+          <w:sz w:val="28"/>
+          <w:shd w:fill="auto" w:val="clear"/>
+        </w:rPr>
+        <w:t xml:space="preserve">Level gameplay</w:t>
+      </w:r>
+    </w:p>
+    <w:p>
+      <w:pPr>
+        <w:spacing w:before="0" w:after="0" w:line="276"/>
+        <w:ind w:right="0" w:left="0" w:firstLine="0"/>
+        <w:jc w:val="both"/>
+        <w:rPr>
+          <w:rFonts w:ascii="Arial" w:hAnsi="Arial" w:cs="Arial" w:eastAsia="Arial"/>
+          <w:color w:val="auto"/>
+          <w:spacing w:val="0"/>
+          <w:position w:val="0"/>
+          <w:sz w:val="22"/>
+          <w:shd w:fill="auto" w:val="clear"/>
+        </w:rPr>
+      </w:pPr>
+      <w:r>
+        <w:rPr>
+          <w:rFonts w:ascii="Arial" w:hAnsi="Arial" w:cs="Arial" w:eastAsia="Arial"/>
+          <w:color w:val="auto"/>
+          <w:spacing w:val="0"/>
+          <w:position w:val="0"/>
+          <w:sz w:val="22"/>
+          <w:shd w:fill="auto" w:val="clear"/>
+        </w:rPr>
+        <w:t xml:space="preserve">The prototype for the game is going to feature two levels: </w:t>
+      </w:r>
+    </w:p>
+    <w:p>
+      <w:pPr>
+        <w:spacing w:before="0" w:after="0" w:line="276"/>
+        <w:ind w:right="0" w:left="0" w:firstLine="0"/>
+        <w:jc w:val="both"/>
+        <w:rPr>
+          <w:rFonts w:ascii="Arial" w:hAnsi="Arial" w:cs="Arial" w:eastAsia="Arial"/>
+          <w:color w:val="auto"/>
+          <w:spacing w:val="0"/>
+          <w:position w:val="0"/>
+          <w:sz w:val="22"/>
+          <w:shd w:fill="auto" w:val="clear"/>
+        </w:rPr>
+      </w:pPr>
+      <w:r>
+        <w:rPr>
+          <w:rFonts w:ascii="Arial" w:hAnsi="Arial" w:cs="Arial" w:eastAsia="Arial"/>
+          <w:color w:val="auto"/>
+          <w:spacing w:val="0"/>
+          <w:position w:val="0"/>
+          <w:sz w:val="22"/>
+          <w:shd w:fill="auto" w:val="clear"/>
+        </w:rPr>
+        <w:t xml:space="preserve">- An introductory/tutorial level, aimed to introduce the player to the game atmosphere and give a short insight on how the game mechanics works (mainly the happiness meter), </w:t>
+      </w:r>
+    </w:p>
+    <w:p>
+      <w:pPr>
+        <w:spacing w:before="0" w:after="0" w:line="276"/>
+        <w:ind w:right="0" w:left="0" w:firstLine="0"/>
+        <w:jc w:val="both"/>
+        <w:rPr>
+          <w:rFonts w:ascii="Arial" w:hAnsi="Arial" w:cs="Arial" w:eastAsia="Arial"/>
+          <w:color w:val="auto"/>
+          <w:spacing w:val="0"/>
+          <w:position w:val="0"/>
+          <w:sz w:val="22"/>
+          <w:shd w:fill="auto" w:val="clear"/>
+        </w:rPr>
+      </w:pPr>
+      <w:r>
+        <w:rPr>
+          <w:rFonts w:ascii="Arial" w:hAnsi="Arial" w:cs="Arial" w:eastAsia="Arial"/>
+          <w:color w:val="auto"/>
+          <w:spacing w:val="0"/>
+          <w:position w:val="0"/>
+          <w:sz w:val="22"/>
+          <w:shd w:fill="auto" w:val="clear"/>
+        </w:rPr>
+        <w:t xml:space="preserve">- A gameplay level, meant to challenge the player by throwing everything the game has to offer at them. </w:t>
+      </w:r>
+    </w:p>
+    <w:p>
+      <w:pPr>
+        <w:spacing w:before="0" w:after="0" w:line="276"/>
+        <w:ind w:right="0" w:left="0" w:firstLine="0"/>
+        <w:jc w:val="both"/>
+        <w:rPr>
+          <w:rFonts w:ascii="Arial" w:hAnsi="Arial" w:cs="Arial" w:eastAsia="Arial"/>
+          <w:color w:val="auto"/>
+          <w:spacing w:val="0"/>
+          <w:position w:val="0"/>
+          <w:sz w:val="22"/>
+          <w:shd w:fill="auto" w:val="clear"/>
+        </w:rPr>
+      </w:pPr>
+    </w:p>
+    <w:p>
+      <w:pPr>
+        <w:spacing w:before="0" w:after="0" w:line="276"/>
+        <w:ind w:right="0" w:left="0" w:firstLine="0"/>
+        <w:jc w:val="both"/>
+        <w:rPr>
+          <w:rFonts w:ascii="Arial" w:hAnsi="Arial" w:cs="Arial" w:eastAsia="Arial"/>
+          <w:color w:val="auto"/>
+          <w:spacing w:val="0"/>
+          <w:position w:val="0"/>
+          <w:sz w:val="22"/>
+          <w:shd w:fill="auto" w:val="clear"/>
+        </w:rPr>
+      </w:pPr>
+      <w:r>
+        <w:rPr>
+          <w:rFonts w:ascii="Arial" w:hAnsi="Arial" w:cs="Arial" w:eastAsia="Arial"/>
+          <w:color w:val="auto"/>
+          <w:spacing w:val="0"/>
+          <w:position w:val="0"/>
+          <w:sz w:val="22"/>
+          <w:shd w:fill="auto" w:val="clear"/>
+        </w:rPr>
+        <w:t xml:space="preserve">Levels in Cherophobia have one end-goal: To find the master door, unlock it and escape through it. The Master Door has a keypad, wooden planks and a fuse which must be removed/accessed for it to unlock</w:t>
+      </w:r>
+    </w:p>
+    <w:p>
+      <w:pPr>
+        <w:spacing w:before="0" w:after="0" w:line="276"/>
+        <w:ind w:right="0" w:left="0" w:firstLine="0"/>
+        <w:jc w:val="both"/>
+        <w:rPr>
+          <w:rFonts w:ascii="Calibri Light" w:hAnsi="Calibri Light" w:cs="Calibri Light" w:eastAsia="Calibri Light"/>
+          <w:color w:val="2F5496"/>
+          <w:spacing w:val="0"/>
+          <w:position w:val="0"/>
+          <w:sz w:val="36"/>
+          <w:shd w:fill="auto" w:val="clear"/>
+        </w:rPr>
+      </w:pPr>
+    </w:p>
+    <w:p>
+      <w:pPr>
+        <w:spacing w:before="0" w:after="0" w:line="276"/>
+        <w:ind w:right="0" w:left="0" w:firstLine="0"/>
+        <w:jc w:val="both"/>
+        <w:rPr>
+          <w:rFonts w:ascii="Calibri Light" w:hAnsi="Calibri Light" w:cs="Calibri Light" w:eastAsia="Calibri Light"/>
+          <w:color w:val="2F5496"/>
+          <w:spacing w:val="0"/>
+          <w:position w:val="0"/>
+          <w:sz w:val="28"/>
+          <w:shd w:fill="auto" w:val="clear"/>
+        </w:rPr>
+      </w:pPr>
+      <w:r>
+        <w:rPr>
+          <w:rFonts w:ascii="Calibri Light" w:hAnsi="Calibri Light" w:cs="Calibri Light" w:eastAsia="Calibri Light"/>
+          <w:color w:val="2F5496"/>
+          <w:spacing w:val="0"/>
+          <w:position w:val="0"/>
+          <w:sz w:val="28"/>
+          <w:shd w:fill="auto" w:val="clear"/>
+        </w:rPr>
+        <w:t xml:space="preserve">Level 0 - Tutorial/Introduction</w:t>
+      </w:r>
+    </w:p>
+    <w:p>
+      <w:pPr>
+        <w:spacing w:before="0" w:after="0" w:line="276"/>
+        <w:ind w:right="0" w:left="0" w:firstLine="0"/>
+        <w:jc w:val="both"/>
+        <w:rPr>
+          <w:rFonts w:ascii="Arial" w:hAnsi="Arial" w:cs="Arial" w:eastAsia="Arial"/>
+          <w:color w:val="auto"/>
+          <w:spacing w:val="0"/>
+          <w:position w:val="0"/>
+          <w:sz w:val="22"/>
+          <w:shd w:fill="auto" w:val="clear"/>
+        </w:rPr>
+      </w:pPr>
+      <w:r>
+        <w:rPr>
+          <w:rFonts w:ascii="Arial" w:hAnsi="Arial" w:cs="Arial" w:eastAsia="Arial"/>
+          <w:color w:val="auto"/>
+          <w:spacing w:val="0"/>
+          <w:position w:val="0"/>
+          <w:sz w:val="22"/>
+          <w:shd w:fill="auto" w:val="clear"/>
+        </w:rPr>
+        <w:t xml:space="preserve">This is where the player is introduced to the game. In this level, there are no hostile enemies present, so it is impossible for the player to die. The layout consists of an I-Shaped arrangement of cube-sized rooms, with the player spawning facing the Master door in the correspondent room.</w:t>
+      </w:r>
+    </w:p>
+    <w:p>
+      <w:pPr>
+        <w:spacing w:before="0" w:after="0" w:line="276"/>
+        <w:ind w:right="0" w:left="0" w:firstLine="0"/>
+        <w:jc w:val="both"/>
+        <w:rPr>
+          <w:rFonts w:ascii="Arial" w:hAnsi="Arial" w:cs="Arial" w:eastAsia="Arial"/>
+          <w:color w:val="auto"/>
+          <w:spacing w:val="0"/>
+          <w:position w:val="0"/>
+          <w:sz w:val="22"/>
+          <w:shd w:fill="auto" w:val="clear"/>
+        </w:rPr>
+      </w:pPr>
+    </w:p>
+    <w:p>
+      <w:pPr>
+        <w:spacing w:before="0" w:after="0" w:line="276"/>
+        <w:ind w:right="0" w:left="0" w:firstLine="0"/>
+        <w:jc w:val="both"/>
+        <w:rPr>
+          <w:rFonts w:ascii="Arial" w:hAnsi="Arial" w:cs="Arial" w:eastAsia="Arial"/>
+          <w:color w:val="auto"/>
+          <w:spacing w:val="0"/>
+          <w:position w:val="0"/>
+          <w:sz w:val="22"/>
+          <w:shd w:fill="auto" w:val="clear"/>
+        </w:rPr>
+      </w:pPr>
+      <w:r>
+        <w:rPr>
+          <w:rFonts w:ascii="Arial" w:hAnsi="Arial" w:cs="Arial" w:eastAsia="Arial"/>
+          <w:color w:val="auto"/>
+          <w:spacing w:val="0"/>
+          <w:position w:val="0"/>
+          <w:sz w:val="22"/>
+          <w:shd w:fill="auto" w:val="clear"/>
+        </w:rPr>
+        <w:t xml:space="preserve">To beat the level, the player simply needs to go back and forth and collect the necessary items (and code string, regarding the keypad). The middle room has the crowbar item (necessary to remove the wooden planks from the master door), and the last room has a mini-puzzle the player must decipher to get the order of the code: On the left-side, four paintings are displayed from left to right, each with a prominent color tone, while on the right-side, numbers from 0 to 9 are imprinted on the walls, and each number has a different color - So to decipher the code, the player must insert in the keypad the sequence of numbers according to the color tones found in the paintings, and their number counterparts </w:t>
+      </w:r>
+    </w:p>
+    <w:p>
+      <w:pPr>
+        <w:spacing w:before="0" w:after="0" w:line="276"/>
+        <w:ind w:right="0" w:left="0" w:firstLine="0"/>
+        <w:jc w:val="both"/>
+        <w:rPr>
+          <w:rFonts w:ascii="Arial" w:hAnsi="Arial" w:cs="Arial" w:eastAsia="Arial"/>
+          <w:color w:val="auto"/>
+          <w:spacing w:val="0"/>
+          <w:position w:val="0"/>
+          <w:sz w:val="22"/>
+          <w:shd w:fill="auto" w:val="clear"/>
+        </w:rPr>
+      </w:pPr>
+    </w:p>
+    <w:p>
+      <w:pPr>
+        <w:spacing w:before="0" w:after="0" w:line="240"/>
+        <w:ind w:right="0" w:left="0" w:firstLine="0"/>
+        <w:jc w:val="both"/>
+        <w:rPr>
+          <w:rFonts w:ascii="Arial" w:hAnsi="Arial" w:cs="Arial" w:eastAsia="Arial"/>
+          <w:color w:val="auto"/>
+          <w:spacing w:val="0"/>
+          <w:position w:val="0"/>
+          <w:sz w:val="22"/>
+          <w:shd w:fill="auto" w:val="clear"/>
+        </w:rPr>
+      </w:pPr>
+      <w:r>
+        <w:object w:dxaOrig="8524" w:dyaOrig="6155">
+          <v:rect xmlns:o="urn:schemas-microsoft-com:office:office" xmlns:v="urn:schemas-microsoft-com:vml" id="rectole0000000000" style="width:426.200000pt;height:307.750000pt" o:preferrelative="t" o:ole="">
+            <o:lock v:ext="edit"/>
+            <v:imagedata xmlns:r="http://schemas.openxmlformats.org/officeDocument/2006/relationships" r:id="docRId1" o:title=""/>
+          </v:rect>
+          <o:OLEObject xmlns:r="http://schemas.openxmlformats.org/officeDocument/2006/relationships" xmlns:o="urn:schemas-microsoft-com:office:office" Type="Embed" ProgID="StaticDib" DrawAspect="Content" ObjectID="0000000000" ShapeID="rectole0000000000" r:id="docRId0"/>
+        </w:object>
+      </w:r>
+    </w:p>
+    <w:p>
+      <w:pPr>
+        <w:spacing w:before="0" w:after="0" w:line="276"/>
+        <w:ind w:right="0" w:left="0" w:firstLine="0"/>
+        <w:jc w:val="both"/>
+        <w:rPr>
+          <w:rFonts w:ascii="Arial" w:hAnsi="Arial" w:cs="Arial" w:eastAsia="Arial"/>
+          <w:color w:val="auto"/>
+          <w:spacing w:val="0"/>
+          <w:position w:val="0"/>
+          <w:sz w:val="22"/>
+          <w:shd w:fill="auto" w:val="clear"/>
+        </w:rPr>
+      </w:pPr>
+      <w:r>
+        <w:rPr>
+          <w:rFonts w:ascii="Arial" w:hAnsi="Arial" w:cs="Arial" w:eastAsia="Arial"/>
+          <w:color w:val="auto"/>
+          <w:spacing w:val="0"/>
+          <w:position w:val="0"/>
+          <w:sz w:val="16"/>
+          <w:shd w:fill="auto" w:val="clear"/>
+        </w:rPr>
+        <w:t xml:space="preserve">Diagram: Low-fidelity layout design for the introductory level</w:t>
+      </w:r>
+    </w:p>
+    <w:p>
+      <w:pPr>
+        <w:spacing w:before="0" w:after="0" w:line="276"/>
+        <w:ind w:right="0" w:left="0" w:firstLine="0"/>
+        <w:jc w:val="both"/>
+        <w:rPr>
+          <w:rFonts w:ascii="Arial" w:hAnsi="Arial" w:cs="Arial" w:eastAsia="Arial"/>
+          <w:color w:val="auto"/>
+          <w:spacing w:val="0"/>
+          <w:position w:val="0"/>
+          <w:sz w:val="22"/>
+          <w:shd w:fill="auto" w:val="clear"/>
+        </w:rPr>
+      </w:pPr>
+    </w:p>
+    <w:p>
+      <w:pPr>
+        <w:spacing w:before="0" w:after="0" w:line="276"/>
+        <w:ind w:right="0" w:left="0" w:firstLine="0"/>
+        <w:jc w:val="both"/>
+        <w:rPr>
+          <w:rFonts w:ascii="Arial" w:hAnsi="Arial" w:cs="Arial" w:eastAsia="Arial"/>
+          <w:color w:val="auto"/>
+          <w:spacing w:val="0"/>
+          <w:position w:val="0"/>
+          <w:sz w:val="22"/>
+          <w:shd w:fill="auto" w:val="clear"/>
+        </w:rPr>
+      </w:pPr>
+    </w:p>
+    <w:p>
+      <w:pPr>
+        <w:spacing w:before="0" w:after="0" w:line="276"/>
+        <w:ind w:right="0" w:left="0" w:firstLine="0"/>
+        <w:jc w:val="both"/>
+        <w:rPr>
+          <w:rFonts w:ascii="Arial" w:hAnsi="Arial" w:cs="Arial" w:eastAsia="Arial"/>
+          <w:color w:val="auto"/>
+          <w:spacing w:val="0"/>
+          <w:position w:val="0"/>
+          <w:sz w:val="22"/>
+          <w:shd w:fill="auto" w:val="clear"/>
+        </w:rPr>
+      </w:pPr>
+    </w:p>
+    <w:p>
+      <w:pPr>
+        <w:spacing w:before="0" w:after="0" w:line="276"/>
+        <w:ind w:right="0" w:left="0" w:firstLine="0"/>
+        <w:jc w:val="both"/>
+        <w:rPr>
+          <w:rFonts w:ascii="Calibri Light" w:hAnsi="Calibri Light" w:cs="Calibri Light" w:eastAsia="Calibri Light"/>
+          <w:color w:val="2F5496"/>
+          <w:spacing w:val="0"/>
+          <w:position w:val="0"/>
+          <w:sz w:val="28"/>
+          <w:shd w:fill="auto" w:val="clear"/>
+        </w:rPr>
+      </w:pPr>
+      <w:r>
+        <w:rPr>
+          <w:rFonts w:ascii="Calibri Light" w:hAnsi="Calibri Light" w:cs="Calibri Light" w:eastAsia="Calibri Light"/>
+          <w:color w:val="2F5496"/>
+          <w:spacing w:val="0"/>
+          <w:position w:val="0"/>
+          <w:sz w:val="28"/>
+          <w:shd w:fill="auto" w:val="clear"/>
+        </w:rPr>
+        <w:t xml:space="preserve">Level 1 - Main gameplay level</w:t>
+      </w:r>
+    </w:p>
+    <w:p>
+      <w:pPr>
+        <w:spacing w:before="0" w:after="0" w:line="276"/>
+        <w:ind w:right="0" w:left="0" w:firstLine="0"/>
+        <w:jc w:val="both"/>
+        <w:rPr>
+          <w:rFonts w:ascii="Arial" w:hAnsi="Arial" w:cs="Arial" w:eastAsia="Arial"/>
+          <w:color w:val="auto"/>
+          <w:spacing w:val="0"/>
+          <w:position w:val="0"/>
+          <w:sz w:val="22"/>
+          <w:shd w:fill="auto" w:val="clear"/>
+        </w:rPr>
+      </w:pPr>
+      <w:r>
+        <w:rPr>
+          <w:rFonts w:ascii="Arial" w:hAnsi="Arial" w:cs="Arial" w:eastAsia="Arial"/>
+          <w:color w:val="auto"/>
+          <w:spacing w:val="0"/>
+          <w:position w:val="0"/>
+          <w:sz w:val="22"/>
+          <w:shd w:fill="auto" w:val="clear"/>
+        </w:rPr>
+        <w:t xml:space="preserve">Similiar to the Tutorial Level, the player spawns looking directly at the door in hopes they immediatly recognize what needs to be found in order to unlock the door. Once that information is conveyed, the player must then explore their surroudings while avoiding placed enemies/traps until they fully unlock the Master Door.</w:t>
+      </w:r>
+    </w:p>
+    <w:p>
+      <w:pPr>
+        <w:spacing w:before="0" w:after="0" w:line="276"/>
+        <w:ind w:right="0" w:left="0" w:firstLine="0"/>
+        <w:jc w:val="both"/>
+        <w:rPr>
+          <w:rFonts w:ascii="Arial" w:hAnsi="Arial" w:cs="Arial" w:eastAsia="Arial"/>
+          <w:color w:val="auto"/>
+          <w:spacing w:val="0"/>
+          <w:position w:val="0"/>
+          <w:sz w:val="22"/>
+          <w:shd w:fill="auto" w:val="clear"/>
+        </w:rPr>
+      </w:pPr>
+    </w:p>
+    <w:p>
+      <w:pPr>
+        <w:spacing w:before="0" w:after="0" w:line="276"/>
+        <w:ind w:right="0" w:left="0" w:firstLine="0"/>
+        <w:jc w:val="both"/>
+        <w:rPr>
+          <w:rFonts w:ascii="Arial" w:hAnsi="Arial" w:cs="Arial" w:eastAsia="Arial"/>
+          <w:color w:val="auto"/>
+          <w:spacing w:val="0"/>
+          <w:position w:val="0"/>
+          <w:sz w:val="22"/>
+          <w:shd w:fill="auto" w:val="clear"/>
+        </w:rPr>
+      </w:pPr>
+      <w:r>
+        <w:rPr>
+          <w:rFonts w:ascii="Arial" w:hAnsi="Arial" w:cs="Arial" w:eastAsia="Arial"/>
+          <w:color w:val="auto"/>
+          <w:spacing w:val="0"/>
+          <w:position w:val="0"/>
+          <w:sz w:val="22"/>
+          <w:shd w:fill="auto" w:val="clear"/>
+        </w:rPr>
+        <w:t xml:space="preserve">Each component of the Master Door (Fuse/Crowbar/Code) is scattered across the map, consisting of a Square layout with multiple classromms in a 2 by 3 grid (6 rooms total) with hallways in-between (Some being blocked). Certain components are not immediatly available from just going around rooms, and require the player to obtain another component to access it. For example, the fuse will be hidden in a classroom that can only be accessible by removing the wooden-planks that are blocking the door. (image tmr. maybe do an irl drawing?)</w:t>
+      </w:r>
+    </w:p>
+    <w:p>
+      <w:pPr>
+        <w:spacing w:before="0" w:after="0" w:line="240"/>
+        <w:ind w:right="0" w:left="0" w:firstLine="0"/>
+        <w:jc w:val="both"/>
+        <w:rPr>
+          <w:rFonts w:ascii="Arial" w:hAnsi="Arial" w:cs="Arial" w:eastAsia="Arial"/>
+          <w:color w:val="auto"/>
+          <w:spacing w:val="0"/>
+          <w:position w:val="0"/>
+          <w:sz w:val="22"/>
+          <w:shd w:fill="auto" w:val="clear"/>
+        </w:rPr>
+      </w:pPr>
+      <w:r>
+        <w:object w:dxaOrig="8524" w:dyaOrig="8524">
+          <v:rect xmlns:o="urn:schemas-microsoft-com:office:office" xmlns:v="urn:schemas-microsoft-com:vml" id="rectole0000000001" style="width:426.200000pt;height:426.200000pt" o:preferrelative="t" o:ole="">
+            <o:lock v:ext="edit"/>
+            <v:imagedata xmlns:r="http://schemas.openxmlformats.org/officeDocument/2006/relationships" r:id="docRId3" o:title=""/>
+          </v:rect>
+          <o:OLEObject xmlns:r="http://schemas.openxmlformats.org/officeDocument/2006/relationships" xmlns:o="urn:schemas-microsoft-com:office:office" Type="Embed" ProgID="StaticDib" DrawAspect="Content" ObjectID="0000000001" ShapeID="rectole0000000001" r:id="docRId2"/>
+        </w:object>
+      </w:r>
+    </w:p>
+    <w:p>
+      <w:pPr>
+        <w:spacing w:before="0" w:after="0" w:line="276"/>
+        <w:ind w:right="0" w:left="0" w:firstLine="0"/>
+        <w:jc w:val="both"/>
+        <w:rPr>
+          <w:rFonts w:ascii="Calibri Light" w:hAnsi="Calibri Light" w:cs="Calibri Light" w:eastAsia="Calibri Light"/>
+          <w:color w:val="2F5496"/>
+          <w:spacing w:val="0"/>
+          <w:position w:val="0"/>
+          <w:sz w:val="28"/>
+          <w:shd w:fill="auto" w:val="clear"/>
+        </w:rPr>
+      </w:pPr>
+      <w:r>
+        <w:rPr>
+          <w:rFonts w:ascii="Arial" w:hAnsi="Arial" w:cs="Arial" w:eastAsia="Arial"/>
+          <w:color w:val="auto"/>
+          <w:spacing w:val="0"/>
+          <w:position w:val="0"/>
+          <w:sz w:val="16"/>
+          <w:shd w:fill="auto" w:val="clear"/>
+        </w:rPr>
+        <w:t xml:space="preserve">Diagram: Low-fidelity layout design for the gameplay level</w:t>
+      </w:r>
     </w:p>
     <w:p>
       <w:pPr>
@@ -2415,7 +3151,7 @@
       <w:pPr>
         <w:numPr>
           <w:ilvl w:val="0"/>
-          <w:numId w:val="28"/>
+          <w:numId w:val="32"/>
         </w:numPr>
         <w:spacing w:before="0" w:after="160" w:line="278"/>
         <w:ind w:right="0" w:left="720" w:hanging="360"/>
@@ -2449,194 +3185,7 @@
           <w:sz w:val="24"/>
           <w:shd w:fill="auto" w:val="clear"/>
         </w:rPr>
-        <w:t xml:space="preserve">→</w:t>
-      </w:r>
-      <w:r>
-        <w:rPr>
-          <w:rFonts w:ascii="Cambria Math" w:hAnsi="Cambria Math" w:cs="Cambria Math" w:eastAsia="Cambria Math"/>
-          <w:color w:val="auto"/>
-          <w:spacing w:val="0"/>
-          <w:position w:val="0"/>
-          <w:sz w:val="24"/>
-          <w:shd w:fill="auto" w:val="clear"/>
-        </w:rPr>
-        <w:t xml:space="preserve"> Importants mechanics like Happiness Bar </w:t>
-      </w:r>
-      <w:r>
-        <w:rPr>
-          <w:rFonts w:ascii="Cambria Math" w:hAnsi="Cambria Math" w:cs="Cambria Math" w:eastAsia="Cambria Math"/>
-          <w:color w:val="auto"/>
-          <w:spacing w:val="0"/>
-          <w:position w:val="0"/>
-          <w:sz w:val="24"/>
-          <w:shd w:fill="auto" w:val="clear"/>
-        </w:rPr>
-        <w:t xml:space="preserve">→</w:t>
-      </w:r>
-      <w:r>
-        <w:rPr>
-          <w:rFonts w:ascii="Cambria Math" w:hAnsi="Cambria Math" w:cs="Cambria Math" w:eastAsia="Cambria Math"/>
-          <w:color w:val="auto"/>
-          <w:spacing w:val="0"/>
-          <w:position w:val="0"/>
-          <w:sz w:val="24"/>
-          <w:shd w:fill="auto" w:val="clear"/>
-        </w:rPr>
-        <w:t xml:space="preserve"> Enemy AI </w:t>
-      </w:r>
-      <w:r>
-        <w:rPr>
-          <w:rFonts w:ascii="Cambria Math" w:hAnsi="Cambria Math" w:cs="Cambria Math" w:eastAsia="Cambria Math"/>
-          <w:color w:val="auto"/>
-          <w:spacing w:val="0"/>
-          <w:position w:val="0"/>
-          <w:sz w:val="24"/>
-          <w:shd w:fill="auto" w:val="clear"/>
-        </w:rPr>
-        <w:t xml:space="preserve">→</w:t>
-      </w:r>
-      <w:r>
-        <w:rPr>
-          <w:rFonts w:ascii="Cambria Math" w:hAnsi="Cambria Math" w:cs="Cambria Math" w:eastAsia="Cambria Math"/>
-          <w:color w:val="auto"/>
-          <w:spacing w:val="0"/>
-          <w:position w:val="0"/>
-          <w:sz w:val="24"/>
-          <w:shd w:fill="auto" w:val="clear"/>
-        </w:rPr>
-        <w:t xml:space="preserve"> Hiding mechanic </w:t>
-      </w:r>
-      <w:r>
-        <w:rPr>
-          <w:rFonts w:ascii="Cambria Math" w:hAnsi="Cambria Math" w:cs="Cambria Math" w:eastAsia="Cambria Math"/>
-          <w:color w:val="auto"/>
-          <w:spacing w:val="0"/>
-          <w:position w:val="0"/>
-          <w:sz w:val="24"/>
-          <w:shd w:fill="auto" w:val="clear"/>
-        </w:rPr>
-        <w:t xml:space="preserve">→</w:t>
-      </w:r>
-      <w:r>
-        <w:rPr>
-          <w:rFonts w:ascii="Cambria Math" w:hAnsi="Cambria Math" w:cs="Cambria Math" w:eastAsia="Cambria Math"/>
-          <w:color w:val="auto"/>
-          <w:spacing w:val="0"/>
-          <w:position w:val="0"/>
-          <w:sz w:val="24"/>
-          <w:shd w:fill="auto" w:val="clear"/>
-        </w:rPr>
-        <w:t xml:space="preserve"> Traps </w:t>
-      </w:r>
-      <w:r>
-        <w:rPr>
-          <w:rFonts w:ascii="Cambria Math" w:hAnsi="Cambria Math" w:cs="Cambria Math" w:eastAsia="Cambria Math"/>
-          <w:color w:val="auto"/>
-          <w:spacing w:val="0"/>
-          <w:position w:val="0"/>
-          <w:sz w:val="24"/>
-          <w:shd w:fill="auto" w:val="clear"/>
-        </w:rPr>
-        <w:t xml:space="preserve">→</w:t>
-      </w:r>
-      <w:r>
-        <w:rPr>
-          <w:rFonts w:ascii="Cambria Math" w:hAnsi="Cambria Math" w:cs="Cambria Math" w:eastAsia="Cambria Math"/>
-          <w:color w:val="auto"/>
-          <w:spacing w:val="0"/>
-          <w:position w:val="0"/>
-          <w:sz w:val="24"/>
-          <w:shd w:fill="auto" w:val="clear"/>
-        </w:rPr>
-        <w:t xml:space="preserve"> Items </w:t>
-      </w:r>
-      <w:r>
-        <w:rPr>
-          <w:rFonts w:ascii="Cambria Math" w:hAnsi="Cambria Math" w:cs="Cambria Math" w:eastAsia="Cambria Math"/>
-          <w:color w:val="auto"/>
-          <w:spacing w:val="0"/>
-          <w:position w:val="0"/>
-          <w:sz w:val="24"/>
-          <w:shd w:fill="auto" w:val="clear"/>
-        </w:rPr>
-        <w:t xml:space="preserve">→</w:t>
-      </w:r>
-      <w:r>
-        <w:rPr>
-          <w:rFonts w:ascii="Cambria Math" w:hAnsi="Cambria Math" w:cs="Cambria Math" w:eastAsia="Cambria Math"/>
-          <w:color w:val="auto"/>
-          <w:spacing w:val="0"/>
-          <w:position w:val="0"/>
-          <w:sz w:val="24"/>
-          <w:shd w:fill="auto" w:val="clear"/>
-        </w:rPr>
-        <w:t xml:space="preserve"> playable map </w:t>
-      </w:r>
-      <w:r>
-        <w:rPr>
-          <w:rFonts w:ascii="Cambria Math" w:hAnsi="Cambria Math" w:cs="Cambria Math" w:eastAsia="Cambria Math"/>
-          <w:color w:val="auto"/>
-          <w:spacing w:val="0"/>
-          <w:position w:val="0"/>
-          <w:sz w:val="24"/>
-          <w:shd w:fill="auto" w:val="clear"/>
-        </w:rPr>
-        <w:t xml:space="preserve">→</w:t>
-      </w:r>
-      <w:r>
-        <w:rPr>
-          <w:rFonts w:ascii="Cambria Math" w:hAnsi="Cambria Math" w:cs="Cambria Math" w:eastAsia="Cambria Math"/>
-          <w:color w:val="auto"/>
-          <w:spacing w:val="0"/>
-          <w:position w:val="0"/>
-          <w:sz w:val="24"/>
-          <w:shd w:fill="auto" w:val="clear"/>
-        </w:rPr>
-        <w:t xml:space="preserve"> cutscenes/lore </w:t>
-      </w:r>
-      <w:r>
-        <w:rPr>
-          <w:rFonts w:ascii="Cambria Math" w:hAnsi="Cambria Math" w:cs="Cambria Math" w:eastAsia="Cambria Math"/>
-          <w:color w:val="auto"/>
-          <w:spacing w:val="0"/>
-          <w:position w:val="0"/>
-          <w:sz w:val="24"/>
-          <w:shd w:fill="auto" w:val="clear"/>
-        </w:rPr>
-        <w:t xml:space="preserve">→</w:t>
-      </w:r>
-      <w:r>
-        <w:rPr>
-          <w:rFonts w:ascii="Cambria Math" w:hAnsi="Cambria Math" w:cs="Cambria Math" w:eastAsia="Cambria Math"/>
-          <w:color w:val="auto"/>
-          <w:spacing w:val="0"/>
-          <w:position w:val="0"/>
-          <w:sz w:val="24"/>
-          <w:shd w:fill="auto" w:val="clear"/>
-        </w:rPr>
-        <w:t xml:space="preserve"> polishing </w:t>
-      </w:r>
-      <w:r>
-        <w:rPr>
-          <w:rFonts w:ascii="Cambria Math" w:hAnsi="Cambria Math" w:cs="Cambria Math" w:eastAsia="Cambria Math"/>
-          <w:color w:val="auto"/>
-          <w:spacing w:val="0"/>
-          <w:position w:val="0"/>
-          <w:sz w:val="24"/>
-          <w:shd w:fill="auto" w:val="clear"/>
-        </w:rPr>
-        <w:t xml:space="preserve">→</w:t>
-      </w:r>
-      <w:r>
-        <w:rPr>
-          <w:rFonts w:ascii="Cambria Math" w:hAnsi="Cambria Math" w:cs="Cambria Math" w:eastAsia="Cambria Math"/>
-          <w:color w:val="auto"/>
-          <w:spacing w:val="0"/>
-          <w:position w:val="0"/>
-          <w:sz w:val="24"/>
-          <w:shd w:fill="auto" w:val="clear"/>
-        </w:rPr>
-        <w:t xml:space="preserve"> release)</w:t>
+        <w:t xml:space="preserve">→ Importants mechanics like Happiness Bar → Enemy AI → Hiding mechanic → Traps → Items → playable map → cutscenes/lore → polishing → release)</w:t>
       </w:r>
     </w:p>
     <w:p>
@@ -2669,7 +3218,7 @@
       <w:pPr>
         <w:numPr>
           <w:ilvl w:val="0"/>
-          <w:numId w:val="30"/>
+          <w:numId w:val="34"/>
         </w:numPr>
         <w:spacing w:before="0" w:after="160" w:line="278"/>
         <w:ind w:right="0" w:left="720" w:hanging="360"/>
@@ -2725,7 +3274,7 @@
       <w:pPr>
         <w:numPr>
           <w:ilvl w:val="0"/>
-          <w:numId w:val="32"/>
+          <w:numId w:val="36"/>
         </w:numPr>
         <w:spacing w:before="0" w:after="160" w:line="278"/>
         <w:ind w:right="0" w:left="720" w:hanging="360"/>
@@ -2955,13 +3504,13 @@
   <w:num w:numId="26">
     <w:abstractNumId w:val="18"/>
   </w:num>
-  <w:num w:numId="28">
+  <w:num w:numId="32">
     <w:abstractNumId w:val="12"/>
   </w:num>
-  <w:num w:numId="30">
+  <w:num w:numId="34">
     <w:abstractNumId w:val="6"/>
   </w:num>
-  <w:num w:numId="32">
+  <w:num w:numId="36">
     <w:abstractNumId w:val="0"/>
   </w:num>
 </w:numbering>

</xml_diff>

<commit_message>
Devlog + Interaction system + Updated GDD
Added the following this 2 weeks (All covered in Dev Log)
- Interaction system that works on Object Tags.
- Master Door with Codepad, planks and Fusebox. Items must be obtained before each component can be unlocked (So code pin, crowbars and Fuse for each component, respectively).
- Solidifed enemy designs in GDD (Along with reference art): The game will have two main enemies: The Mimic and Phantoms
</commit_message>
<xml_diff>
--- a/COMP3000 GDD.docx
+++ b/COMP3000 GDD.docx
@@ -1426,18 +1426,18 @@
           <w:u w:val="single"/>
           <w:shd w:fill="auto" w:val="clear"/>
         </w:rPr>
-        <w:t xml:space="preserve">Codes:</w:t>
-      </w:r>
-      <w:r>
-        <w:rPr>
-          <w:rFonts w:ascii="Arial" w:hAnsi="Arial" w:cs="Arial" w:eastAsia="Arial"/>
-          <w:color w:val="auto"/>
-          <w:spacing w:val="0"/>
-          <w:position w:val="0"/>
-          <w:sz w:val="22"/>
-          <w:shd w:fill="auto" w:val="clear"/>
-        </w:rPr>
-        <w:t xml:space="preserve"> Hidden strings of numbers that can be inserted in keypads</w:t>
+        <w:t xml:space="preserve">Paper with Code:</w:t>
+      </w:r>
+      <w:r>
+        <w:rPr>
+          <w:rFonts w:ascii="Arial" w:hAnsi="Arial" w:cs="Arial" w:eastAsia="Arial"/>
+          <w:color w:val="auto"/>
+          <w:spacing w:val="0"/>
+          <w:position w:val="0"/>
+          <w:sz w:val="22"/>
+          <w:shd w:fill="auto" w:val="clear"/>
+        </w:rPr>
+        <w:t xml:space="preserve"> Used to unlock doors hidden behind a keypad.</w:t>
       </w:r>
     </w:p>
     <w:p>
@@ -1505,7 +1505,7 @@
           <w:sz w:val="22"/>
           <w:shd w:fill="auto" w:val="clear"/>
         </w:rPr>
-        <w:t xml:space="preserve">There are a few enemies the player will face in each level. Each enemy will present certain behaviour types:</w:t>
+        <w:t xml:space="preserve">The game is going to possess two different types of enemy. Their presence level will entirely depend on the current progress made by the player at the given time. The enemies are meant to be unstoppable, so the player must avoid them at all costs</w:t>
       </w:r>
     </w:p>
     <w:p>
@@ -1519,11 +1519,10 @@
         <w:jc w:val="both"/>
         <w:rPr>
           <w:rFonts w:ascii="Arial" w:hAnsi="Arial" w:cs="Arial" w:eastAsia="Arial"/>
-          <w:b/>
-          <w:color w:val="auto"/>
-          <w:spacing w:val="0"/>
-          <w:position w:val="0"/>
-          <w:sz w:val="24"/>
+          <w:color w:val="auto"/>
+          <w:spacing w:val="0"/>
+          <w:position w:val="0"/>
+          <w:sz w:val="22"/>
           <w:shd w:fill="auto" w:val="clear"/>
         </w:rPr>
       </w:pPr>
@@ -1537,18 +1536,18 @@
           <w:u w:val="single"/>
           <w:shd w:fill="auto" w:val="clear"/>
         </w:rPr>
-        <w:t xml:space="preserve">Roaming</w:t>
-      </w:r>
-      <w:r>
-        <w:rPr>
-          <w:rFonts w:ascii="Arial" w:hAnsi="Arial" w:cs="Arial" w:eastAsia="Arial"/>
-          <w:color w:val="auto"/>
-          <w:spacing w:val="0"/>
-          <w:position w:val="0"/>
-          <w:sz w:val="22"/>
-          <w:shd w:fill="auto" w:val="clear"/>
-        </w:rPr>
-        <w:t xml:space="preserve">: Enemies will walk from one point to another indefinitely.</w:t>
+        <w:t xml:space="preserve">The Mimic:</w:t>
+      </w:r>
+      <w:r>
+        <w:rPr>
+          <w:rFonts w:ascii="Arial" w:hAnsi="Arial" w:cs="Arial" w:eastAsia="Arial"/>
+          <w:color w:val="auto"/>
+          <w:spacing w:val="0"/>
+          <w:position w:val="0"/>
+          <w:sz w:val="22"/>
+          <w:shd w:fill="auto" w:val="clear"/>
+        </w:rPr>
+        <w:t xml:space="preserve"> The main antagonist of the game. It will patrol from one point to another, tranversing the entire map, and will possess the ability to see and hear the player. On contact with the player, it will deal damage.</w:t>
       </w:r>
     </w:p>
     <w:p>
@@ -1566,7 +1565,7 @@
           <w:color w:val="auto"/>
           <w:spacing w:val="0"/>
           <w:position w:val="0"/>
-          <w:sz w:val="24"/>
+          <w:sz w:val="22"/>
           <w:shd w:fill="auto" w:val="clear"/>
         </w:rPr>
       </w:pPr>
@@ -1580,25 +1579,110 @@
           <w:u w:val="single"/>
           <w:shd w:fill="auto" w:val="clear"/>
         </w:rPr>
-        <w:t xml:space="preserve">Sound detection</w:t>
-      </w:r>
-      <w:r>
-        <w:rPr>
-          <w:rFonts w:ascii="Arial" w:hAnsi="Arial" w:cs="Arial" w:eastAsia="Arial"/>
-          <w:color w:val="auto"/>
-          <w:spacing w:val="0"/>
-          <w:position w:val="0"/>
-          <w:sz w:val="22"/>
-          <w:shd w:fill="auto" w:val="clear"/>
-        </w:rPr>
-        <w:t xml:space="preserve">: Enemies will be aware of sound in their surrounding. Upon detecting any abnormal sound, they will path toward the position where it was emitted, and if no threat is detected, they will return to their usual path.</w:t>
+        <w:t xml:space="preserve">Phantoms:</w:t>
+      </w:r>
+      <w:r>
+        <w:rPr>
+          <w:rFonts w:ascii="Arial" w:hAnsi="Arial" w:cs="Arial" w:eastAsia="Arial"/>
+          <w:color w:val="auto"/>
+          <w:spacing w:val="0"/>
+          <w:position w:val="0"/>
+          <w:sz w:val="22"/>
+          <w:shd w:fill="auto" w:val="clear"/>
+        </w:rPr>
+        <w:t xml:space="preserve"> Agile, but blind. There will be multiple scattered across the map - When entering contact with a player, they will increase their happiness meter, slow the player slightly and despawning right after. Phantoms cannot directly kill the player unless their happiness meter is at full capacity (as explained previously with the happiness mechanic)</w:t>
+      </w:r>
+    </w:p>
+    <w:p>
+      <w:pPr>
+        <w:spacing w:before="0" w:after="0" w:line="276"/>
+        <w:ind w:right="0" w:left="0" w:firstLine="0"/>
+        <w:jc w:val="both"/>
+        <w:rPr>
+          <w:rFonts w:ascii="Arial" w:hAnsi="Arial" w:cs="Arial" w:eastAsia="Arial"/>
+          <w:b/>
+          <w:color w:val="auto"/>
+          <w:spacing w:val="0"/>
+          <w:position w:val="0"/>
+          <w:sz w:val="22"/>
+          <w:shd w:fill="auto" w:val="clear"/>
+        </w:rPr>
+      </w:pPr>
+    </w:p>
+    <w:p>
+      <w:pPr>
+        <w:spacing w:before="0" w:after="0" w:line="276"/>
+        <w:ind w:right="0" w:left="0" w:firstLine="0"/>
+        <w:jc w:val="both"/>
+        <w:rPr>
+          <w:rFonts w:ascii="Arial" w:hAnsi="Arial" w:cs="Arial" w:eastAsia="Arial"/>
+          <w:b/>
+          <w:color w:val="auto"/>
+          <w:spacing w:val="0"/>
+          <w:position w:val="0"/>
+          <w:sz w:val="22"/>
+          <w:shd w:fill="auto" w:val="clear"/>
+        </w:rPr>
+      </w:pPr>
+    </w:p>
+    <w:p>
+      <w:pPr>
+        <w:spacing w:before="0" w:after="0" w:line="276"/>
+        <w:ind w:right="0" w:left="0" w:firstLine="0"/>
+        <w:jc w:val="both"/>
+        <w:rPr>
+          <w:rFonts w:ascii="Arial" w:hAnsi="Arial" w:cs="Arial" w:eastAsia="Arial"/>
+          <w:b/>
+          <w:color w:val="auto"/>
+          <w:spacing w:val="0"/>
+          <w:position w:val="0"/>
+          <w:sz w:val="24"/>
+          <w:shd w:fill="auto" w:val="clear"/>
+        </w:rPr>
+      </w:pPr>
+      <w:r>
+        <w:rPr>
+          <w:rFonts w:ascii="Calibri Light" w:hAnsi="Calibri Light" w:cs="Calibri Light" w:eastAsia="Calibri Light"/>
+          <w:color w:val="2F5496"/>
+          <w:spacing w:val="0"/>
+          <w:position w:val="0"/>
+          <w:sz w:val="28"/>
+          <w:shd w:fill="auto" w:val="clear"/>
+        </w:rPr>
+        <w:t xml:space="preserve">Traps</w:t>
+      </w:r>
+    </w:p>
+    <w:p>
+      <w:pPr>
+        <w:spacing w:before="0" w:after="0" w:line="276"/>
+        <w:ind w:right="0" w:left="0" w:firstLine="0"/>
+        <w:jc w:val="both"/>
+        <w:rPr>
+          <w:rFonts w:ascii="Arial" w:hAnsi="Arial" w:cs="Arial" w:eastAsia="Arial"/>
+          <w:color w:val="auto"/>
+          <w:spacing w:val="0"/>
+          <w:position w:val="0"/>
+          <w:sz w:val="22"/>
+          <w:shd w:fill="auto" w:val="clear"/>
+        </w:rPr>
+      </w:pPr>
+      <w:r>
+        <w:rPr>
+          <w:rFonts w:ascii="Arial" w:hAnsi="Arial" w:cs="Arial" w:eastAsia="Arial"/>
+          <w:color w:val="auto"/>
+          <w:spacing w:val="0"/>
+          <w:position w:val="0"/>
+          <w:sz w:val="22"/>
+          <w:shd w:fill="auto" w:val="clear"/>
+        </w:rPr>
+        <w:t xml:space="preserve">During gameplay, the player will face hidden traps that affect them in multiple ways. Each trap emits noise on activation:</w:t>
       </w:r>
     </w:p>
     <w:p>
       <w:pPr>
         <w:numPr>
           <w:ilvl w:val="0"/>
-          <w:numId w:val="22"/>
+          <w:numId w:val="25"/>
         </w:numPr>
         <w:spacing w:before="0" w:after="0" w:line="276"/>
         <w:ind w:right="0" w:left="720" w:hanging="360"/>
@@ -1609,7 +1693,7 @@
           <w:color w:val="auto"/>
           <w:spacing w:val="0"/>
           <w:position w:val="0"/>
-          <w:sz w:val="24"/>
+          <w:sz w:val="22"/>
           <w:shd w:fill="auto" w:val="clear"/>
         </w:rPr>
       </w:pPr>
@@ -1623,25 +1707,25 @@
           <w:u w:val="single"/>
           <w:shd w:fill="auto" w:val="clear"/>
         </w:rPr>
-        <w:t xml:space="preserve">Player detection</w:t>
-      </w:r>
-      <w:r>
-        <w:rPr>
-          <w:rFonts w:ascii="Arial" w:hAnsi="Arial" w:cs="Arial" w:eastAsia="Arial"/>
-          <w:color w:val="auto"/>
-          <w:spacing w:val="0"/>
-          <w:position w:val="0"/>
-          <w:sz w:val="22"/>
-          <w:shd w:fill="auto" w:val="clear"/>
-        </w:rPr>
-        <w:t xml:space="preserve">: Enemies will chase the player if they walk within their vision, and won't leave until they are out-of-sight.</w:t>
+        <w:t xml:space="preserve">Happy Memory</w:t>
+      </w:r>
+      <w:r>
+        <w:rPr>
+          <w:rFonts w:ascii="Arial" w:hAnsi="Arial" w:cs="Arial" w:eastAsia="Arial"/>
+          <w:color w:val="auto"/>
+          <w:spacing w:val="0"/>
+          <w:position w:val="0"/>
+          <w:sz w:val="22"/>
+          <w:shd w:fill="auto" w:val="clear"/>
+        </w:rPr>
+        <w:t xml:space="preserve">: Gradually increases the happiness threshold of the player when in close proximity.</w:t>
       </w:r>
     </w:p>
     <w:p>
       <w:pPr>
         <w:numPr>
           <w:ilvl w:val="0"/>
-          <w:numId w:val="22"/>
+          <w:numId w:val="25"/>
         </w:numPr>
         <w:spacing w:before="0" w:after="0" w:line="276"/>
         <w:ind w:right="0" w:left="720" w:hanging="360"/>
@@ -1666,25 +1750,25 @@
           <w:u w:val="single"/>
           <w:shd w:fill="auto" w:val="clear"/>
         </w:rPr>
-        <w:t xml:space="preserve">Camping</w:t>
-      </w:r>
-      <w:r>
-        <w:rPr>
-          <w:rFonts w:ascii="Arial" w:hAnsi="Arial" w:cs="Arial" w:eastAsia="Arial"/>
-          <w:color w:val="auto"/>
-          <w:spacing w:val="0"/>
-          <w:position w:val="0"/>
-          <w:sz w:val="22"/>
-          <w:shd w:fill="auto" w:val="clear"/>
-        </w:rPr>
-        <w:t xml:space="preserve">: Enemies will stay in one place indefinitely. </w:t>
+        <w:t xml:space="preserve">Happiness Spray:</w:t>
+      </w:r>
+      <w:r>
+        <w:rPr>
+          <w:rFonts w:ascii="Arial" w:hAnsi="Arial" w:cs="Arial" w:eastAsia="Arial"/>
+          <w:color w:val="auto"/>
+          <w:spacing w:val="0"/>
+          <w:position w:val="0"/>
+          <w:sz w:val="22"/>
+          <w:shd w:fill="auto" w:val="clear"/>
+        </w:rPr>
+        <w:t xml:space="preserve"> Immediatly increases the happiness threshold by 2.</w:t>
       </w:r>
     </w:p>
     <w:p>
       <w:pPr>
         <w:numPr>
           <w:ilvl w:val="0"/>
-          <w:numId w:val="22"/>
+          <w:numId w:val="25"/>
         </w:numPr>
         <w:spacing w:before="0" w:after="0" w:line="276"/>
         <w:ind w:right="0" w:left="720" w:hanging="360"/>
@@ -1709,25 +1793,109 @@
           <w:u w:val="single"/>
           <w:shd w:fill="auto" w:val="clear"/>
         </w:rPr>
-        <w:t xml:space="preserve">Inflict Happiness</w:t>
-      </w:r>
-      <w:r>
-        <w:rPr>
-          <w:rFonts w:ascii="Arial" w:hAnsi="Arial" w:cs="Arial" w:eastAsia="Arial"/>
-          <w:color w:val="auto"/>
-          <w:spacing w:val="0"/>
-          <w:position w:val="0"/>
-          <w:sz w:val="22"/>
-          <w:shd w:fill="auto" w:val="clear"/>
-        </w:rPr>
-        <w:t xml:space="preserve">: Enemies will inflict happiness in some sort of way.</w:t>
+        <w:t xml:space="preserve">Trip-wire</w:t>
+      </w:r>
+      <w:r>
+        <w:rPr>
+          <w:rFonts w:ascii="Arial" w:hAnsi="Arial" w:cs="Arial" w:eastAsia="Arial"/>
+          <w:color w:val="auto"/>
+          <w:spacing w:val="0"/>
+          <w:position w:val="0"/>
+          <w:sz w:val="22"/>
+          <w:shd w:fill="auto" w:val="clear"/>
+        </w:rPr>
+        <w:t xml:space="preserve">: Once triggered, inflicts a slowdown on the player. </w:t>
+      </w:r>
+    </w:p>
+    <w:p>
+      <w:pPr>
+        <w:spacing w:before="0" w:after="0" w:line="276"/>
+        <w:ind w:right="0" w:left="0" w:firstLine="0"/>
+        <w:jc w:val="both"/>
+        <w:rPr>
+          <w:rFonts w:ascii="Arial" w:hAnsi="Arial" w:cs="Arial" w:eastAsia="Arial"/>
+          <w:b/>
+          <w:color w:val="auto"/>
+          <w:spacing w:val="0"/>
+          <w:position w:val="0"/>
+          <w:sz w:val="22"/>
+          <w:shd w:fill="auto" w:val="clear"/>
+        </w:rPr>
+      </w:pPr>
+    </w:p>
+    <w:p>
+      <w:pPr>
+        <w:spacing w:before="0" w:after="0" w:line="276"/>
+        <w:ind w:right="0" w:left="0" w:firstLine="0"/>
+        <w:jc w:val="both"/>
+        <w:rPr>
+          <w:rFonts w:ascii="Arial" w:hAnsi="Arial" w:cs="Arial" w:eastAsia="Arial"/>
+          <w:color w:val="auto"/>
+          <w:spacing w:val="0"/>
+          <w:position w:val="0"/>
+          <w:sz w:val="24"/>
+          <w:shd w:fill="auto" w:val="clear"/>
+        </w:rPr>
+      </w:pPr>
+    </w:p>
+    <w:p>
+      <w:pPr>
+        <w:spacing w:before="0" w:after="0" w:line="276"/>
+        <w:ind w:right="0" w:left="0" w:firstLine="0"/>
+        <w:jc w:val="both"/>
+        <w:rPr>
+          <w:rFonts w:ascii="Arial" w:hAnsi="Arial" w:cs="Arial" w:eastAsia="Arial"/>
+          <w:b/>
+          <w:color w:val="auto"/>
+          <w:spacing w:val="0"/>
+          <w:position w:val="0"/>
+          <w:sz w:val="24"/>
+          <w:shd w:fill="auto" w:val="clear"/>
+        </w:rPr>
+      </w:pPr>
+      <w:r>
+        <w:rPr>
+          <w:rFonts w:ascii="Calibri Light" w:hAnsi="Calibri Light" w:cs="Calibri Light" w:eastAsia="Calibri Light"/>
+          <w:color w:val="2F5496"/>
+          <w:spacing w:val="0"/>
+          <w:position w:val="0"/>
+          <w:sz w:val="28"/>
+          <w:shd w:fill="auto" w:val="clear"/>
+        </w:rPr>
+        <w:t xml:space="preserve">Items</w:t>
+      </w:r>
+    </w:p>
+    <w:p>
+      <w:pPr>
+        <w:spacing w:before="0" w:after="0" w:line="276"/>
+        <w:ind w:right="0" w:left="0" w:firstLine="0"/>
+        <w:jc w:val="both"/>
+        <w:rPr>
+          <w:rFonts w:ascii="Arial" w:hAnsi="Arial" w:cs="Arial" w:eastAsia="Arial"/>
+          <w:color w:val="auto"/>
+          <w:spacing w:val="0"/>
+          <w:position w:val="0"/>
+          <w:sz w:val="22"/>
+          <w:shd w:fill="auto" w:val="clear"/>
+        </w:rPr>
+      </w:pPr>
+      <w:r>
+        <w:rPr>
+          <w:rFonts w:ascii="Arial" w:hAnsi="Arial" w:cs="Arial" w:eastAsia="Arial"/>
+          <w:color w:val="auto"/>
+          <w:spacing w:val="0"/>
+          <w:position w:val="0"/>
+          <w:sz w:val="22"/>
+          <w:shd w:fill="auto" w:val="clear"/>
+        </w:rPr>
+        <w:t xml:space="preserve">When exploring, the player might find some useful items along the way to aid them in their journey (Note: Names are not final). The player must interact with the item to use it, and cannot bring it with them.</w:t>
       </w:r>
     </w:p>
     <w:p>
       <w:pPr>
         <w:numPr>
           <w:ilvl w:val="0"/>
-          <w:numId w:val="22"/>
+          <w:numId w:val="27"/>
         </w:numPr>
         <w:spacing w:before="0" w:after="0" w:line="276"/>
         <w:ind w:right="0" w:left="720" w:hanging="360"/>
@@ -1738,7 +1906,7 @@
           <w:color w:val="auto"/>
           <w:spacing w:val="0"/>
           <w:position w:val="0"/>
-          <w:sz w:val="22"/>
+          <w:sz w:val="24"/>
           <w:shd w:fill="auto" w:val="clear"/>
         </w:rPr>
       </w:pPr>
@@ -1752,189 +1920,25 @@
           <w:u w:val="single"/>
           <w:shd w:fill="auto" w:val="clear"/>
         </w:rPr>
-        <w:t xml:space="preserve">Inflict Damage</w:t>
-      </w:r>
-      <w:r>
-        <w:rPr>
-          <w:rFonts w:ascii="Arial" w:hAnsi="Arial" w:cs="Arial" w:eastAsia="Arial"/>
-          <w:color w:val="auto"/>
-          <w:spacing w:val="0"/>
-          <w:position w:val="0"/>
-          <w:sz w:val="22"/>
-          <w:shd w:fill="auto" w:val="clear"/>
-        </w:rPr>
-        <w:t xml:space="preserve">: Enemies will inflict damage if they make physical contact with the player.</w:t>
-      </w:r>
-    </w:p>
-    <w:p>
-      <w:pPr>
-        <w:spacing w:before="0" w:after="0" w:line="276"/>
-        <w:ind w:right="0" w:left="0" w:firstLine="0"/>
-        <w:jc w:val="both"/>
-        <w:rPr>
-          <w:rFonts w:ascii="Arial" w:hAnsi="Arial" w:cs="Arial" w:eastAsia="Arial"/>
-          <w:b/>
-          <w:color w:val="auto"/>
-          <w:spacing w:val="0"/>
-          <w:position w:val="0"/>
-          <w:sz w:val="22"/>
-          <w:shd w:fill="auto" w:val="clear"/>
-        </w:rPr>
-      </w:pPr>
-    </w:p>
-    <w:p>
-      <w:pPr>
-        <w:spacing w:before="0" w:after="0" w:line="276"/>
-        <w:ind w:right="0" w:left="0" w:firstLine="0"/>
-        <w:jc w:val="both"/>
-        <w:rPr>
-          <w:rFonts w:ascii="Arial" w:hAnsi="Arial" w:cs="Arial" w:eastAsia="Arial"/>
-          <w:color w:val="auto"/>
-          <w:spacing w:val="0"/>
-          <w:position w:val="0"/>
-          <w:sz w:val="22"/>
-          <w:shd w:fill="auto" w:val="clear"/>
-        </w:rPr>
-      </w:pPr>
-      <w:r>
-        <w:rPr>
-          <w:rFonts w:ascii="Arial" w:hAnsi="Arial" w:cs="Arial" w:eastAsia="Arial"/>
-          <w:color w:val="auto"/>
-          <w:spacing w:val="0"/>
-          <w:position w:val="0"/>
-          <w:sz w:val="22"/>
-          <w:shd w:fill="auto" w:val="clear"/>
-        </w:rPr>
-        <w:t xml:space="preserve">(Tomorrow expand)</w:t>
-      </w:r>
-    </w:p>
-    <w:p>
-      <w:pPr>
-        <w:spacing w:before="0" w:after="0" w:line="276"/>
-        <w:ind w:right="0" w:left="0" w:firstLine="0"/>
-        <w:jc w:val="both"/>
-        <w:rPr>
-          <w:rFonts w:ascii="Arial" w:hAnsi="Arial" w:cs="Arial" w:eastAsia="Arial"/>
-          <w:color w:val="auto"/>
-          <w:spacing w:val="0"/>
-          <w:position w:val="0"/>
-          <w:sz w:val="22"/>
-          <w:shd w:fill="auto" w:val="clear"/>
-        </w:rPr>
-      </w:pPr>
-      <w:r>
-        <w:rPr>
-          <w:rFonts w:ascii="Arial" w:hAnsi="Arial" w:cs="Arial" w:eastAsia="Arial"/>
-          <w:color w:val="auto"/>
-          <w:spacing w:val="0"/>
-          <w:position w:val="0"/>
-          <w:sz w:val="22"/>
-          <w:shd w:fill="auto" w:val="clear"/>
-        </w:rPr>
-        <w:t xml:space="preserve">- Enemy one: Some sort of ghost. Inflicts damage on the player when touched, and reacts sound</w:t>
-      </w:r>
-    </w:p>
-    <w:p>
-      <w:pPr>
-        <w:spacing w:before="0" w:after="0" w:line="276"/>
-        <w:ind w:right="0" w:left="0" w:firstLine="0"/>
-        <w:jc w:val="both"/>
-        <w:rPr>
-          <w:rFonts w:ascii="Arial" w:hAnsi="Arial" w:cs="Arial" w:eastAsia="Arial"/>
-          <w:b/>
-          <w:color w:val="auto"/>
-          <w:spacing w:val="0"/>
-          <w:position w:val="0"/>
-          <w:sz w:val="22"/>
-          <w:shd w:fill="auto" w:val="clear"/>
-        </w:rPr>
-      </w:pPr>
-      <w:r>
-        <w:rPr>
-          <w:rFonts w:ascii="Arial" w:hAnsi="Arial" w:cs="Arial" w:eastAsia="Arial"/>
-          <w:color w:val="auto"/>
-          <w:spacing w:val="0"/>
-          <w:position w:val="0"/>
-          <w:sz w:val="22"/>
-          <w:shd w:fill="auto" w:val="clear"/>
-        </w:rPr>
-        <w:t xml:space="preserve">- Enemy Two: Some sort of monster that feeds on damage (Looks for names). When touching the player, inflicts happiness. Does not react to sound</w:t>
-      </w:r>
-    </w:p>
-    <w:p>
-      <w:pPr>
-        <w:spacing w:before="0" w:after="0" w:line="276"/>
-        <w:ind w:right="0" w:left="0" w:firstLine="0"/>
-        <w:jc w:val="both"/>
-        <w:rPr>
-          <w:rFonts w:ascii="Arial" w:hAnsi="Arial" w:cs="Arial" w:eastAsia="Arial"/>
-          <w:b/>
-          <w:color w:val="auto"/>
-          <w:spacing w:val="0"/>
-          <w:position w:val="0"/>
-          <w:sz w:val="22"/>
-          <w:shd w:fill="auto" w:val="clear"/>
-        </w:rPr>
-      </w:pPr>
-    </w:p>
-    <w:p>
-      <w:pPr>
-        <w:spacing w:before="0" w:after="0" w:line="276"/>
-        <w:ind w:right="0" w:left="0" w:firstLine="0"/>
-        <w:jc w:val="both"/>
-        <w:rPr>
-          <w:rFonts w:ascii="Arial" w:hAnsi="Arial" w:cs="Arial" w:eastAsia="Arial"/>
-          <w:b/>
-          <w:color w:val="auto"/>
-          <w:spacing w:val="0"/>
-          <w:position w:val="0"/>
-          <w:sz w:val="24"/>
-          <w:shd w:fill="auto" w:val="clear"/>
-        </w:rPr>
-      </w:pPr>
-      <w:r>
-        <w:rPr>
-          <w:rFonts w:ascii="Calibri Light" w:hAnsi="Calibri Light" w:cs="Calibri Light" w:eastAsia="Calibri Light"/>
-          <w:color w:val="2F5496"/>
-          <w:spacing w:val="0"/>
-          <w:position w:val="0"/>
-          <w:sz w:val="28"/>
-          <w:shd w:fill="auto" w:val="clear"/>
-        </w:rPr>
-        <w:t xml:space="preserve">Traps</w:t>
-      </w:r>
-    </w:p>
-    <w:p>
-      <w:pPr>
-        <w:spacing w:before="0" w:after="0" w:line="276"/>
-        <w:ind w:right="0" w:left="0" w:firstLine="0"/>
-        <w:jc w:val="both"/>
-        <w:rPr>
-          <w:rFonts w:ascii="Arial" w:hAnsi="Arial" w:cs="Arial" w:eastAsia="Arial"/>
-          <w:color w:val="auto"/>
-          <w:spacing w:val="0"/>
-          <w:position w:val="0"/>
-          <w:sz w:val="22"/>
-          <w:shd w:fill="auto" w:val="clear"/>
-        </w:rPr>
-      </w:pPr>
-      <w:r>
-        <w:rPr>
-          <w:rFonts w:ascii="Arial" w:hAnsi="Arial" w:cs="Arial" w:eastAsia="Arial"/>
-          <w:color w:val="auto"/>
-          <w:spacing w:val="0"/>
-          <w:position w:val="0"/>
-          <w:sz w:val="22"/>
-          <w:shd w:fill="auto" w:val="clear"/>
-        </w:rPr>
-        <w:t xml:space="preserve">During gameplay, the player will face hidden traps that affect them in multiple ways. Each trap emits noise on activation:</w:t>
+        <w:t xml:space="preserve">Bandages</w:t>
+      </w:r>
+      <w:r>
+        <w:rPr>
+          <w:rFonts w:ascii="Arial" w:hAnsi="Arial" w:cs="Arial" w:eastAsia="Arial"/>
+          <w:color w:val="auto"/>
+          <w:spacing w:val="0"/>
+          <w:position w:val="0"/>
+          <w:sz w:val="22"/>
+          <w:shd w:fill="auto" w:val="clear"/>
+        </w:rPr>
+        <w:t xml:space="preserve">: Moderately heals the player (Around half their health)</w:t>
       </w:r>
     </w:p>
     <w:p>
       <w:pPr>
         <w:numPr>
           <w:ilvl w:val="0"/>
-          <w:numId w:val="24"/>
+          <w:numId w:val="27"/>
         </w:numPr>
         <w:spacing w:before="0" w:after="0" w:line="276"/>
         <w:ind w:right="0" w:left="720" w:hanging="360"/>
@@ -1945,7 +1949,7 @@
           <w:color w:val="auto"/>
           <w:spacing w:val="0"/>
           <w:position w:val="0"/>
-          <w:sz w:val="22"/>
+          <w:sz w:val="24"/>
           <w:shd w:fill="auto" w:val="clear"/>
         </w:rPr>
       </w:pPr>
@@ -1959,25 +1963,25 @@
           <w:u w:val="single"/>
           <w:shd w:fill="auto" w:val="clear"/>
         </w:rPr>
-        <w:t xml:space="preserve">Happy Memory</w:t>
-      </w:r>
-      <w:r>
-        <w:rPr>
-          <w:rFonts w:ascii="Arial" w:hAnsi="Arial" w:cs="Arial" w:eastAsia="Arial"/>
-          <w:color w:val="auto"/>
-          <w:spacing w:val="0"/>
-          <w:position w:val="0"/>
-          <w:sz w:val="22"/>
-          <w:shd w:fill="auto" w:val="clear"/>
-        </w:rPr>
-        <w:t xml:space="preserve">: Gradually increases the happiness threshold of the player when in close proximity.</w:t>
+        <w:t xml:space="preserve">Dopamine shot</w:t>
+      </w:r>
+      <w:r>
+        <w:rPr>
+          <w:rFonts w:ascii="Arial" w:hAnsi="Arial" w:cs="Arial" w:eastAsia="Arial"/>
+          <w:color w:val="auto"/>
+          <w:spacing w:val="0"/>
+          <w:position w:val="0"/>
+          <w:sz w:val="22"/>
+          <w:shd w:fill="auto" w:val="clear"/>
+        </w:rPr>
+        <w:t xml:space="preserve">: Increases Happiness Threshold by one.</w:t>
       </w:r>
     </w:p>
     <w:p>
       <w:pPr>
         <w:numPr>
           <w:ilvl w:val="0"/>
-          <w:numId w:val="24"/>
+          <w:numId w:val="27"/>
         </w:numPr>
         <w:spacing w:before="0" w:after="0" w:line="276"/>
         <w:ind w:right="0" w:left="720" w:hanging="360"/>
@@ -2002,28 +2006,24 @@
           <w:u w:val="single"/>
           <w:shd w:fill="auto" w:val="clear"/>
         </w:rPr>
-        <w:t xml:space="preserve">Happiness Spray:</w:t>
-      </w:r>
-      <w:r>
-        <w:rPr>
-          <w:rFonts w:ascii="Arial" w:hAnsi="Arial" w:cs="Arial" w:eastAsia="Arial"/>
-          <w:color w:val="auto"/>
-          <w:spacing w:val="0"/>
-          <w:position w:val="0"/>
-          <w:sz w:val="22"/>
-          <w:shd w:fill="auto" w:val="clear"/>
-        </w:rPr>
-        <w:t xml:space="preserve"> Immediatly increases the happiness threshold by 2.</w:t>
-      </w:r>
-    </w:p>
-    <w:p>
-      <w:pPr>
-        <w:numPr>
-          <w:ilvl w:val="0"/>
-          <w:numId w:val="24"/>
-        </w:numPr>
-        <w:spacing w:before="0" w:after="0" w:line="276"/>
-        <w:ind w:right="0" w:left="720" w:hanging="360"/>
+        <w:t xml:space="preserve">Sadness pills</w:t>
+      </w:r>
+      <w:r>
+        <w:rPr>
+          <w:rFonts w:ascii="Arial" w:hAnsi="Arial" w:cs="Arial" w:eastAsia="Arial"/>
+          <w:color w:val="auto"/>
+          <w:spacing w:val="0"/>
+          <w:position w:val="0"/>
+          <w:sz w:val="22"/>
+          <w:shd w:fill="auto" w:val="clear"/>
+        </w:rPr>
+        <w:t xml:space="preserve">: Decreases happiness threshold by one.</w:t>
+      </w:r>
+    </w:p>
+    <w:p>
+      <w:pPr>
+        <w:spacing w:before="0" w:after="0" w:line="276"/>
+        <w:ind w:right="0" w:left="0" w:firstLine="0"/>
         <w:jc w:val="both"/>
         <w:rPr>
           <w:rFonts w:ascii="Arial" w:hAnsi="Arial" w:cs="Arial" w:eastAsia="Arial"/>
@@ -2035,73 +2035,59 @@
           <w:shd w:fill="auto" w:val="clear"/>
         </w:rPr>
       </w:pPr>
-      <w:r>
-        <w:rPr>
-          <w:rFonts w:ascii="Arial" w:hAnsi="Arial" w:cs="Arial" w:eastAsia="Arial"/>
-          <w:color w:val="auto"/>
-          <w:spacing w:val="0"/>
-          <w:position w:val="0"/>
-          <w:sz w:val="22"/>
-          <w:u w:val="single"/>
-          <w:shd w:fill="auto" w:val="clear"/>
-        </w:rPr>
-        <w:t xml:space="preserve">Trip-wire</w:t>
-      </w:r>
-      <w:r>
-        <w:rPr>
-          <w:rFonts w:ascii="Arial" w:hAnsi="Arial" w:cs="Arial" w:eastAsia="Arial"/>
-          <w:color w:val="auto"/>
-          <w:spacing w:val="0"/>
-          <w:position w:val="0"/>
-          <w:sz w:val="22"/>
-          <w:shd w:fill="auto" w:val="clear"/>
-        </w:rPr>
-        <w:t xml:space="preserve">: Once triggered, inflicts a slowdown on the player. </w:t>
-      </w:r>
-    </w:p>
-    <w:p>
-      <w:pPr>
-        <w:spacing w:before="0" w:after="0" w:line="276"/>
-        <w:ind w:right="0" w:left="0" w:firstLine="0"/>
-        <w:jc w:val="both"/>
-        <w:rPr>
-          <w:rFonts w:ascii="Arial" w:hAnsi="Arial" w:cs="Arial" w:eastAsia="Arial"/>
-          <w:b/>
-          <w:color w:val="auto"/>
-          <w:spacing w:val="0"/>
-          <w:position w:val="0"/>
-          <w:sz w:val="22"/>
-          <w:shd w:fill="auto" w:val="clear"/>
-        </w:rPr>
-      </w:pPr>
-    </w:p>
-    <w:p>
-      <w:pPr>
-        <w:spacing w:before="0" w:after="0" w:line="276"/>
-        <w:ind w:right="0" w:left="0" w:firstLine="0"/>
-        <w:jc w:val="both"/>
-        <w:rPr>
-          <w:rFonts w:ascii="Arial" w:hAnsi="Arial" w:cs="Arial" w:eastAsia="Arial"/>
-          <w:color w:val="auto"/>
-          <w:spacing w:val="0"/>
-          <w:position w:val="0"/>
-          <w:sz w:val="24"/>
-          <w:shd w:fill="auto" w:val="clear"/>
-        </w:rPr>
-      </w:pPr>
-    </w:p>
-    <w:p>
-      <w:pPr>
-        <w:spacing w:before="0" w:after="0" w:line="276"/>
-        <w:ind w:right="0" w:left="0" w:firstLine="0"/>
-        <w:jc w:val="both"/>
-        <w:rPr>
-          <w:rFonts w:ascii="Arial" w:hAnsi="Arial" w:cs="Arial" w:eastAsia="Arial"/>
-          <w:b/>
-          <w:color w:val="auto"/>
-          <w:spacing w:val="0"/>
-          <w:position w:val="0"/>
-          <w:sz w:val="24"/>
+    </w:p>
+    <w:p>
+      <w:pPr>
+        <w:spacing w:before="0" w:after="0" w:line="276"/>
+        <w:ind w:right="0" w:left="0" w:firstLine="0"/>
+        <w:jc w:val="both"/>
+        <w:rPr>
+          <w:rFonts w:ascii="Arial" w:hAnsi="Arial" w:cs="Arial" w:eastAsia="Arial"/>
+          <w:color w:val="auto"/>
+          <w:spacing w:val="0"/>
+          <w:position w:val="0"/>
+          <w:sz w:val="22"/>
+          <w:shd w:fill="auto" w:val="clear"/>
+        </w:rPr>
+      </w:pPr>
+    </w:p>
+    <w:p>
+      <w:pPr>
+        <w:spacing w:before="0" w:after="0" w:line="276"/>
+        <w:ind w:right="0" w:left="0" w:firstLine="0"/>
+        <w:jc w:val="both"/>
+        <w:rPr>
+          <w:rFonts w:ascii="Calibri Light" w:hAnsi="Calibri Light" w:cs="Calibri Light" w:eastAsia="Calibri Light"/>
+          <w:color w:val="2F5496"/>
+          <w:spacing w:val="0"/>
+          <w:position w:val="0"/>
+          <w:sz w:val="36"/>
+          <w:shd w:fill="auto" w:val="clear"/>
+        </w:rPr>
+      </w:pPr>
+      <w:r>
+        <w:rPr>
+          <w:rFonts w:ascii="Calibri Light" w:hAnsi="Calibri Light" w:cs="Calibri Light" w:eastAsia="Calibri Light"/>
+          <w:color w:val="2F5496"/>
+          <w:spacing w:val="0"/>
+          <w:position w:val="0"/>
+          <w:sz w:val="36"/>
+          <w:shd w:fill="auto" w:val="clear"/>
+        </w:rPr>
+        <w:t xml:space="preserve">LEVEL DESIGN</w:t>
+      </w:r>
+    </w:p>
+    <w:p>
+      <w:pPr>
+        <w:spacing w:before="0" w:after="0" w:line="276"/>
+        <w:ind w:right="0" w:left="0" w:firstLine="0"/>
+        <w:jc w:val="both"/>
+        <w:rPr>
+          <w:rFonts w:ascii="Calibri Light" w:hAnsi="Calibri Light" w:cs="Calibri Light" w:eastAsia="Calibri Light"/>
+          <w:color w:val="2F5496"/>
+          <w:spacing w:val="0"/>
+          <w:position w:val="0"/>
+          <w:sz w:val="36"/>
           <w:shd w:fill="auto" w:val="clear"/>
         </w:rPr>
       </w:pPr>
@@ -2114,194 +2100,34 @@
           <w:sz w:val="28"/>
           <w:shd w:fill="auto" w:val="clear"/>
         </w:rPr>
-        <w:t xml:space="preserve">Items</w:t>
-      </w:r>
-    </w:p>
-    <w:p>
-      <w:pPr>
-        <w:spacing w:before="0" w:after="0" w:line="276"/>
-        <w:ind w:right="0" w:left="0" w:firstLine="0"/>
-        <w:jc w:val="both"/>
-        <w:rPr>
-          <w:rFonts w:ascii="Arial" w:hAnsi="Arial" w:cs="Arial" w:eastAsia="Arial"/>
-          <w:color w:val="auto"/>
-          <w:spacing w:val="0"/>
-          <w:position w:val="0"/>
-          <w:sz w:val="22"/>
-          <w:shd w:fill="auto" w:val="clear"/>
-        </w:rPr>
-      </w:pPr>
-      <w:r>
-        <w:rPr>
-          <w:rFonts w:ascii="Arial" w:hAnsi="Arial" w:cs="Arial" w:eastAsia="Arial"/>
-          <w:color w:val="auto"/>
-          <w:spacing w:val="0"/>
-          <w:position w:val="0"/>
-          <w:sz w:val="22"/>
-          <w:shd w:fill="auto" w:val="clear"/>
-        </w:rPr>
-        <w:t xml:space="preserve">When exploring, the player might find some useful items along the way to aid them in their journey (Note: Names are not final). The player must interact with the item to use it, and cannot bring it with them.</w:t>
-      </w:r>
-    </w:p>
-    <w:p>
-      <w:pPr>
-        <w:numPr>
-          <w:ilvl w:val="0"/>
-          <w:numId w:val="26"/>
-        </w:numPr>
-        <w:spacing w:before="0" w:after="0" w:line="276"/>
-        <w:ind w:right="0" w:left="720" w:hanging="360"/>
-        <w:jc w:val="both"/>
-        <w:rPr>
-          <w:rFonts w:ascii="Arial" w:hAnsi="Arial" w:cs="Arial" w:eastAsia="Arial"/>
-          <w:b/>
-          <w:color w:val="auto"/>
-          <w:spacing w:val="0"/>
-          <w:position w:val="0"/>
-          <w:sz w:val="24"/>
-          <w:shd w:fill="auto" w:val="clear"/>
-        </w:rPr>
-      </w:pPr>
-      <w:r>
-        <w:rPr>
-          <w:rFonts w:ascii="Arial" w:hAnsi="Arial" w:cs="Arial" w:eastAsia="Arial"/>
-          <w:color w:val="auto"/>
-          <w:spacing w:val="0"/>
-          <w:position w:val="0"/>
-          <w:sz w:val="22"/>
-          <w:u w:val="single"/>
-          <w:shd w:fill="auto" w:val="clear"/>
-        </w:rPr>
-        <w:t xml:space="preserve">Bandages</w:t>
-      </w:r>
-      <w:r>
-        <w:rPr>
-          <w:rFonts w:ascii="Arial" w:hAnsi="Arial" w:cs="Arial" w:eastAsia="Arial"/>
-          <w:color w:val="auto"/>
-          <w:spacing w:val="0"/>
-          <w:position w:val="0"/>
-          <w:sz w:val="22"/>
-          <w:shd w:fill="auto" w:val="clear"/>
-        </w:rPr>
-        <w:t xml:space="preserve">: Moderately heals the player (Around half their health)</w:t>
-      </w:r>
-    </w:p>
-    <w:p>
-      <w:pPr>
-        <w:numPr>
-          <w:ilvl w:val="0"/>
-          <w:numId w:val="26"/>
-        </w:numPr>
-        <w:spacing w:before="0" w:after="0" w:line="276"/>
-        <w:ind w:right="0" w:left="720" w:hanging="360"/>
-        <w:jc w:val="both"/>
-        <w:rPr>
-          <w:rFonts w:ascii="Arial" w:hAnsi="Arial" w:cs="Arial" w:eastAsia="Arial"/>
-          <w:b/>
-          <w:color w:val="auto"/>
-          <w:spacing w:val="0"/>
-          <w:position w:val="0"/>
-          <w:sz w:val="24"/>
-          <w:shd w:fill="auto" w:val="clear"/>
-        </w:rPr>
-      </w:pPr>
-      <w:r>
-        <w:rPr>
-          <w:rFonts w:ascii="Arial" w:hAnsi="Arial" w:cs="Arial" w:eastAsia="Arial"/>
-          <w:color w:val="auto"/>
-          <w:spacing w:val="0"/>
-          <w:position w:val="0"/>
-          <w:sz w:val="22"/>
-          <w:u w:val="single"/>
-          <w:shd w:fill="auto" w:val="clear"/>
-        </w:rPr>
-        <w:t xml:space="preserve">Dopamine shot</w:t>
-      </w:r>
-      <w:r>
-        <w:rPr>
-          <w:rFonts w:ascii="Arial" w:hAnsi="Arial" w:cs="Arial" w:eastAsia="Arial"/>
-          <w:color w:val="auto"/>
-          <w:spacing w:val="0"/>
-          <w:position w:val="0"/>
-          <w:sz w:val="22"/>
-          <w:shd w:fill="auto" w:val="clear"/>
-        </w:rPr>
-        <w:t xml:space="preserve">: Increases Happiness Threshold by one.</w:t>
-      </w:r>
-    </w:p>
-    <w:p>
-      <w:pPr>
-        <w:numPr>
-          <w:ilvl w:val="0"/>
-          <w:numId w:val="26"/>
-        </w:numPr>
-        <w:spacing w:before="0" w:after="0" w:line="276"/>
-        <w:ind w:right="0" w:left="720" w:hanging="360"/>
-        <w:jc w:val="both"/>
-        <w:rPr>
-          <w:rFonts w:ascii="Arial" w:hAnsi="Arial" w:cs="Arial" w:eastAsia="Arial"/>
-          <w:b/>
-          <w:color w:val="auto"/>
-          <w:spacing w:val="0"/>
-          <w:position w:val="0"/>
-          <w:sz w:val="22"/>
-          <w:shd w:fill="auto" w:val="clear"/>
-        </w:rPr>
-      </w:pPr>
-      <w:r>
-        <w:rPr>
-          <w:rFonts w:ascii="Arial" w:hAnsi="Arial" w:cs="Arial" w:eastAsia="Arial"/>
-          <w:color w:val="auto"/>
-          <w:spacing w:val="0"/>
-          <w:position w:val="0"/>
-          <w:sz w:val="22"/>
-          <w:u w:val="single"/>
-          <w:shd w:fill="auto" w:val="clear"/>
-        </w:rPr>
-        <w:t xml:space="preserve">Sadness pills</w:t>
-      </w:r>
-      <w:r>
-        <w:rPr>
-          <w:rFonts w:ascii="Arial" w:hAnsi="Arial" w:cs="Arial" w:eastAsia="Arial"/>
-          <w:color w:val="auto"/>
-          <w:spacing w:val="0"/>
-          <w:position w:val="0"/>
-          <w:sz w:val="22"/>
-          <w:shd w:fill="auto" w:val="clear"/>
-        </w:rPr>
-        <w:t xml:space="preserve">: Decreases happiness threshold by one.</w:t>
-      </w:r>
-    </w:p>
-    <w:p>
-      <w:pPr>
-        <w:spacing w:before="0" w:after="0" w:line="276"/>
-        <w:ind w:right="0" w:left="0" w:firstLine="0"/>
-        <w:jc w:val="both"/>
-        <w:rPr>
-          <w:rFonts w:ascii="Arial" w:hAnsi="Arial" w:cs="Arial" w:eastAsia="Arial"/>
-          <w:b/>
-          <w:color w:val="auto"/>
-          <w:spacing w:val="0"/>
-          <w:position w:val="0"/>
-          <w:sz w:val="22"/>
-          <w:shd w:fill="auto" w:val="clear"/>
-        </w:rPr>
-      </w:pPr>
-    </w:p>
-    <w:p>
-      <w:pPr>
-        <w:spacing w:before="0" w:after="0" w:line="276"/>
-        <w:ind w:right="0" w:left="0" w:firstLine="0"/>
-        <w:jc w:val="both"/>
-        <w:rPr>
-          <w:rFonts w:ascii="Arial" w:hAnsi="Arial" w:cs="Arial" w:eastAsia="Arial"/>
-          <w:color w:val="auto"/>
-          <w:spacing w:val="0"/>
-          <w:position w:val="0"/>
-          <w:sz w:val="22"/>
-          <w:shd w:fill="auto" w:val="clear"/>
-        </w:rPr>
-      </w:pPr>
+        <w:t xml:space="preserve">Asthethics</w:t>
+      </w:r>
+    </w:p>
+    <w:p>
+      <w:pPr>
+        <w:spacing w:before="0" w:after="0" w:line="276"/>
+        <w:ind w:right="0" w:left="0" w:firstLine="0"/>
+        <w:jc w:val="both"/>
+        <w:rPr>
+          <w:rFonts w:ascii="Arial" w:hAnsi="Arial" w:cs="Arial" w:eastAsia="Arial"/>
+          <w:color w:val="auto"/>
+          <w:spacing w:val="0"/>
+          <w:position w:val="0"/>
+          <w:sz w:val="22"/>
+          <w:shd w:fill="auto" w:val="clear"/>
+        </w:rPr>
+      </w:pPr>
+      <w:r>
+        <w:rPr>
+          <w:rFonts w:ascii="Arial" w:hAnsi="Arial" w:cs="Arial" w:eastAsia="Arial"/>
+          <w:color w:val="auto"/>
+          <w:spacing w:val="0"/>
+          <w:position w:val="0"/>
+          <w:sz w:val="22"/>
+          <w:shd w:fill="auto" w:val="clear"/>
+        </w:rPr>
+        <w:t xml:space="preserve">As discussed in the narrative section, the game happens in the mind of our main character. The environment is going to resemble the appearance of an art college, as that is what the main characters attends lore-wise. For some minor parts, it might deviate from the theme as to support narrative elements such as certain rooms resembling important memories from the player (e.g. childhood memories)</w:t>
+      </w:r>
     </w:p>
     <w:p>
       <w:pPr>
@@ -2317,7 +2143,12 @@
           <w:shd w:fill="auto" w:val="clear"/>
         </w:rPr>
       </w:pPr>
-      <w:r>
+    </w:p>
+    <w:p>
+      <w:pPr>
+        <w:spacing w:before="0" w:after="0" w:line="276"/>
+        <w:ind w:right="0" w:left="0" w:firstLine="0"/>
+        <w:jc w:val="both"/>
         <w:rPr>
           <w:rFonts w:ascii="Calibri Light" w:hAnsi="Calibri Light" w:cs="Calibri Light" w:eastAsia="Calibri Light"/>
           <w:color w:val="2F5496"/>
@@ -2326,7 +2157,136 @@
           <w:sz w:val="36"/>
           <w:shd w:fill="auto" w:val="clear"/>
         </w:rPr>
-        <w:t xml:space="preserve">LEVEL DESIGN</w:t>
+      </w:pPr>
+      <w:r>
+        <w:rPr>
+          <w:rFonts w:ascii="Calibri Light" w:hAnsi="Calibri Light" w:cs="Calibri Light" w:eastAsia="Calibri Light"/>
+          <w:color w:val="2F5496"/>
+          <w:spacing w:val="0"/>
+          <w:position w:val="0"/>
+          <w:sz w:val="28"/>
+          <w:shd w:fill="auto" w:val="clear"/>
+        </w:rPr>
+        <w:t xml:space="preserve">Level gameplay</w:t>
+      </w:r>
+    </w:p>
+    <w:p>
+      <w:pPr>
+        <w:spacing w:before="0" w:after="0" w:line="276"/>
+        <w:ind w:right="0" w:left="0" w:firstLine="0"/>
+        <w:jc w:val="both"/>
+        <w:rPr>
+          <w:rFonts w:ascii="Arial" w:hAnsi="Arial" w:cs="Arial" w:eastAsia="Arial"/>
+          <w:color w:val="auto"/>
+          <w:spacing w:val="0"/>
+          <w:position w:val="0"/>
+          <w:sz w:val="22"/>
+          <w:shd w:fill="auto" w:val="clear"/>
+        </w:rPr>
+      </w:pPr>
+      <w:r>
+        <w:rPr>
+          <w:rFonts w:ascii="Arial" w:hAnsi="Arial" w:cs="Arial" w:eastAsia="Arial"/>
+          <w:color w:val="auto"/>
+          <w:spacing w:val="0"/>
+          <w:position w:val="0"/>
+          <w:sz w:val="22"/>
+          <w:shd w:fill="auto" w:val="clear"/>
+        </w:rPr>
+        <w:t xml:space="preserve">The prototype for the game is going to feature two levels: </w:t>
+      </w:r>
+    </w:p>
+    <w:p>
+      <w:pPr>
+        <w:spacing w:before="0" w:after="0" w:line="276"/>
+        <w:ind w:right="0" w:left="0" w:firstLine="0"/>
+        <w:jc w:val="both"/>
+        <w:rPr>
+          <w:rFonts w:ascii="Arial" w:hAnsi="Arial" w:cs="Arial" w:eastAsia="Arial"/>
+          <w:color w:val="auto"/>
+          <w:spacing w:val="0"/>
+          <w:position w:val="0"/>
+          <w:sz w:val="22"/>
+          <w:shd w:fill="auto" w:val="clear"/>
+        </w:rPr>
+      </w:pPr>
+      <w:r>
+        <w:rPr>
+          <w:rFonts w:ascii="Arial" w:hAnsi="Arial" w:cs="Arial" w:eastAsia="Arial"/>
+          <w:color w:val="auto"/>
+          <w:spacing w:val="0"/>
+          <w:position w:val="0"/>
+          <w:sz w:val="22"/>
+          <w:shd w:fill="auto" w:val="clear"/>
+        </w:rPr>
+        <w:t xml:space="preserve">- An introductory/tutorial level, aimed to introduce the player to the game atmosphere and give a short insight on how the game mechanics works (mainly the happiness meter), </w:t>
+      </w:r>
+    </w:p>
+    <w:p>
+      <w:pPr>
+        <w:spacing w:before="0" w:after="0" w:line="276"/>
+        <w:ind w:right="0" w:left="0" w:firstLine="0"/>
+        <w:jc w:val="both"/>
+        <w:rPr>
+          <w:rFonts w:ascii="Arial" w:hAnsi="Arial" w:cs="Arial" w:eastAsia="Arial"/>
+          <w:color w:val="auto"/>
+          <w:spacing w:val="0"/>
+          <w:position w:val="0"/>
+          <w:sz w:val="22"/>
+          <w:shd w:fill="auto" w:val="clear"/>
+        </w:rPr>
+      </w:pPr>
+      <w:r>
+        <w:rPr>
+          <w:rFonts w:ascii="Arial" w:hAnsi="Arial" w:cs="Arial" w:eastAsia="Arial"/>
+          <w:color w:val="auto"/>
+          <w:spacing w:val="0"/>
+          <w:position w:val="0"/>
+          <w:sz w:val="22"/>
+          <w:shd w:fill="auto" w:val="clear"/>
+        </w:rPr>
+        <w:t xml:space="preserve">- A gameplay level, meant to challenge the player by throwing everything the game has to offer at them. </w:t>
+      </w:r>
+    </w:p>
+    <w:p>
+      <w:pPr>
+        <w:spacing w:before="0" w:after="0" w:line="276"/>
+        <w:ind w:right="0" w:left="0" w:firstLine="0"/>
+        <w:jc w:val="both"/>
+        <w:rPr>
+          <w:rFonts w:ascii="Arial" w:hAnsi="Arial" w:cs="Arial" w:eastAsia="Arial"/>
+          <w:color w:val="auto"/>
+          <w:spacing w:val="0"/>
+          <w:position w:val="0"/>
+          <w:sz w:val="22"/>
+          <w:shd w:fill="auto" w:val="clear"/>
+        </w:rPr>
+      </w:pPr>
+    </w:p>
+    <w:p>
+      <w:pPr>
+        <w:spacing w:before="0" w:after="0" w:line="276"/>
+        <w:ind w:right="0" w:left="0" w:firstLine="0"/>
+        <w:jc w:val="both"/>
+        <w:rPr>
+          <w:rFonts w:ascii="Arial" w:hAnsi="Arial" w:cs="Arial" w:eastAsia="Arial"/>
+          <w:color w:val="auto"/>
+          <w:spacing w:val="0"/>
+          <w:position w:val="0"/>
+          <w:sz w:val="22"/>
+          <w:shd w:fill="auto" w:val="clear"/>
+        </w:rPr>
+      </w:pPr>
+      <w:r>
+        <w:rPr>
+          <w:rFonts w:ascii="Arial" w:hAnsi="Arial" w:cs="Arial" w:eastAsia="Arial"/>
+          <w:color w:val="auto"/>
+          <w:spacing w:val="0"/>
+          <w:position w:val="0"/>
+          <w:sz w:val="22"/>
+          <w:shd w:fill="auto" w:val="clear"/>
+        </w:rPr>
+        <w:t xml:space="preserve">Levels in Cherophobia have one end-goal: To find the master door, unlock it and escape through it. The Master Door has a keypad, wooden planks and a fuse which must be removed/accessed for it to unlock</w:t>
       </w:r>
     </w:p>
     <w:p>
@@ -2343,7 +2303,12 @@
           <w:shd w:fill="auto" w:val="clear"/>
         </w:rPr>
       </w:pPr>
-      <w:r>
+    </w:p>
+    <w:p>
+      <w:pPr>
+        <w:spacing w:before="0" w:after="0" w:line="276"/>
+        <w:ind w:right="0" w:left="0" w:firstLine="0"/>
+        <w:jc w:val="both"/>
         <w:rPr>
           <w:rFonts w:ascii="Calibri Light" w:hAnsi="Calibri Light" w:cs="Calibri Light" w:eastAsia="Calibri Light"/>
           <w:color w:val="2F5496"/>
@@ -2352,63 +2317,6 @@
           <w:sz w:val="28"/>
           <w:shd w:fill="auto" w:val="clear"/>
         </w:rPr>
-        <w:t xml:space="preserve">Asthethics</w:t>
-      </w:r>
-    </w:p>
-    <w:p>
-      <w:pPr>
-        <w:spacing w:before="0" w:after="0" w:line="276"/>
-        <w:ind w:right="0" w:left="0" w:firstLine="0"/>
-        <w:jc w:val="both"/>
-        <w:rPr>
-          <w:rFonts w:ascii="Arial" w:hAnsi="Arial" w:cs="Arial" w:eastAsia="Arial"/>
-          <w:color w:val="auto"/>
-          <w:spacing w:val="0"/>
-          <w:position w:val="0"/>
-          <w:sz w:val="22"/>
-          <w:shd w:fill="auto" w:val="clear"/>
-        </w:rPr>
-      </w:pPr>
-      <w:r>
-        <w:rPr>
-          <w:rFonts w:ascii="Arial" w:hAnsi="Arial" w:cs="Arial" w:eastAsia="Arial"/>
-          <w:color w:val="auto"/>
-          <w:spacing w:val="0"/>
-          <w:position w:val="0"/>
-          <w:sz w:val="22"/>
-          <w:shd w:fill="auto" w:val="clear"/>
-        </w:rPr>
-        <w:t xml:space="preserve">As discussed in the narrative section, the game happens in the mind of our main character. The environment is going to resemble the appearance of an art college, as that is what the main characters attends lore-wise. For some minor parts, it might deviate from the theme as to support narrative elements such as certain rooms resembling important memories from the player (e.g. childhood memories)</w:t>
-      </w:r>
-    </w:p>
-    <w:p>
-      <w:pPr>
-        <w:spacing w:before="0" w:after="0" w:line="276"/>
-        <w:ind w:right="0" w:left="0" w:firstLine="0"/>
-        <w:jc w:val="both"/>
-        <w:rPr>
-          <w:rFonts w:ascii="Calibri Light" w:hAnsi="Calibri Light" w:cs="Calibri Light" w:eastAsia="Calibri Light"/>
-          <w:color w:val="2F5496"/>
-          <w:spacing w:val="0"/>
-          <w:position w:val="0"/>
-          <w:sz w:val="36"/>
-          <w:shd w:fill="auto" w:val="clear"/>
-        </w:rPr>
-      </w:pPr>
-    </w:p>
-    <w:p>
-      <w:pPr>
-        <w:spacing w:before="0" w:after="0" w:line="276"/>
-        <w:ind w:right="0" w:left="0" w:firstLine="0"/>
-        <w:jc w:val="both"/>
-        <w:rPr>
-          <w:rFonts w:ascii="Calibri Light" w:hAnsi="Calibri Light" w:cs="Calibri Light" w:eastAsia="Calibri Light"/>
-          <w:color w:val="2F5496"/>
-          <w:spacing w:val="0"/>
-          <w:position w:val="0"/>
-          <w:sz w:val="36"/>
-          <w:shd w:fill="auto" w:val="clear"/>
-        </w:rPr>
       </w:pPr>
       <w:r>
         <w:rPr>
@@ -2419,166 +2327,6 @@
           <w:sz w:val="28"/>
           <w:shd w:fill="auto" w:val="clear"/>
         </w:rPr>
-        <w:t xml:space="preserve">Level gameplay</w:t>
-      </w:r>
-    </w:p>
-    <w:p>
-      <w:pPr>
-        <w:spacing w:before="0" w:after="0" w:line="276"/>
-        <w:ind w:right="0" w:left="0" w:firstLine="0"/>
-        <w:jc w:val="both"/>
-        <w:rPr>
-          <w:rFonts w:ascii="Arial" w:hAnsi="Arial" w:cs="Arial" w:eastAsia="Arial"/>
-          <w:color w:val="auto"/>
-          <w:spacing w:val="0"/>
-          <w:position w:val="0"/>
-          <w:sz w:val="22"/>
-          <w:shd w:fill="auto" w:val="clear"/>
-        </w:rPr>
-      </w:pPr>
-      <w:r>
-        <w:rPr>
-          <w:rFonts w:ascii="Arial" w:hAnsi="Arial" w:cs="Arial" w:eastAsia="Arial"/>
-          <w:color w:val="auto"/>
-          <w:spacing w:val="0"/>
-          <w:position w:val="0"/>
-          <w:sz w:val="22"/>
-          <w:shd w:fill="auto" w:val="clear"/>
-        </w:rPr>
-        <w:t xml:space="preserve">The prototype for the game is going to feature two levels: </w:t>
-      </w:r>
-    </w:p>
-    <w:p>
-      <w:pPr>
-        <w:spacing w:before="0" w:after="0" w:line="276"/>
-        <w:ind w:right="0" w:left="0" w:firstLine="0"/>
-        <w:jc w:val="both"/>
-        <w:rPr>
-          <w:rFonts w:ascii="Arial" w:hAnsi="Arial" w:cs="Arial" w:eastAsia="Arial"/>
-          <w:color w:val="auto"/>
-          <w:spacing w:val="0"/>
-          <w:position w:val="0"/>
-          <w:sz w:val="22"/>
-          <w:shd w:fill="auto" w:val="clear"/>
-        </w:rPr>
-      </w:pPr>
-      <w:r>
-        <w:rPr>
-          <w:rFonts w:ascii="Arial" w:hAnsi="Arial" w:cs="Arial" w:eastAsia="Arial"/>
-          <w:color w:val="auto"/>
-          <w:spacing w:val="0"/>
-          <w:position w:val="0"/>
-          <w:sz w:val="22"/>
-          <w:shd w:fill="auto" w:val="clear"/>
-        </w:rPr>
-        <w:t xml:space="preserve">- An introductory/tutorial level, aimed to introduce the player to the game atmosphere and give a short insight on how the game mechanics works (mainly the happiness meter), </w:t>
-      </w:r>
-    </w:p>
-    <w:p>
-      <w:pPr>
-        <w:spacing w:before="0" w:after="0" w:line="276"/>
-        <w:ind w:right="0" w:left="0" w:firstLine="0"/>
-        <w:jc w:val="both"/>
-        <w:rPr>
-          <w:rFonts w:ascii="Arial" w:hAnsi="Arial" w:cs="Arial" w:eastAsia="Arial"/>
-          <w:color w:val="auto"/>
-          <w:spacing w:val="0"/>
-          <w:position w:val="0"/>
-          <w:sz w:val="22"/>
-          <w:shd w:fill="auto" w:val="clear"/>
-        </w:rPr>
-      </w:pPr>
-      <w:r>
-        <w:rPr>
-          <w:rFonts w:ascii="Arial" w:hAnsi="Arial" w:cs="Arial" w:eastAsia="Arial"/>
-          <w:color w:val="auto"/>
-          <w:spacing w:val="0"/>
-          <w:position w:val="0"/>
-          <w:sz w:val="22"/>
-          <w:shd w:fill="auto" w:val="clear"/>
-        </w:rPr>
-        <w:t xml:space="preserve">- A gameplay level, meant to challenge the player by throwing everything the game has to offer at them. </w:t>
-      </w:r>
-    </w:p>
-    <w:p>
-      <w:pPr>
-        <w:spacing w:before="0" w:after="0" w:line="276"/>
-        <w:ind w:right="0" w:left="0" w:firstLine="0"/>
-        <w:jc w:val="both"/>
-        <w:rPr>
-          <w:rFonts w:ascii="Arial" w:hAnsi="Arial" w:cs="Arial" w:eastAsia="Arial"/>
-          <w:color w:val="auto"/>
-          <w:spacing w:val="0"/>
-          <w:position w:val="0"/>
-          <w:sz w:val="22"/>
-          <w:shd w:fill="auto" w:val="clear"/>
-        </w:rPr>
-      </w:pPr>
-    </w:p>
-    <w:p>
-      <w:pPr>
-        <w:spacing w:before="0" w:after="0" w:line="276"/>
-        <w:ind w:right="0" w:left="0" w:firstLine="0"/>
-        <w:jc w:val="both"/>
-        <w:rPr>
-          <w:rFonts w:ascii="Arial" w:hAnsi="Arial" w:cs="Arial" w:eastAsia="Arial"/>
-          <w:color w:val="auto"/>
-          <w:spacing w:val="0"/>
-          <w:position w:val="0"/>
-          <w:sz w:val="22"/>
-          <w:shd w:fill="auto" w:val="clear"/>
-        </w:rPr>
-      </w:pPr>
-      <w:r>
-        <w:rPr>
-          <w:rFonts w:ascii="Arial" w:hAnsi="Arial" w:cs="Arial" w:eastAsia="Arial"/>
-          <w:color w:val="auto"/>
-          <w:spacing w:val="0"/>
-          <w:position w:val="0"/>
-          <w:sz w:val="22"/>
-          <w:shd w:fill="auto" w:val="clear"/>
-        </w:rPr>
-        <w:t xml:space="preserve">Levels in Cherophobia have one end-goal: To find the master door, unlock it and escape through it. The Master Door has a keypad, wooden planks and a fuse which must be removed/accessed for it to unlock</w:t>
-      </w:r>
-    </w:p>
-    <w:p>
-      <w:pPr>
-        <w:spacing w:before="0" w:after="0" w:line="276"/>
-        <w:ind w:right="0" w:left="0" w:firstLine="0"/>
-        <w:jc w:val="both"/>
-        <w:rPr>
-          <w:rFonts w:ascii="Calibri Light" w:hAnsi="Calibri Light" w:cs="Calibri Light" w:eastAsia="Calibri Light"/>
-          <w:color w:val="2F5496"/>
-          <w:spacing w:val="0"/>
-          <w:position w:val="0"/>
-          <w:sz w:val="36"/>
-          <w:shd w:fill="auto" w:val="clear"/>
-        </w:rPr>
-      </w:pPr>
-    </w:p>
-    <w:p>
-      <w:pPr>
-        <w:spacing w:before="0" w:after="0" w:line="276"/>
-        <w:ind w:right="0" w:left="0" w:firstLine="0"/>
-        <w:jc w:val="both"/>
-        <w:rPr>
-          <w:rFonts w:ascii="Calibri Light" w:hAnsi="Calibri Light" w:cs="Calibri Light" w:eastAsia="Calibri Light"/>
-          <w:color w:val="2F5496"/>
-          <w:spacing w:val="0"/>
-          <w:position w:val="0"/>
-          <w:sz w:val="28"/>
-          <w:shd w:fill="auto" w:val="clear"/>
-        </w:rPr>
-      </w:pPr>
-      <w:r>
-        <w:rPr>
-          <w:rFonts w:ascii="Calibri Light" w:hAnsi="Calibri Light" w:cs="Calibri Light" w:eastAsia="Calibri Light"/>
-          <w:color w:val="2F5496"/>
-          <w:spacing w:val="0"/>
-          <w:position w:val="0"/>
-          <w:sz w:val="28"/>
-          <w:shd w:fill="auto" w:val="clear"/>
-        </w:rPr>
         <w:t xml:space="preserve">Level 0 - Tutorial/Introduction</w:t>
       </w:r>
     </w:p>
@@ -2679,8 +2427,8 @@
         </w:rPr>
       </w:pPr>
       <w:r>
-        <w:object w:dxaOrig="8524" w:dyaOrig="6155">
-          <v:rect xmlns:o="urn:schemas-microsoft-com:office:office" xmlns:v="urn:schemas-microsoft-com:vml" id="rectole0000000000" style="width:426.200000pt;height:307.750000pt" o:preferrelative="t" o:ole="">
+        <w:object w:dxaOrig="8625" w:dyaOrig="6236">
+          <v:rect xmlns:o="urn:schemas-microsoft-com:office:office" xmlns:v="urn:schemas-microsoft-com:vml" id="rectole0000000000" style="width:431.250000pt;height:311.800000pt" o:preferrelative="t" o:ole="">
             <o:lock v:ext="edit"/>
             <v:imagedata xmlns:r="http://schemas.openxmlformats.org/officeDocument/2006/relationships" r:id="docRId1" o:title=""/>
           </v:rect>
@@ -2867,8 +2615,8 @@
         </w:rPr>
       </w:pPr>
       <w:r>
-        <w:object w:dxaOrig="8524" w:dyaOrig="8524">
-          <v:rect xmlns:o="urn:schemas-microsoft-com:office:office" xmlns:v="urn:schemas-microsoft-com:vml" id="rectole0000000001" style="width:426.200000pt;height:426.200000pt" o:preferrelative="t" o:ole="">
+        <w:object w:dxaOrig="8625" w:dyaOrig="8625">
+          <v:rect xmlns:o="urn:schemas-microsoft-com:office:office" xmlns:v="urn:schemas-microsoft-com:vml" id="rectole0000000001" style="width:431.250000pt;height:431.250000pt" o:preferrelative="t" o:ole="">
             <o:lock v:ext="edit"/>
             <v:imagedata xmlns:r="http://schemas.openxmlformats.org/officeDocument/2006/relationships" r:id="docRId3" o:title=""/>
           </v:rect>
@@ -3059,24 +2807,362 @@
         <w:jc w:val="both"/>
         <w:rPr>
           <w:rFonts w:ascii="Arial" w:hAnsi="Arial" w:cs="Arial" w:eastAsia="Arial"/>
+          <w:color w:val="auto"/>
+          <w:spacing w:val="0"/>
+          <w:position w:val="0"/>
+          <w:sz w:val="22"/>
+          <w:shd w:fill="auto" w:val="clear"/>
+        </w:rPr>
+      </w:pPr>
+      <w:r>
+        <w:rPr>
+          <w:rFonts w:ascii="Arial" w:hAnsi="Arial" w:cs="Arial" w:eastAsia="Arial"/>
+          <w:color w:val="auto"/>
+          <w:spacing w:val="0"/>
+          <w:position w:val="0"/>
+          <w:sz w:val="22"/>
+          <w:shd w:fill="auto" w:val="clear"/>
+        </w:rPr>
+        <w:t xml:space="preserve">Later on the game, it is learned that before they went into coma, during one of their birthday parties, they have gravely injured a classmate to the point of putting them in coma by accident for trying to gift them an artbook (Cause: Head Trauma induced by falling into the corner of a table. This happens since the character has pushed them in an attempt to reject the gift). After this event took place, they were placed in Therapy. The guilt was immense, causing them to attempt to kill themselves by smashing their head into a wall and, consecutevely, placing themselves into a coma.</w:t>
+      </w:r>
+    </w:p>
+    <w:p>
+      <w:pPr>
+        <w:spacing w:before="0" w:after="0" w:line="276"/>
+        <w:ind w:right="0" w:left="0" w:firstLine="0"/>
+        <w:jc w:val="both"/>
+        <w:rPr>
+          <w:rFonts w:ascii="Arial" w:hAnsi="Arial" w:cs="Arial" w:eastAsia="Arial"/>
+          <w:color w:val="auto"/>
+          <w:spacing w:val="0"/>
+          <w:position w:val="0"/>
+          <w:sz w:val="22"/>
+          <w:shd w:fill="auto" w:val="clear"/>
+        </w:rPr>
+      </w:pPr>
+    </w:p>
+    <w:p>
+      <w:pPr>
+        <w:spacing w:before="0" w:after="0" w:line="276"/>
+        <w:ind w:right="0" w:left="0" w:firstLine="0"/>
+        <w:jc w:val="both"/>
+        <w:rPr>
+          <w:rFonts w:ascii="Calibri Light" w:hAnsi="Calibri Light" w:cs="Calibri Light" w:eastAsia="Calibri Light"/>
+          <w:color w:val="2F5496"/>
+          <w:spacing w:val="0"/>
+          <w:position w:val="0"/>
+          <w:sz w:val="36"/>
+          <w:shd w:fill="auto" w:val="clear"/>
+        </w:rPr>
+      </w:pPr>
+      <w:r>
+        <w:rPr>
+          <w:rFonts w:ascii="Calibri Light" w:hAnsi="Calibri Light" w:cs="Calibri Light" w:eastAsia="Calibri Light"/>
+          <w:color w:val="2F5496"/>
+          <w:spacing w:val="0"/>
+          <w:position w:val="0"/>
+          <w:sz w:val="36"/>
+          <w:shd w:fill="auto" w:val="clear"/>
+        </w:rPr>
+        <w:t xml:space="preserve">ART-STYLE/REFERENCES</w:t>
+      </w:r>
+    </w:p>
+    <w:p>
+      <w:pPr>
+        <w:spacing w:before="0" w:after="0" w:line="276"/>
+        <w:ind w:right="0" w:left="0" w:firstLine="0"/>
+        <w:jc w:val="both"/>
+        <w:rPr>
+          <w:rFonts w:ascii="Calibri Light" w:hAnsi="Calibri Light" w:cs="Calibri Light" w:eastAsia="Calibri Light"/>
+          <w:color w:val="2F5496"/>
+          <w:spacing w:val="0"/>
+          <w:position w:val="0"/>
+          <w:sz w:val="36"/>
+          <w:shd w:fill="auto" w:val="clear"/>
+        </w:rPr>
+      </w:pPr>
+    </w:p>
+    <w:p>
+      <w:pPr>
+        <w:spacing w:before="0" w:after="0" w:line="276"/>
+        <w:ind w:right="0" w:left="0" w:firstLine="0"/>
+        <w:jc w:val="both"/>
+        <w:rPr>
+          <w:rFonts w:ascii="Calibri Light" w:hAnsi="Calibri Light" w:cs="Calibri Light" w:eastAsia="Calibri Light"/>
+          <w:color w:val="2F5496"/>
+          <w:spacing w:val="0"/>
+          <w:position w:val="0"/>
+          <w:sz w:val="28"/>
+          <w:shd w:fill="auto" w:val="clear"/>
+        </w:rPr>
+      </w:pPr>
+      <w:r>
+        <w:rPr>
+          <w:rFonts w:ascii="Calibri Light" w:hAnsi="Calibri Light" w:cs="Calibri Light" w:eastAsia="Calibri Light"/>
+          <w:color w:val="2F5496"/>
+          <w:spacing w:val="0"/>
+          <w:position w:val="0"/>
+          <w:sz w:val="28"/>
+          <w:shd w:fill="auto" w:val="clear"/>
+        </w:rPr>
+        <w:t xml:space="preserve">Enemy Design</w:t>
+      </w:r>
+    </w:p>
+    <w:p>
+      <w:pPr>
+        <w:spacing w:before="0" w:after="0" w:line="276"/>
+        <w:ind w:right="0" w:left="0" w:firstLine="0"/>
+        <w:jc w:val="both"/>
+        <w:rPr>
+          <w:rFonts w:ascii="Arial" w:hAnsi="Arial" w:cs="Arial" w:eastAsia="Arial"/>
+          <w:color w:val="auto"/>
+          <w:spacing w:val="0"/>
+          <w:position w:val="0"/>
+          <w:sz w:val="22"/>
+          <w:shd w:fill="auto" w:val="clear"/>
+        </w:rPr>
+      </w:pPr>
+      <w:r>
+        <w:rPr>
+          <w:rFonts w:ascii="Arial" w:hAnsi="Arial" w:cs="Arial" w:eastAsia="Arial"/>
           <w:b/>
           <w:color w:val="auto"/>
           <w:spacing w:val="0"/>
           <w:position w:val="0"/>
-          <w:sz w:val="24"/>
-          <w:shd w:fill="auto" w:val="clear"/>
-        </w:rPr>
-      </w:pPr>
-      <w:r>
-        <w:rPr>
-          <w:rFonts w:ascii="Arial" w:hAnsi="Arial" w:cs="Arial" w:eastAsia="Arial"/>
-          <w:color w:val="auto"/>
-          <w:spacing w:val="0"/>
-          <w:position w:val="0"/>
-          <w:sz w:val="22"/>
-          <w:shd w:fill="auto" w:val="clear"/>
-        </w:rPr>
-        <w:t xml:space="preserve">Later on the game, it is learned that before they went into coma, during one of their birthday parties, they have gravely injured a classmate to the point of putting them in coma by accident for trying to gift them an artbook (Cause: Head Trauma induced by falling into the corner of a table. This happens since the character has pushed them in an attempt to reject the gift). After this event took place, they were placed in Therapy. The guilt was immense, causing them to attempt to kill themselves by smashing their head into a wall and, consecutevely, placing themselves into a coma.</w:t>
+          <w:sz w:val="22"/>
+          <w:shd w:fill="auto" w:val="clear"/>
+        </w:rPr>
+        <w:t xml:space="preserve">The Mimic: </w:t>
+      </w:r>
+      <w:r>
+        <w:rPr>
+          <w:rFonts w:ascii="Arial" w:hAnsi="Arial" w:cs="Arial" w:eastAsia="Arial"/>
+          <w:color w:val="auto"/>
+          <w:spacing w:val="0"/>
+          <w:position w:val="0"/>
+          <w:sz w:val="22"/>
+          <w:shd w:fill="auto" w:val="clear"/>
+        </w:rPr>
+        <w:t xml:space="preserve">Meant to represent a thin, white-skinned humanoid creature with glowing eyes and sharp claws. They are meant to blend in with the environment physically, with their glowing eyes being the only reliable indicator for the player that the mimic is in sight.</w:t>
+      </w:r>
+    </w:p>
+    <w:p>
+      <w:pPr>
+        <w:spacing w:before="0" w:after="0" w:line="276"/>
+        <w:ind w:right="0" w:left="0" w:firstLine="0"/>
+        <w:jc w:val="both"/>
+        <w:rPr>
+          <w:rFonts w:ascii="Arial" w:hAnsi="Arial" w:cs="Arial" w:eastAsia="Arial"/>
+          <w:color w:val="auto"/>
+          <w:spacing w:val="0"/>
+          <w:position w:val="0"/>
+          <w:sz w:val="22"/>
+          <w:shd w:fill="auto" w:val="clear"/>
+        </w:rPr>
+      </w:pPr>
+    </w:p>
+    <w:p>
+      <w:pPr>
+        <w:spacing w:before="0" w:after="0" w:line="240"/>
+        <w:ind w:right="0" w:left="0" w:firstLine="0"/>
+        <w:jc w:val="center"/>
+        <w:rPr>
+          <w:rFonts w:ascii="Arial" w:hAnsi="Arial" w:cs="Arial" w:eastAsia="Arial"/>
+          <w:color w:val="auto"/>
+          <w:spacing w:val="0"/>
+          <w:position w:val="0"/>
+          <w:sz w:val="22"/>
+          <w:shd w:fill="auto" w:val="clear"/>
+        </w:rPr>
+      </w:pPr>
+      <w:r>
+        <w:object w:dxaOrig="8310" w:dyaOrig="8310">
+          <v:rect xmlns:o="urn:schemas-microsoft-com:office:office" xmlns:v="urn:schemas-microsoft-com:vml" id="rectole0000000002" style="width:415.500000pt;height:415.500000pt" o:preferrelative="t" o:ole="">
+            <o:lock v:ext="edit"/>
+            <v:imagedata xmlns:r="http://schemas.openxmlformats.org/officeDocument/2006/relationships" r:id="docRId5" o:title=""/>
+          </v:rect>
+          <o:OLEObject xmlns:r="http://schemas.openxmlformats.org/officeDocument/2006/relationships" xmlns:o="urn:schemas-microsoft-com:office:office" Type="Embed" ProgID="StaticDib" DrawAspect="Content" ObjectID="0000000002" ShapeID="rectole0000000002" r:id="docRId4"/>
+        </w:object>
+      </w:r>
+    </w:p>
+    <w:p>
+      <w:pPr>
+        <w:spacing w:before="0" w:after="0" w:line="276"/>
+        <w:ind w:right="0" w:left="0" w:firstLine="0"/>
+        <w:jc w:val="both"/>
+        <w:rPr>
+          <w:rFonts w:ascii="Arial" w:hAnsi="Arial" w:cs="Arial" w:eastAsia="Arial"/>
+          <w:color w:val="auto"/>
+          <w:spacing w:val="0"/>
+          <w:position w:val="0"/>
+          <w:sz w:val="16"/>
+          <w:u w:val="single"/>
+          <w:shd w:fill="auto" w:val="clear"/>
+        </w:rPr>
+      </w:pPr>
+      <w:r>
+        <w:rPr>
+          <w:rFonts w:ascii="Arial" w:hAnsi="Arial" w:cs="Arial" w:eastAsia="Arial"/>
+          <w:color w:val="auto"/>
+          <w:spacing w:val="0"/>
+          <w:position w:val="0"/>
+          <w:sz w:val="16"/>
+          <w:u w:val="single"/>
+          <w:shd w:fill="auto" w:val="clear"/>
+        </w:rPr>
+        <w:t xml:space="preserve">Image: Artwork of The Rake's creature. Author of image unknown</w:t>
+      </w:r>
+    </w:p>
+    <w:p>
+      <w:pPr>
+        <w:spacing w:before="0" w:after="0" w:line="276"/>
+        <w:ind w:right="0" w:left="0" w:firstLine="0"/>
+        <w:jc w:val="both"/>
+        <w:rPr>
+          <w:rFonts w:ascii="Arial" w:hAnsi="Arial" w:cs="Arial" w:eastAsia="Arial"/>
+          <w:color w:val="auto"/>
+          <w:spacing w:val="0"/>
+          <w:position w:val="0"/>
+          <w:sz w:val="16"/>
+          <w:u w:val="single"/>
+          <w:shd w:fill="auto" w:val="clear"/>
+        </w:rPr>
+      </w:pPr>
+    </w:p>
+    <w:p>
+      <w:pPr>
+        <w:spacing w:before="0" w:after="0" w:line="276"/>
+        <w:ind w:right="0" w:left="0" w:firstLine="0"/>
+        <w:jc w:val="both"/>
+        <w:rPr>
+          <w:rFonts w:ascii="Calibri Light" w:hAnsi="Calibri Light" w:cs="Calibri Light" w:eastAsia="Calibri Light"/>
+          <w:color w:val="2F5496"/>
+          <w:spacing w:val="0"/>
+          <w:position w:val="0"/>
+          <w:sz w:val="24"/>
+          <w:u w:val="single"/>
+          <w:shd w:fill="auto" w:val="clear"/>
+        </w:rPr>
+      </w:pPr>
+    </w:p>
+    <w:p>
+      <w:pPr>
+        <w:spacing w:before="0" w:after="0" w:line="276"/>
+        <w:ind w:right="0" w:left="0" w:firstLine="0"/>
+        <w:jc w:val="both"/>
+        <w:rPr>
+          <w:rFonts w:ascii="Arial" w:hAnsi="Arial" w:cs="Arial" w:eastAsia="Arial"/>
+          <w:color w:val="auto"/>
+          <w:spacing w:val="0"/>
+          <w:position w:val="0"/>
+          <w:sz w:val="22"/>
+          <w:shd w:fill="auto" w:val="clear"/>
+        </w:rPr>
+      </w:pPr>
+      <w:r>
+        <w:rPr>
+          <w:rFonts w:ascii="Arial" w:hAnsi="Arial" w:cs="Arial" w:eastAsia="Arial"/>
+          <w:b/>
+          <w:color w:val="auto"/>
+          <w:spacing w:val="0"/>
+          <w:position w:val="0"/>
+          <w:sz w:val="22"/>
+          <w:shd w:fill="auto" w:val="clear"/>
+        </w:rPr>
+        <w:t xml:space="preserve">Phantoms: </w:t>
+      </w:r>
+      <w:r>
+        <w:rPr>
+          <w:rFonts w:ascii="Arial" w:hAnsi="Arial" w:cs="Arial" w:eastAsia="Arial"/>
+          <w:color w:val="auto"/>
+          <w:spacing w:val="0"/>
+          <w:position w:val="0"/>
+          <w:sz w:val="22"/>
+          <w:shd w:fill="auto" w:val="clear"/>
+        </w:rPr>
+        <w:t xml:space="preserve">Similiar to a "Dementor" from the "Harry Potter" franchise in design, however with an inverse role: Inflicting happy memories into the player rather than draining them [1].</w:t>
+      </w:r>
+    </w:p>
+    <w:p>
+      <w:pPr>
+        <w:spacing w:before="0" w:after="0" w:line="276"/>
+        <w:ind w:right="0" w:left="0" w:firstLine="0"/>
+        <w:jc w:val="both"/>
+        <w:rPr>
+          <w:rFonts w:ascii="Arial" w:hAnsi="Arial" w:cs="Arial" w:eastAsia="Arial"/>
+          <w:color w:val="auto"/>
+          <w:spacing w:val="0"/>
+          <w:position w:val="0"/>
+          <w:sz w:val="22"/>
+          <w:shd w:fill="auto" w:val="clear"/>
+        </w:rPr>
+      </w:pPr>
+    </w:p>
+    <w:p>
+      <w:pPr>
+        <w:spacing w:before="0" w:after="0" w:line="240"/>
+        <w:ind w:right="0" w:left="0" w:firstLine="0"/>
+        <w:jc w:val="center"/>
+        <w:rPr>
+          <w:rFonts w:ascii="Arial" w:hAnsi="Arial" w:cs="Arial" w:eastAsia="Arial"/>
+          <w:color w:val="auto"/>
+          <w:spacing w:val="0"/>
+          <w:position w:val="0"/>
+          <w:sz w:val="22"/>
+          <w:shd w:fill="auto" w:val="clear"/>
+        </w:rPr>
+      </w:pPr>
+      <w:r>
+        <w:object w:dxaOrig="4020" w:dyaOrig="5249">
+          <v:rect xmlns:o="urn:schemas-microsoft-com:office:office" xmlns:v="urn:schemas-microsoft-com:vml" id="rectole0000000003" style="width:201.000000pt;height:262.450000pt" o:preferrelative="t" o:ole="">
+            <o:lock v:ext="edit"/>
+            <v:imagedata xmlns:r="http://schemas.openxmlformats.org/officeDocument/2006/relationships" r:id="docRId7" o:title=""/>
+          </v:rect>
+          <o:OLEObject xmlns:r="http://schemas.openxmlformats.org/officeDocument/2006/relationships" xmlns:o="urn:schemas-microsoft-com:office:office" Type="Embed" ProgID="StaticDib" DrawAspect="Content" ObjectID="0000000003" ShapeID="rectole0000000003" r:id="docRId6"/>
+        </w:object>
+      </w:r>
+    </w:p>
+    <w:p>
+      <w:pPr>
+        <w:spacing w:before="0" w:after="0" w:line="240"/>
+        <w:ind w:right="0" w:left="0" w:firstLine="0"/>
+        <w:jc w:val="center"/>
+        <w:rPr>
+          <w:rFonts w:ascii="Arial" w:hAnsi="Arial" w:cs="Arial" w:eastAsia="Arial"/>
+          <w:color w:val="auto"/>
+          <w:spacing w:val="0"/>
+          <w:position w:val="0"/>
+          <w:sz w:val="22"/>
+          <w:shd w:fill="auto" w:val="clear"/>
+        </w:rPr>
+      </w:pPr>
+    </w:p>
+    <w:p>
+      <w:pPr>
+        <w:spacing w:before="0" w:after="0" w:line="276"/>
+        <w:ind w:right="0" w:left="0" w:firstLine="0"/>
+        <w:jc w:val="both"/>
+        <w:rPr>
+          <w:rFonts w:ascii="Arial" w:hAnsi="Arial" w:cs="Arial" w:eastAsia="Arial"/>
+          <w:b/>
+          <w:color w:val="auto"/>
+          <w:spacing w:val="0"/>
+          <w:position w:val="0"/>
+          <w:sz w:val="24"/>
+          <w:shd w:fill="auto" w:val="clear"/>
+        </w:rPr>
+      </w:pPr>
+      <w:r>
+        <w:rPr>
+          <w:rFonts w:ascii="Arial" w:hAnsi="Arial" w:cs="Arial" w:eastAsia="Arial"/>
+          <w:color w:val="auto"/>
+          <w:spacing w:val="0"/>
+          <w:position w:val="0"/>
+          <w:sz w:val="16"/>
+          <w:u w:val="single"/>
+          <w:shd w:fill="auto" w:val="clear"/>
+        </w:rPr>
+        <w:t xml:space="preserve">Image: Concept Art of a Dementor from "Harry Potter", from the series wiki page.</w:t>
       </w:r>
     </w:p>
     <w:p>
@@ -3151,7 +3237,7 @@
       <w:pPr>
         <w:numPr>
           <w:ilvl w:val="0"/>
-          <w:numId w:val="32"/>
+          <w:numId w:val="37"/>
         </w:numPr>
         <w:spacing w:before="0" w:after="160" w:line="278"/>
         <w:ind w:right="0" w:left="720" w:hanging="360"/>
@@ -3185,7 +3271,194 @@
           <w:sz w:val="24"/>
           <w:shd w:fill="auto" w:val="clear"/>
         </w:rPr>
-        <w:t xml:space="preserve">→ Importants mechanics like Happiness Bar → Enemy AI → Hiding mechanic → Traps → Items → playable map → cutscenes/lore → polishing → release)</w:t>
+        <w:t xml:space="preserve">→</w:t>
+      </w:r>
+      <w:r>
+        <w:rPr>
+          <w:rFonts w:ascii="Cambria Math" w:hAnsi="Cambria Math" w:cs="Cambria Math" w:eastAsia="Cambria Math"/>
+          <w:color w:val="auto"/>
+          <w:spacing w:val="0"/>
+          <w:position w:val="0"/>
+          <w:sz w:val="24"/>
+          <w:shd w:fill="auto" w:val="clear"/>
+        </w:rPr>
+        <w:t xml:space="preserve"> Importants mechanics like Happiness Bar </w:t>
+      </w:r>
+      <w:r>
+        <w:rPr>
+          <w:rFonts w:ascii="Cambria Math" w:hAnsi="Cambria Math" w:cs="Cambria Math" w:eastAsia="Cambria Math"/>
+          <w:color w:val="auto"/>
+          <w:spacing w:val="0"/>
+          <w:position w:val="0"/>
+          <w:sz w:val="24"/>
+          <w:shd w:fill="auto" w:val="clear"/>
+        </w:rPr>
+        <w:t xml:space="preserve">→</w:t>
+      </w:r>
+      <w:r>
+        <w:rPr>
+          <w:rFonts w:ascii="Cambria Math" w:hAnsi="Cambria Math" w:cs="Cambria Math" w:eastAsia="Cambria Math"/>
+          <w:color w:val="auto"/>
+          <w:spacing w:val="0"/>
+          <w:position w:val="0"/>
+          <w:sz w:val="24"/>
+          <w:shd w:fill="auto" w:val="clear"/>
+        </w:rPr>
+        <w:t xml:space="preserve"> Enemy AI </w:t>
+      </w:r>
+      <w:r>
+        <w:rPr>
+          <w:rFonts w:ascii="Cambria Math" w:hAnsi="Cambria Math" w:cs="Cambria Math" w:eastAsia="Cambria Math"/>
+          <w:color w:val="auto"/>
+          <w:spacing w:val="0"/>
+          <w:position w:val="0"/>
+          <w:sz w:val="24"/>
+          <w:shd w:fill="auto" w:val="clear"/>
+        </w:rPr>
+        <w:t xml:space="preserve">→</w:t>
+      </w:r>
+      <w:r>
+        <w:rPr>
+          <w:rFonts w:ascii="Cambria Math" w:hAnsi="Cambria Math" w:cs="Cambria Math" w:eastAsia="Cambria Math"/>
+          <w:color w:val="auto"/>
+          <w:spacing w:val="0"/>
+          <w:position w:val="0"/>
+          <w:sz w:val="24"/>
+          <w:shd w:fill="auto" w:val="clear"/>
+        </w:rPr>
+        <w:t xml:space="preserve"> Hiding mechanic </w:t>
+      </w:r>
+      <w:r>
+        <w:rPr>
+          <w:rFonts w:ascii="Cambria Math" w:hAnsi="Cambria Math" w:cs="Cambria Math" w:eastAsia="Cambria Math"/>
+          <w:color w:val="auto"/>
+          <w:spacing w:val="0"/>
+          <w:position w:val="0"/>
+          <w:sz w:val="24"/>
+          <w:shd w:fill="auto" w:val="clear"/>
+        </w:rPr>
+        <w:t xml:space="preserve">→</w:t>
+      </w:r>
+      <w:r>
+        <w:rPr>
+          <w:rFonts w:ascii="Cambria Math" w:hAnsi="Cambria Math" w:cs="Cambria Math" w:eastAsia="Cambria Math"/>
+          <w:color w:val="auto"/>
+          <w:spacing w:val="0"/>
+          <w:position w:val="0"/>
+          <w:sz w:val="24"/>
+          <w:shd w:fill="auto" w:val="clear"/>
+        </w:rPr>
+        <w:t xml:space="preserve"> Traps </w:t>
+      </w:r>
+      <w:r>
+        <w:rPr>
+          <w:rFonts w:ascii="Cambria Math" w:hAnsi="Cambria Math" w:cs="Cambria Math" w:eastAsia="Cambria Math"/>
+          <w:color w:val="auto"/>
+          <w:spacing w:val="0"/>
+          <w:position w:val="0"/>
+          <w:sz w:val="24"/>
+          <w:shd w:fill="auto" w:val="clear"/>
+        </w:rPr>
+        <w:t xml:space="preserve">→</w:t>
+      </w:r>
+      <w:r>
+        <w:rPr>
+          <w:rFonts w:ascii="Cambria Math" w:hAnsi="Cambria Math" w:cs="Cambria Math" w:eastAsia="Cambria Math"/>
+          <w:color w:val="auto"/>
+          <w:spacing w:val="0"/>
+          <w:position w:val="0"/>
+          <w:sz w:val="24"/>
+          <w:shd w:fill="auto" w:val="clear"/>
+        </w:rPr>
+        <w:t xml:space="preserve"> Items </w:t>
+      </w:r>
+      <w:r>
+        <w:rPr>
+          <w:rFonts w:ascii="Cambria Math" w:hAnsi="Cambria Math" w:cs="Cambria Math" w:eastAsia="Cambria Math"/>
+          <w:color w:val="auto"/>
+          <w:spacing w:val="0"/>
+          <w:position w:val="0"/>
+          <w:sz w:val="24"/>
+          <w:shd w:fill="auto" w:val="clear"/>
+        </w:rPr>
+        <w:t xml:space="preserve">→</w:t>
+      </w:r>
+      <w:r>
+        <w:rPr>
+          <w:rFonts w:ascii="Cambria Math" w:hAnsi="Cambria Math" w:cs="Cambria Math" w:eastAsia="Cambria Math"/>
+          <w:color w:val="auto"/>
+          <w:spacing w:val="0"/>
+          <w:position w:val="0"/>
+          <w:sz w:val="24"/>
+          <w:shd w:fill="auto" w:val="clear"/>
+        </w:rPr>
+        <w:t xml:space="preserve"> playable map </w:t>
+      </w:r>
+      <w:r>
+        <w:rPr>
+          <w:rFonts w:ascii="Cambria Math" w:hAnsi="Cambria Math" w:cs="Cambria Math" w:eastAsia="Cambria Math"/>
+          <w:color w:val="auto"/>
+          <w:spacing w:val="0"/>
+          <w:position w:val="0"/>
+          <w:sz w:val="24"/>
+          <w:shd w:fill="auto" w:val="clear"/>
+        </w:rPr>
+        <w:t xml:space="preserve">→</w:t>
+      </w:r>
+      <w:r>
+        <w:rPr>
+          <w:rFonts w:ascii="Cambria Math" w:hAnsi="Cambria Math" w:cs="Cambria Math" w:eastAsia="Cambria Math"/>
+          <w:color w:val="auto"/>
+          <w:spacing w:val="0"/>
+          <w:position w:val="0"/>
+          <w:sz w:val="24"/>
+          <w:shd w:fill="auto" w:val="clear"/>
+        </w:rPr>
+        <w:t xml:space="preserve"> cutscenes/lore </w:t>
+      </w:r>
+      <w:r>
+        <w:rPr>
+          <w:rFonts w:ascii="Cambria Math" w:hAnsi="Cambria Math" w:cs="Cambria Math" w:eastAsia="Cambria Math"/>
+          <w:color w:val="auto"/>
+          <w:spacing w:val="0"/>
+          <w:position w:val="0"/>
+          <w:sz w:val="24"/>
+          <w:shd w:fill="auto" w:val="clear"/>
+        </w:rPr>
+        <w:t xml:space="preserve">→</w:t>
+      </w:r>
+      <w:r>
+        <w:rPr>
+          <w:rFonts w:ascii="Cambria Math" w:hAnsi="Cambria Math" w:cs="Cambria Math" w:eastAsia="Cambria Math"/>
+          <w:color w:val="auto"/>
+          <w:spacing w:val="0"/>
+          <w:position w:val="0"/>
+          <w:sz w:val="24"/>
+          <w:shd w:fill="auto" w:val="clear"/>
+        </w:rPr>
+        <w:t xml:space="preserve"> polishing </w:t>
+      </w:r>
+      <w:r>
+        <w:rPr>
+          <w:rFonts w:ascii="Cambria Math" w:hAnsi="Cambria Math" w:cs="Cambria Math" w:eastAsia="Cambria Math"/>
+          <w:color w:val="auto"/>
+          <w:spacing w:val="0"/>
+          <w:position w:val="0"/>
+          <w:sz w:val="24"/>
+          <w:shd w:fill="auto" w:val="clear"/>
+        </w:rPr>
+        <w:t xml:space="preserve">→</w:t>
+      </w:r>
+      <w:r>
+        <w:rPr>
+          <w:rFonts w:ascii="Cambria Math" w:hAnsi="Cambria Math" w:cs="Cambria Math" w:eastAsia="Cambria Math"/>
+          <w:color w:val="auto"/>
+          <w:spacing w:val="0"/>
+          <w:position w:val="0"/>
+          <w:sz w:val="24"/>
+          <w:shd w:fill="auto" w:val="clear"/>
+        </w:rPr>
+        <w:t xml:space="preserve"> release)</w:t>
       </w:r>
     </w:p>
     <w:p>
@@ -3218,7 +3491,7 @@
       <w:pPr>
         <w:numPr>
           <w:ilvl w:val="0"/>
-          <w:numId w:val="34"/>
+          <w:numId w:val="39"/>
         </w:numPr>
         <w:spacing w:before="0" w:after="160" w:line="278"/>
         <w:ind w:right="0" w:left="720" w:hanging="360"/>
@@ -3274,7 +3547,7 @@
       <w:pPr>
         <w:numPr>
           <w:ilvl w:val="0"/>
-          <w:numId w:val="36"/>
+          <w:numId w:val="41"/>
         </w:numPr>
         <w:spacing w:before="0" w:after="160" w:line="278"/>
         <w:ind w:right="0" w:left="720" w:hanging="360"/>
@@ -3298,6 +3571,124 @@
           <w:shd w:fill="auto" w:val="clear"/>
         </w:rPr>
         <w:t xml:space="preserve">Atleast one playable level + Implemented Happiness Mechanic + one trap + one item + one enemy + simple lore snippets.</w:t>
+      </w:r>
+    </w:p>
+    <w:p>
+      <w:pPr>
+        <w:spacing w:before="0" w:after="160" w:line="278"/>
+        <w:ind w:right="0" w:left="0" w:firstLine="0"/>
+        <w:jc w:val="left"/>
+        <w:rPr>
+          <w:rFonts w:ascii="Calibri" w:hAnsi="Calibri" w:cs="Calibri" w:eastAsia="Calibri"/>
+          <w:color w:val="auto"/>
+          <w:spacing w:val="0"/>
+          <w:position w:val="0"/>
+          <w:sz w:val="24"/>
+          <w:shd w:fill="auto" w:val="clear"/>
+        </w:rPr>
+      </w:pPr>
+    </w:p>
+    <w:p>
+      <w:pPr>
+        <w:spacing w:before="0" w:after="160" w:line="278"/>
+        <w:ind w:right="0" w:left="0" w:firstLine="0"/>
+        <w:jc w:val="left"/>
+        <w:rPr>
+          <w:rFonts w:ascii="Calibri" w:hAnsi="Calibri" w:cs="Calibri" w:eastAsia="Calibri"/>
+          <w:color w:val="auto"/>
+          <w:spacing w:val="0"/>
+          <w:position w:val="0"/>
+          <w:sz w:val="24"/>
+          <w:shd w:fill="auto" w:val="clear"/>
+        </w:rPr>
+      </w:pPr>
+    </w:p>
+    <w:p>
+      <w:pPr>
+        <w:spacing w:before="0" w:after="160" w:line="278"/>
+        <w:ind w:right="0" w:left="0" w:firstLine="0"/>
+        <w:jc w:val="left"/>
+        <w:rPr>
+          <w:rFonts w:ascii="Calibri Light" w:hAnsi="Calibri Light" w:cs="Calibri Light" w:eastAsia="Calibri Light"/>
+          <w:color w:val="2F5496"/>
+          <w:spacing w:val="0"/>
+          <w:position w:val="0"/>
+          <w:sz w:val="32"/>
+          <w:shd w:fill="auto" w:val="clear"/>
+        </w:rPr>
+      </w:pPr>
+      <w:r>
+        <w:rPr>
+          <w:rFonts w:ascii="Calibri Light" w:hAnsi="Calibri Light" w:cs="Calibri Light" w:eastAsia="Calibri Light"/>
+          <w:color w:val="2F5496"/>
+          <w:spacing w:val="0"/>
+          <w:position w:val="0"/>
+          <w:sz w:val="32"/>
+          <w:shd w:fill="auto" w:val="clear"/>
+        </w:rPr>
+        <w:t xml:space="preserve">REFERENCES</w:t>
+      </w:r>
+    </w:p>
+    <w:p>
+      <w:pPr>
+        <w:spacing w:before="0" w:after="160" w:line="278"/>
+        <w:ind w:right="0" w:left="0" w:firstLine="0"/>
+        <w:jc w:val="left"/>
+        <w:rPr>
+          <w:rFonts w:ascii="Calibri" w:hAnsi="Calibri" w:cs="Calibri" w:eastAsia="Calibri"/>
+          <w:color w:val="auto"/>
+          <w:spacing w:val="0"/>
+          <w:position w:val="0"/>
+          <w:sz w:val="24"/>
+          <w:shd w:fill="auto" w:val="clear"/>
+        </w:rPr>
+      </w:pPr>
+      <w:r>
+        <w:rPr>
+          <w:rFonts w:ascii="Calibri Light" w:hAnsi="Calibri Light" w:cs="Calibri Light" w:eastAsia="Calibri Light"/>
+          <w:color w:val="2F5496"/>
+          <w:spacing w:val="0"/>
+          <w:position w:val="0"/>
+          <w:sz w:val="24"/>
+          <w:shd w:fill="auto" w:val="clear"/>
+        </w:rPr>
+        <w:t xml:space="preserve">[1] </w:t>
+      </w:r>
+      <w:r>
+        <w:rPr>
+          <w:rFonts w:ascii="Calibri" w:hAnsi="Calibri" w:cs="Calibri" w:eastAsia="Calibri"/>
+          <w:color w:val="auto"/>
+          <w:spacing w:val="0"/>
+          <w:position w:val="0"/>
+          <w:sz w:val="24"/>
+          <w:shd w:fill="auto" w:val="clear"/>
+        </w:rPr>
+        <w:t xml:space="preserve">Harry Potter Wiki. (2018). Dementor. [online] Available at: </w:t>
+      </w:r>
+      <w:hyperlink xmlns:r="http://schemas.openxmlformats.org/officeDocument/2006/relationships" r:id="docRId8">
+        <w:r>
+          <w:rPr>
+            <w:rFonts w:ascii="Calibri" w:hAnsi="Calibri" w:cs="Calibri" w:eastAsia="Calibri"/>
+            <w:color w:val="0000FF"/>
+            <w:spacing w:val="0"/>
+            <w:position w:val="0"/>
+            <w:sz w:val="24"/>
+            <w:u w:val="single"/>
+            <w:shd w:fill="auto" w:val="clear"/>
+          </w:rPr>
+          <w:t xml:space="preserve">https://harrypotter.fandom.com/wiki/Dementor</w:t>
+        </w:r>
+      </w:hyperlink>
+      <w:r>
+        <w:rPr>
+          <w:rFonts w:ascii="Calibri" w:hAnsi="Calibri" w:cs="Calibri" w:eastAsia="Calibri"/>
+          <w:color w:val="auto"/>
+          <w:spacing w:val="0"/>
+          <w:position w:val="0"/>
+          <w:sz w:val="24"/>
+          <w:shd w:fill="auto" w:val="clear"/>
+        </w:rPr>
+        <w:t xml:space="preserve">.</w:t>
       </w:r>
     </w:p>
     <w:p>
@@ -3498,19 +3889,19 @@
   <w:num w:numId="22">
     <w:abstractNumId w:val="30"/>
   </w:num>
-  <w:num w:numId="24">
+  <w:num w:numId="25">
     <w:abstractNumId w:val="24"/>
   </w:num>
-  <w:num w:numId="26">
+  <w:num w:numId="27">
     <w:abstractNumId w:val="18"/>
   </w:num>
-  <w:num w:numId="32">
+  <w:num w:numId="37">
     <w:abstractNumId w:val="12"/>
   </w:num>
-  <w:num w:numId="34">
+  <w:num w:numId="39">
     <w:abstractNumId w:val="6"/>
   </w:num>
-  <w:num w:numId="36">
+  <w:num w:numId="41">
     <w:abstractNumId w:val="0"/>
   </w:num>
 </w:numbering>

</xml_diff>

<commit_message>
Slightly updated GDD + Asset Credits
- Slightly Updated GDD to include newer gameplay level design
- Added .txt that has all Asset Credits
- Fixed bug that prevented Keypad from working
- Added hidden FPS counter (toggeable with P)
</commit_message>
<xml_diff>
--- a/COMP3000 GDD.docx
+++ b/COMP3000 GDD.docx
@@ -27,7 +27,7 @@
           <w:sz w:val="40"/>
           <w:shd w:fill="auto" w:val="clear"/>
         </w:rPr>
-        <w:t xml:space="preserve">GAME DESIGN DOCUMENT (ABSTRACT)</w:t>
+        <w:t xml:space="preserve">GAME DESIGN DOCUMENT</w:t>
       </w:r>
     </w:p>
     <w:p>
@@ -221,7 +221,7 @@
           <w:sz w:val="22"/>
           <w:shd w:fill="auto" w:val="clear"/>
         </w:rPr>
-        <w:t xml:space="preserve">Amnesia series, We happy few, VHS Analog Horror (e.g. Mandela Catalogue)</w:t>
+        <w:t xml:space="preserve">Amnesia series, We happy few, VHS Analog Horror (e.g. Mandela Catalogue), Granny, Roblox: Doors</w:t>
       </w:r>
     </w:p>
     <w:p>
@@ -1682,7 +1682,7 @@
       <w:pPr>
         <w:numPr>
           <w:ilvl w:val="0"/>
-          <w:numId w:val="25"/>
+          <w:numId w:val="24"/>
         </w:numPr>
         <w:spacing w:before="0" w:after="0" w:line="276"/>
         <w:ind w:right="0" w:left="720" w:hanging="360"/>
@@ -1725,7 +1725,7 @@
       <w:pPr>
         <w:numPr>
           <w:ilvl w:val="0"/>
-          <w:numId w:val="25"/>
+          <w:numId w:val="24"/>
         </w:numPr>
         <w:spacing w:before="0" w:after="0" w:line="276"/>
         <w:ind w:right="0" w:left="720" w:hanging="360"/>
@@ -1768,7 +1768,7 @@
       <w:pPr>
         <w:numPr>
           <w:ilvl w:val="0"/>
-          <w:numId w:val="25"/>
+          <w:numId w:val="24"/>
         </w:numPr>
         <w:spacing w:before="0" w:after="0" w:line="276"/>
         <w:ind w:right="0" w:left="720" w:hanging="360"/>
@@ -1895,7 +1895,7 @@
       <w:pPr>
         <w:numPr>
           <w:ilvl w:val="0"/>
-          <w:numId w:val="27"/>
+          <w:numId w:val="26"/>
         </w:numPr>
         <w:spacing w:before="0" w:after="0" w:line="276"/>
         <w:ind w:right="0" w:left="720" w:hanging="360"/>
@@ -1938,7 +1938,7 @@
       <w:pPr>
         <w:numPr>
           <w:ilvl w:val="0"/>
-          <w:numId w:val="27"/>
+          <w:numId w:val="26"/>
         </w:numPr>
         <w:spacing w:before="0" w:after="0" w:line="276"/>
         <w:ind w:right="0" w:left="720" w:hanging="360"/>
@@ -1981,7 +1981,7 @@
       <w:pPr>
         <w:numPr>
           <w:ilvl w:val="0"/>
-          <w:numId w:val="27"/>
+          <w:numId w:val="26"/>
         </w:numPr>
         <w:spacing w:before="0" w:after="0" w:line="276"/>
         <w:ind w:right="0" w:left="720" w:hanging="360"/>
@@ -2427,8 +2427,8 @@
         </w:rPr>
       </w:pPr>
       <w:r>
-        <w:object w:dxaOrig="8625" w:dyaOrig="6236">
-          <v:rect xmlns:o="urn:schemas-microsoft-com:office:office" xmlns:v="urn:schemas-microsoft-com:vml" id="rectole0000000000" style="width:431.250000pt;height:311.800000pt" o:preferrelative="t" o:ole="">
+        <w:object w:dxaOrig="8726" w:dyaOrig="6317">
+          <v:rect xmlns:o="urn:schemas-microsoft-com:office:office" xmlns:v="urn:schemas-microsoft-com:vml" id="rectole0000000000" style="width:436.300000pt;height:315.850000pt" o:preferrelative="t" o:ole="">
             <o:lock v:ext="edit"/>
             <v:imagedata xmlns:r="http://schemas.openxmlformats.org/officeDocument/2006/relationships" r:id="docRId1" o:title=""/>
           </v:rect>
@@ -2597,7 +2597,7 @@
           <w:sz w:val="22"/>
           <w:shd w:fill="auto" w:val="clear"/>
         </w:rPr>
-        <w:t xml:space="preserve">Each component of the Master Door (Fuse/Crowbar/Code) is scattered across the map, consisting of a Square layout with multiple classromms in a 2 by 3 grid (6 rooms total) with hallways in-between (Some being blocked). Certain components are not immediatly available from just going around rooms, and require the player to obtain another component to access it. For example, the fuse will be hidden in a classroom that can only be accessible by removing the wooden-planks that are blocking the door. (image tmr. maybe do an irl drawing?)</w:t>
+        <w:t xml:space="preserve">Each component of the Master Door (Fuse/Crowbar/Code) is scattered across the map, consisting of a Square layout with multiple classromms in a 2 by 3 grid (6 rooms total) with hallways in-between (Some being blocked). Certain components are not immediatly available from just going around rooms, and require the player to obtain another component to access it. For example, the fuse will be hidden in a classroom that can only be accessible by removing the wooden-planks that are blocking the door.</w:t>
       </w:r>
     </w:p>
     <w:p>
@@ -2615,8 +2615,8 @@
         </w:rPr>
       </w:pPr>
       <w:r>
-        <w:object w:dxaOrig="8625" w:dyaOrig="8625">
-          <v:rect xmlns:o="urn:schemas-microsoft-com:office:office" xmlns:v="urn:schemas-microsoft-com:vml" id="rectole0000000001" style="width:431.250000pt;height:431.250000pt" o:preferrelative="t" o:ole="">
+        <w:object w:dxaOrig="8726" w:dyaOrig="8726">
+          <v:rect xmlns:o="urn:schemas-microsoft-com:office:office" xmlns:v="urn:schemas-microsoft-com:vml" id="rectole0000000001" style="width:436.300000pt;height:436.300000pt" o:preferrelative="t" o:ole="">
             <o:lock v:ext="edit"/>
             <v:imagedata xmlns:r="http://schemas.openxmlformats.org/officeDocument/2006/relationships" r:id="docRId3" o:title=""/>
           </v:rect>
@@ -2630,16 +2630,6 @@
         <w:ind w:right="0" w:left="0" w:firstLine="0"/>
         <w:jc w:val="both"/>
         <w:rPr>
-          <w:rFonts w:ascii="Calibri Light" w:hAnsi="Calibri Light" w:cs="Calibri Light" w:eastAsia="Calibri Light"/>
-          <w:color w:val="2F5496"/>
-          <w:spacing w:val="0"/>
-          <w:position w:val="0"/>
-          <w:sz w:val="28"/>
-          <w:shd w:fill="auto" w:val="clear"/>
-        </w:rPr>
-      </w:pPr>
-      <w:r>
-        <w:rPr>
           <w:rFonts w:ascii="Arial" w:hAnsi="Arial" w:cs="Arial" w:eastAsia="Arial"/>
           <w:color w:val="auto"/>
           <w:spacing w:val="0"/>
@@ -2647,316 +2637,30 @@
           <w:sz w:val="16"/>
           <w:shd w:fill="auto" w:val="clear"/>
         </w:rPr>
-        <w:t xml:space="preserve">Diagram: Low-fidelity layout design for the gameplay level</w:t>
-      </w:r>
-    </w:p>
-    <w:p>
-      <w:pPr>
-        <w:spacing w:before="0" w:after="0" w:line="276"/>
-        <w:ind w:right="0" w:left="0" w:firstLine="0"/>
-        <w:jc w:val="both"/>
-        <w:rPr>
-          <w:rFonts w:ascii="Arial" w:hAnsi="Arial" w:cs="Arial" w:eastAsia="Arial"/>
-          <w:color w:val="auto"/>
-          <w:spacing w:val="0"/>
-          <w:position w:val="0"/>
-          <w:sz w:val="22"/>
-          <w:shd w:fill="auto" w:val="clear"/>
-        </w:rPr>
-      </w:pPr>
-    </w:p>
-    <w:p>
-      <w:pPr>
-        <w:spacing w:before="0" w:after="0" w:line="276"/>
-        <w:ind w:right="0" w:left="0" w:firstLine="0"/>
-        <w:jc w:val="both"/>
-        <w:rPr>
-          <w:rFonts w:ascii="Arial" w:hAnsi="Arial" w:cs="Arial" w:eastAsia="Arial"/>
-          <w:color w:val="auto"/>
-          <w:spacing w:val="0"/>
-          <w:position w:val="0"/>
-          <w:sz w:val="22"/>
-          <w:shd w:fill="auto" w:val="clear"/>
-        </w:rPr>
-      </w:pPr>
-      <w:r>
-        <w:rPr>
-          <w:rFonts w:ascii="Calibri Light" w:hAnsi="Calibri Light" w:cs="Calibri Light" w:eastAsia="Calibri Light"/>
-          <w:color w:val="2F5496"/>
-          <w:spacing w:val="0"/>
-          <w:position w:val="0"/>
-          <w:sz w:val="36"/>
-          <w:shd w:fill="auto" w:val="clear"/>
-        </w:rPr>
-        <w:t xml:space="preserve">STORY / LORE</w:t>
-      </w:r>
-    </w:p>
-    <w:p>
-      <w:pPr>
-        <w:spacing w:before="0" w:after="0" w:line="276"/>
-        <w:ind w:right="0" w:left="0" w:firstLine="0"/>
-        <w:jc w:val="both"/>
-        <w:rPr>
-          <w:rFonts w:ascii="Arial" w:hAnsi="Arial" w:cs="Arial" w:eastAsia="Arial"/>
-          <w:b/>
-          <w:color w:val="auto"/>
-          <w:spacing w:val="0"/>
-          <w:position w:val="0"/>
-          <w:sz w:val="24"/>
-          <w:shd w:fill="auto" w:val="clear"/>
-        </w:rPr>
-      </w:pPr>
-      <w:r>
-        <w:rPr>
-          <w:rFonts w:ascii="Calibri Light" w:hAnsi="Calibri Light" w:cs="Calibri Light" w:eastAsia="Calibri Light"/>
-          <w:color w:val="2F5496"/>
-          <w:spacing w:val="0"/>
-          <w:position w:val="0"/>
-          <w:sz w:val="28"/>
-          <w:shd w:fill="auto" w:val="clear"/>
-        </w:rPr>
-        <w:t xml:space="preserve">Narrative</w:t>
-      </w:r>
-    </w:p>
-    <w:p>
-      <w:pPr>
-        <w:spacing w:before="0" w:after="0" w:line="276"/>
-        <w:ind w:right="0" w:left="0" w:firstLine="0"/>
-        <w:jc w:val="both"/>
-        <w:rPr>
-          <w:rFonts w:ascii="Arial" w:hAnsi="Arial" w:cs="Arial" w:eastAsia="Arial"/>
-          <w:color w:val="auto"/>
-          <w:spacing w:val="0"/>
-          <w:position w:val="0"/>
-          <w:sz w:val="22"/>
-          <w:shd w:fill="auto" w:val="clear"/>
-        </w:rPr>
-      </w:pPr>
-      <w:r>
-        <w:rPr>
-          <w:rFonts w:ascii="Arial" w:hAnsi="Arial" w:cs="Arial" w:eastAsia="Arial"/>
-          <w:color w:val="auto"/>
-          <w:spacing w:val="0"/>
-          <w:position w:val="0"/>
-          <w:sz w:val="22"/>
-          <w:shd w:fill="auto" w:val="clear"/>
-        </w:rPr>
-        <w:t xml:space="preserve">The narrative takes place inside the mind of a college student. They wake up in a empty room with nothing but candles and a note with the caption "Happiness is a detriment" written all over it. Unaware of who they are, and how they got here, they decide to investigate their surroundings hoping to find answers and clues as to who they are. The more rooms they explore, the more conclusions they reach regarding who they are.</w:t>
-      </w:r>
-    </w:p>
-    <w:p>
-      <w:pPr>
-        <w:spacing w:before="0" w:after="0" w:line="276"/>
-        <w:ind w:right="0" w:left="0" w:firstLine="0"/>
-        <w:jc w:val="both"/>
-        <w:rPr>
-          <w:rFonts w:ascii="Arial" w:hAnsi="Arial" w:cs="Arial" w:eastAsia="Arial"/>
-          <w:color w:val="auto"/>
-          <w:spacing w:val="0"/>
-          <w:position w:val="0"/>
-          <w:sz w:val="22"/>
-          <w:shd w:fill="auto" w:val="clear"/>
-        </w:rPr>
-      </w:pPr>
-    </w:p>
-    <w:p>
-      <w:pPr>
-        <w:spacing w:before="0" w:after="0" w:line="276"/>
-        <w:ind w:right="0" w:left="0" w:firstLine="0"/>
-        <w:jc w:val="both"/>
-        <w:rPr>
-          <w:rFonts w:ascii="Arial" w:hAnsi="Arial" w:cs="Arial" w:eastAsia="Arial"/>
-          <w:color w:val="auto"/>
-          <w:spacing w:val="0"/>
-          <w:position w:val="0"/>
-          <w:sz w:val="22"/>
-          <w:shd w:fill="auto" w:val="clear"/>
-        </w:rPr>
-      </w:pPr>
-      <w:r>
-        <w:rPr>
-          <w:rFonts w:ascii="Arial" w:hAnsi="Arial" w:cs="Arial" w:eastAsia="Arial"/>
-          <w:color w:val="auto"/>
-          <w:spacing w:val="0"/>
-          <w:position w:val="0"/>
-          <w:sz w:val="22"/>
-          <w:shd w:fill="auto" w:val="clear"/>
-        </w:rPr>
-        <w:t xml:space="preserve">They are a 19 year old art student who possesses a really rare case of Cherophobia - The irrational fear of being happy. Growing up, against their parents attempts, they have always attempted to avoid social interactions and anything happiness-inducing, and spent most their time isolating doing the only hobby that slightly comforted them: Drawing. Multiple art pieces can be found in levels that depict some of their works, most of them portraying distorted characters and scratched over drawings of "happy" moments in their lives, done in an attempt to forget and erase them from memory.</w:t>
-      </w:r>
-    </w:p>
-    <w:p>
-      <w:pPr>
-        <w:spacing w:before="0" w:after="0" w:line="276"/>
-        <w:ind w:right="0" w:left="0" w:firstLine="0"/>
-        <w:jc w:val="both"/>
-        <w:rPr>
-          <w:rFonts w:ascii="Arial" w:hAnsi="Arial" w:cs="Arial" w:eastAsia="Arial"/>
-          <w:color w:val="auto"/>
-          <w:spacing w:val="0"/>
-          <w:position w:val="0"/>
-          <w:sz w:val="22"/>
-          <w:shd w:fill="auto" w:val="clear"/>
-        </w:rPr>
-      </w:pPr>
-    </w:p>
-    <w:p>
-      <w:pPr>
-        <w:spacing w:before="0" w:after="0" w:line="276"/>
-        <w:ind w:right="0" w:left="0" w:firstLine="0"/>
-        <w:jc w:val="both"/>
-        <w:rPr>
-          <w:rFonts w:ascii="Arial" w:hAnsi="Arial" w:cs="Arial" w:eastAsia="Arial"/>
-          <w:color w:val="auto"/>
-          <w:spacing w:val="0"/>
-          <w:position w:val="0"/>
-          <w:sz w:val="22"/>
-          <w:shd w:fill="auto" w:val="clear"/>
-        </w:rPr>
-      </w:pPr>
-      <w:r>
-        <w:rPr>
-          <w:rFonts w:ascii="Arial" w:hAnsi="Arial" w:cs="Arial" w:eastAsia="Arial"/>
-          <w:color w:val="auto"/>
-          <w:spacing w:val="0"/>
-          <w:position w:val="0"/>
-          <w:sz w:val="22"/>
-          <w:shd w:fill="auto" w:val="clear"/>
-        </w:rPr>
-        <w:t xml:space="preserve">Later on the game, it is learned that before they went into coma, during one of their birthday parties, they have gravely injured a classmate to the point of putting them in coma by accident for trying to gift them an artbook (Cause: Head Trauma induced by falling into the corner of a table. This happens since the character has pushed them in an attempt to reject the gift). After this event took place, they were placed in Therapy. The guilt was immense, causing them to attempt to kill themselves by smashing their head into a wall and, consecutevely, placing themselves into a coma.</w:t>
-      </w:r>
-    </w:p>
-    <w:p>
-      <w:pPr>
-        <w:spacing w:before="0" w:after="0" w:line="276"/>
-        <w:ind w:right="0" w:left="0" w:firstLine="0"/>
-        <w:jc w:val="both"/>
-        <w:rPr>
-          <w:rFonts w:ascii="Arial" w:hAnsi="Arial" w:cs="Arial" w:eastAsia="Arial"/>
-          <w:color w:val="auto"/>
-          <w:spacing w:val="0"/>
-          <w:position w:val="0"/>
-          <w:sz w:val="22"/>
-          <w:shd w:fill="auto" w:val="clear"/>
-        </w:rPr>
-      </w:pPr>
-    </w:p>
-    <w:p>
-      <w:pPr>
-        <w:spacing w:before="0" w:after="0" w:line="276"/>
-        <w:ind w:right="0" w:left="0" w:firstLine="0"/>
-        <w:jc w:val="both"/>
-        <w:rPr>
-          <w:rFonts w:ascii="Calibri Light" w:hAnsi="Calibri Light" w:cs="Calibri Light" w:eastAsia="Calibri Light"/>
-          <w:color w:val="2F5496"/>
-          <w:spacing w:val="0"/>
-          <w:position w:val="0"/>
-          <w:sz w:val="36"/>
-          <w:shd w:fill="auto" w:val="clear"/>
-        </w:rPr>
-      </w:pPr>
-      <w:r>
-        <w:rPr>
-          <w:rFonts w:ascii="Calibri Light" w:hAnsi="Calibri Light" w:cs="Calibri Light" w:eastAsia="Calibri Light"/>
-          <w:color w:val="2F5496"/>
-          <w:spacing w:val="0"/>
-          <w:position w:val="0"/>
-          <w:sz w:val="36"/>
-          <w:shd w:fill="auto" w:val="clear"/>
-        </w:rPr>
-        <w:t xml:space="preserve">ART-STYLE/REFERENCES</w:t>
-      </w:r>
-    </w:p>
-    <w:p>
-      <w:pPr>
-        <w:spacing w:before="0" w:after="0" w:line="276"/>
-        <w:ind w:right="0" w:left="0" w:firstLine="0"/>
-        <w:jc w:val="both"/>
-        <w:rPr>
-          <w:rFonts w:ascii="Calibri Light" w:hAnsi="Calibri Light" w:cs="Calibri Light" w:eastAsia="Calibri Light"/>
-          <w:color w:val="2F5496"/>
-          <w:spacing w:val="0"/>
-          <w:position w:val="0"/>
-          <w:sz w:val="36"/>
-          <w:shd w:fill="auto" w:val="clear"/>
-        </w:rPr>
-      </w:pPr>
-    </w:p>
-    <w:p>
-      <w:pPr>
-        <w:spacing w:before="0" w:after="0" w:line="276"/>
-        <w:ind w:right="0" w:left="0" w:firstLine="0"/>
-        <w:jc w:val="both"/>
-        <w:rPr>
-          <w:rFonts w:ascii="Calibri Light" w:hAnsi="Calibri Light" w:cs="Calibri Light" w:eastAsia="Calibri Light"/>
-          <w:color w:val="2F5496"/>
-          <w:spacing w:val="0"/>
-          <w:position w:val="0"/>
-          <w:sz w:val="28"/>
-          <w:shd w:fill="auto" w:val="clear"/>
-        </w:rPr>
-      </w:pPr>
-      <w:r>
-        <w:rPr>
-          <w:rFonts w:ascii="Calibri Light" w:hAnsi="Calibri Light" w:cs="Calibri Light" w:eastAsia="Calibri Light"/>
-          <w:color w:val="2F5496"/>
-          <w:spacing w:val="0"/>
-          <w:position w:val="0"/>
-          <w:sz w:val="28"/>
-          <w:shd w:fill="auto" w:val="clear"/>
-        </w:rPr>
-        <w:t xml:space="preserve">Enemy Design</w:t>
-      </w:r>
-    </w:p>
-    <w:p>
-      <w:pPr>
-        <w:spacing w:before="0" w:after="0" w:line="276"/>
-        <w:ind w:right="0" w:left="0" w:firstLine="0"/>
-        <w:jc w:val="both"/>
-        <w:rPr>
-          <w:rFonts w:ascii="Arial" w:hAnsi="Arial" w:cs="Arial" w:eastAsia="Arial"/>
-          <w:color w:val="auto"/>
-          <w:spacing w:val="0"/>
-          <w:position w:val="0"/>
-          <w:sz w:val="22"/>
-          <w:shd w:fill="auto" w:val="clear"/>
-        </w:rPr>
-      </w:pPr>
-      <w:r>
-        <w:rPr>
-          <w:rFonts w:ascii="Arial" w:hAnsi="Arial" w:cs="Arial" w:eastAsia="Arial"/>
-          <w:b/>
-          <w:color w:val="auto"/>
-          <w:spacing w:val="0"/>
-          <w:position w:val="0"/>
-          <w:sz w:val="22"/>
-          <w:shd w:fill="auto" w:val="clear"/>
-        </w:rPr>
-        <w:t xml:space="preserve">The Mimic: </w:t>
-      </w:r>
-      <w:r>
-        <w:rPr>
-          <w:rFonts w:ascii="Arial" w:hAnsi="Arial" w:cs="Arial" w:eastAsia="Arial"/>
-          <w:color w:val="auto"/>
-          <w:spacing w:val="0"/>
-          <w:position w:val="0"/>
-          <w:sz w:val="22"/>
-          <w:shd w:fill="auto" w:val="clear"/>
-        </w:rPr>
-        <w:t xml:space="preserve">Meant to represent a thin, white-skinned humanoid creature with glowing eyes and sharp claws. They are meant to blend in with the environment physically, with their glowing eyes being the only reliable indicator for the player that the mimic is in sight.</w:t>
-      </w:r>
-    </w:p>
-    <w:p>
-      <w:pPr>
-        <w:spacing w:before="0" w:after="0" w:line="276"/>
-        <w:ind w:right="0" w:left="0" w:firstLine="0"/>
-        <w:jc w:val="both"/>
-        <w:rPr>
-          <w:rFonts w:ascii="Arial" w:hAnsi="Arial" w:cs="Arial" w:eastAsia="Arial"/>
-          <w:color w:val="auto"/>
-          <w:spacing w:val="0"/>
-          <w:position w:val="0"/>
-          <w:sz w:val="22"/>
+      </w:pPr>
+      <w:r>
+        <w:rPr>
+          <w:rFonts w:ascii="Arial" w:hAnsi="Arial" w:cs="Arial" w:eastAsia="Arial"/>
+          <w:color w:val="auto"/>
+          <w:spacing w:val="0"/>
+          <w:position w:val="0"/>
+          <w:sz w:val="16"/>
+          <w:shd w:fill="auto" w:val="clear"/>
+        </w:rPr>
+        <w:t xml:space="preserve">Diagram: Initial Low-fidelity layout design for the gameplay level</w:t>
+      </w:r>
+    </w:p>
+    <w:p>
+      <w:pPr>
+        <w:spacing w:before="0" w:after="0" w:line="276"/>
+        <w:ind w:right="0" w:left="0" w:firstLine="0"/>
+        <w:jc w:val="both"/>
+        <w:rPr>
+          <w:rFonts w:ascii="Arial" w:hAnsi="Arial" w:cs="Arial" w:eastAsia="Arial"/>
+          <w:color w:val="auto"/>
+          <w:spacing w:val="0"/>
+          <w:position w:val="0"/>
+          <w:sz w:val="16"/>
           <w:shd w:fill="auto" w:val="clear"/>
         </w:rPr>
       </w:pPr>
@@ -2965,29 +2669,29 @@
       <w:pPr>
         <w:spacing w:before="0" w:after="0" w:line="240"/>
         <w:ind w:right="0" w:left="0" w:firstLine="0"/>
-        <w:jc w:val="center"/>
-        <w:rPr>
-          <w:rFonts w:ascii="Arial" w:hAnsi="Arial" w:cs="Arial" w:eastAsia="Arial"/>
-          <w:color w:val="auto"/>
-          <w:spacing w:val="0"/>
-          <w:position w:val="0"/>
-          <w:sz w:val="22"/>
-          <w:shd w:fill="auto" w:val="clear"/>
-        </w:rPr>
-      </w:pPr>
-      <w:r>
-        <w:object w:dxaOrig="8310" w:dyaOrig="8310">
-          <v:rect xmlns:o="urn:schemas-microsoft-com:office:office" xmlns:v="urn:schemas-microsoft-com:vml" id="rectole0000000002" style="width:415.500000pt;height:415.500000pt" o:preferrelative="t" o:ole="">
+        <w:jc w:val="both"/>
+        <w:rPr>
+          <w:rFonts w:ascii="Arial" w:hAnsi="Arial" w:cs="Arial" w:eastAsia="Arial"/>
+          <w:color w:val="auto"/>
+          <w:spacing w:val="0"/>
+          <w:position w:val="0"/>
+          <w:sz w:val="16"/>
+          <w:shd w:fill="auto" w:val="clear"/>
+        </w:rPr>
+      </w:pPr>
+      <w:r>
+        <w:object w:dxaOrig="8640" w:dyaOrig="5385">
+          <v:rect xmlns:o="urn:schemas-microsoft-com:office:office" xmlns:v="urn:schemas-microsoft-com:vml" id="rectole0000000002" style="width:432.000000pt;height:269.250000pt" o:preferrelative="t" o:ole="">
             <o:lock v:ext="edit"/>
             <v:imagedata xmlns:r="http://schemas.openxmlformats.org/officeDocument/2006/relationships" r:id="docRId5" o:title=""/>
           </v:rect>
-          <o:OLEObject xmlns:r="http://schemas.openxmlformats.org/officeDocument/2006/relationships" xmlns:o="urn:schemas-microsoft-com:office:office" Type="Embed" ProgID="StaticDib" DrawAspect="Content" ObjectID="0000000002" ShapeID="rectole0000000002" r:id="docRId4"/>
+          <o:OLEObject xmlns:r="http://schemas.openxmlformats.org/officeDocument/2006/relationships" xmlns:o="urn:schemas-microsoft-com:office:office" Type="Embed" ProgID="StaticMetafile" DrawAspect="Content" ObjectID="0000000002" ShapeID="rectole0000000002" r:id="docRId4"/>
         </w:object>
       </w:r>
     </w:p>
     <w:p>
       <w:pPr>
-        <w:spacing w:before="0" w:after="0" w:line="276"/>
+        <w:spacing w:before="0" w:after="0" w:line="240"/>
         <w:ind w:right="0" w:left="0" w:firstLine="0"/>
         <w:jc w:val="both"/>
         <w:rPr>
@@ -2996,7 +2700,6 @@
           <w:spacing w:val="0"/>
           <w:position w:val="0"/>
           <w:sz w:val="16"/>
-          <w:u w:val="single"/>
           <w:shd w:fill="auto" w:val="clear"/>
         </w:rPr>
       </w:pPr>
@@ -3007,43 +2710,242 @@
           <w:spacing w:val="0"/>
           <w:position w:val="0"/>
           <w:sz w:val="16"/>
-          <w:u w:val="single"/>
-          <w:shd w:fill="auto" w:val="clear"/>
-        </w:rPr>
-        <w:t xml:space="preserve">Image: Artwork of The Rake's creature. Author of image unknown</w:t>
-      </w:r>
-    </w:p>
-    <w:p>
-      <w:pPr>
-        <w:spacing w:before="0" w:after="0" w:line="276"/>
-        <w:ind w:right="0" w:left="0" w:firstLine="0"/>
-        <w:jc w:val="both"/>
-        <w:rPr>
-          <w:rFonts w:ascii="Arial" w:hAnsi="Arial" w:cs="Arial" w:eastAsia="Arial"/>
-          <w:color w:val="auto"/>
-          <w:spacing w:val="0"/>
-          <w:position w:val="0"/>
-          <w:sz w:val="16"/>
-          <w:u w:val="single"/>
-          <w:shd w:fill="auto" w:val="clear"/>
-        </w:rPr>
-      </w:pPr>
-    </w:p>
-    <w:p>
-      <w:pPr>
-        <w:spacing w:before="0" w:after="0" w:line="276"/>
-        <w:ind w:right="0" w:left="0" w:firstLine="0"/>
-        <w:jc w:val="both"/>
-        <w:rPr>
-          <w:rFonts w:ascii="Calibri Light" w:hAnsi="Calibri Light" w:cs="Calibri Light" w:eastAsia="Calibri Light"/>
-          <w:color w:val="2F5496"/>
+          <w:shd w:fill="auto" w:val="clear"/>
+        </w:rPr>
+        <w:t xml:space="preserve">Diagram: Finished Low-fidelity layout design for the gameplay level</w:t>
+      </w:r>
+    </w:p>
+    <w:p>
+      <w:pPr>
+        <w:spacing w:before="0" w:after="0" w:line="276"/>
+        <w:ind w:right="0" w:left="0" w:firstLine="0"/>
+        <w:jc w:val="both"/>
+        <w:rPr>
+          <w:rFonts w:ascii="Calibri Light" w:hAnsi="Calibri Light" w:cs="Calibri Light" w:eastAsia="Calibri Light"/>
+          <w:color w:val="2F5496"/>
+          <w:spacing w:val="0"/>
+          <w:position w:val="0"/>
+          <w:sz w:val="28"/>
+          <w:shd w:fill="auto" w:val="clear"/>
+        </w:rPr>
+      </w:pPr>
+    </w:p>
+    <w:p>
+      <w:pPr>
+        <w:spacing w:before="0" w:after="0" w:line="276"/>
+        <w:ind w:right="0" w:left="0" w:firstLine="0"/>
+        <w:jc w:val="both"/>
+        <w:rPr>
+          <w:rFonts w:ascii="Arial" w:hAnsi="Arial" w:cs="Arial" w:eastAsia="Arial"/>
+          <w:color w:val="auto"/>
+          <w:spacing w:val="0"/>
+          <w:position w:val="0"/>
+          <w:sz w:val="22"/>
+          <w:shd w:fill="auto" w:val="clear"/>
+        </w:rPr>
+      </w:pPr>
+    </w:p>
+    <w:p>
+      <w:pPr>
+        <w:spacing w:before="0" w:after="0" w:line="276"/>
+        <w:ind w:right="0" w:left="0" w:firstLine="0"/>
+        <w:jc w:val="both"/>
+        <w:rPr>
+          <w:rFonts w:ascii="Arial" w:hAnsi="Arial" w:cs="Arial" w:eastAsia="Arial"/>
+          <w:color w:val="auto"/>
+          <w:spacing w:val="0"/>
+          <w:position w:val="0"/>
+          <w:sz w:val="22"/>
+          <w:shd w:fill="auto" w:val="clear"/>
+        </w:rPr>
+      </w:pPr>
+      <w:r>
+        <w:rPr>
+          <w:rFonts w:ascii="Calibri Light" w:hAnsi="Calibri Light" w:cs="Calibri Light" w:eastAsia="Calibri Light"/>
+          <w:color w:val="2F5496"/>
+          <w:spacing w:val="0"/>
+          <w:position w:val="0"/>
+          <w:sz w:val="36"/>
+          <w:shd w:fill="auto" w:val="clear"/>
+        </w:rPr>
+        <w:t xml:space="preserve">STORY / LORE</w:t>
+      </w:r>
+    </w:p>
+    <w:p>
+      <w:pPr>
+        <w:spacing w:before="0" w:after="0" w:line="276"/>
+        <w:ind w:right="0" w:left="0" w:firstLine="0"/>
+        <w:jc w:val="both"/>
+        <w:rPr>
+          <w:rFonts w:ascii="Arial" w:hAnsi="Arial" w:cs="Arial" w:eastAsia="Arial"/>
+          <w:b/>
+          <w:color w:val="auto"/>
           <w:spacing w:val="0"/>
           <w:position w:val="0"/>
           <w:sz w:val="24"/>
-          <w:u w:val="single"/>
-          <w:shd w:fill="auto" w:val="clear"/>
-        </w:rPr>
-      </w:pPr>
+          <w:shd w:fill="auto" w:val="clear"/>
+        </w:rPr>
+      </w:pPr>
+      <w:r>
+        <w:rPr>
+          <w:rFonts w:ascii="Calibri Light" w:hAnsi="Calibri Light" w:cs="Calibri Light" w:eastAsia="Calibri Light"/>
+          <w:color w:val="2F5496"/>
+          <w:spacing w:val="0"/>
+          <w:position w:val="0"/>
+          <w:sz w:val="28"/>
+          <w:shd w:fill="auto" w:val="clear"/>
+        </w:rPr>
+        <w:t xml:space="preserve">Narrative</w:t>
+      </w:r>
+    </w:p>
+    <w:p>
+      <w:pPr>
+        <w:spacing w:before="0" w:after="0" w:line="276"/>
+        <w:ind w:right="0" w:left="0" w:firstLine="0"/>
+        <w:jc w:val="both"/>
+        <w:rPr>
+          <w:rFonts w:ascii="Arial" w:hAnsi="Arial" w:cs="Arial" w:eastAsia="Arial"/>
+          <w:color w:val="auto"/>
+          <w:spacing w:val="0"/>
+          <w:position w:val="0"/>
+          <w:sz w:val="22"/>
+          <w:shd w:fill="auto" w:val="clear"/>
+        </w:rPr>
+      </w:pPr>
+      <w:r>
+        <w:rPr>
+          <w:rFonts w:ascii="Arial" w:hAnsi="Arial" w:cs="Arial" w:eastAsia="Arial"/>
+          <w:color w:val="auto"/>
+          <w:spacing w:val="0"/>
+          <w:position w:val="0"/>
+          <w:sz w:val="22"/>
+          <w:shd w:fill="auto" w:val="clear"/>
+        </w:rPr>
+        <w:t xml:space="preserve">The narrative takes place inside the mind of a college student. They wake up in a empty room with nothing but candles and a note with the caption "Happiness is a detriment" written all over it. Unaware of who they are, and how they got here, they decide to investigate their surroundings hoping to find answers and clues as to who they are. The more rooms they explore, the more conclusions they reach regarding who they are.</w:t>
+      </w:r>
+    </w:p>
+    <w:p>
+      <w:pPr>
+        <w:spacing w:before="0" w:after="0" w:line="276"/>
+        <w:ind w:right="0" w:left="0" w:firstLine="0"/>
+        <w:jc w:val="both"/>
+        <w:rPr>
+          <w:rFonts w:ascii="Arial" w:hAnsi="Arial" w:cs="Arial" w:eastAsia="Arial"/>
+          <w:color w:val="auto"/>
+          <w:spacing w:val="0"/>
+          <w:position w:val="0"/>
+          <w:sz w:val="22"/>
+          <w:shd w:fill="auto" w:val="clear"/>
+        </w:rPr>
+      </w:pPr>
+    </w:p>
+    <w:p>
+      <w:pPr>
+        <w:spacing w:before="0" w:after="0" w:line="276"/>
+        <w:ind w:right="0" w:left="0" w:firstLine="0"/>
+        <w:jc w:val="both"/>
+        <w:rPr>
+          <w:rFonts w:ascii="Arial" w:hAnsi="Arial" w:cs="Arial" w:eastAsia="Arial"/>
+          <w:color w:val="auto"/>
+          <w:spacing w:val="0"/>
+          <w:position w:val="0"/>
+          <w:sz w:val="22"/>
+          <w:shd w:fill="auto" w:val="clear"/>
+        </w:rPr>
+      </w:pPr>
+      <w:r>
+        <w:rPr>
+          <w:rFonts w:ascii="Arial" w:hAnsi="Arial" w:cs="Arial" w:eastAsia="Arial"/>
+          <w:color w:val="auto"/>
+          <w:spacing w:val="0"/>
+          <w:position w:val="0"/>
+          <w:sz w:val="22"/>
+          <w:shd w:fill="auto" w:val="clear"/>
+        </w:rPr>
+        <w:t xml:space="preserve">They are a 19 year old art student who possesses a really rare case of Cherophobia - The irrational fear of being happy. Growing up, against their parents attempts, they have always attempted to avoid social interactions and anything happiness-inducing, and spent most their time isolating doing the only hobby that slightly comforted them: Drawing. Multiple art pieces can be found in levels that depict some of their works, most of them portraying distorted characters and scratched over drawings of "happy" moments in their lives, done in an attempt to forget and erase them from memory.</w:t>
+      </w:r>
+    </w:p>
+    <w:p>
+      <w:pPr>
+        <w:spacing w:before="0" w:after="0" w:line="276"/>
+        <w:ind w:right="0" w:left="0" w:firstLine="0"/>
+        <w:jc w:val="both"/>
+        <w:rPr>
+          <w:rFonts w:ascii="Arial" w:hAnsi="Arial" w:cs="Arial" w:eastAsia="Arial"/>
+          <w:color w:val="auto"/>
+          <w:spacing w:val="0"/>
+          <w:position w:val="0"/>
+          <w:sz w:val="22"/>
+          <w:shd w:fill="auto" w:val="clear"/>
+        </w:rPr>
+      </w:pPr>
+    </w:p>
+    <w:p>
+      <w:pPr>
+        <w:spacing w:before="0" w:after="0" w:line="276"/>
+        <w:ind w:right="0" w:left="0" w:firstLine="0"/>
+        <w:jc w:val="both"/>
+        <w:rPr>
+          <w:rFonts w:ascii="Arial" w:hAnsi="Arial" w:cs="Arial" w:eastAsia="Arial"/>
+          <w:color w:val="auto"/>
+          <w:spacing w:val="0"/>
+          <w:position w:val="0"/>
+          <w:sz w:val="22"/>
+          <w:shd w:fill="auto" w:val="clear"/>
+        </w:rPr>
+      </w:pPr>
+      <w:r>
+        <w:rPr>
+          <w:rFonts w:ascii="Arial" w:hAnsi="Arial" w:cs="Arial" w:eastAsia="Arial"/>
+          <w:color w:val="auto"/>
+          <w:spacing w:val="0"/>
+          <w:position w:val="0"/>
+          <w:sz w:val="22"/>
+          <w:shd w:fill="auto" w:val="clear"/>
+        </w:rPr>
+        <w:t xml:space="preserve">Later on the game, it is learned that before they went into coma, during one of their birthday parties, they have gravely injured a classmate to the point of putting them in coma by accident for trying to gift them an artbook (Cause: Head Trauma induced by falling into the corner of a table. This happens since the character has pushed them in an attempt to reject the gift). After this event took place, they were placed in Therapy. The guilt was immense, causing them to attempt to kill themselves by smashing their head into a wall and, consecutevely, placing themselves into a coma.</w:t>
+      </w:r>
+    </w:p>
+    <w:p>
+      <w:pPr>
+        <w:spacing w:before="0" w:after="0" w:line="276"/>
+        <w:ind w:right="0" w:left="0" w:firstLine="0"/>
+        <w:jc w:val="both"/>
+        <w:rPr>
+          <w:rFonts w:ascii="Arial" w:hAnsi="Arial" w:cs="Arial" w:eastAsia="Arial"/>
+          <w:color w:val="auto"/>
+          <w:spacing w:val="0"/>
+          <w:position w:val="0"/>
+          <w:sz w:val="22"/>
+          <w:shd w:fill="auto" w:val="clear"/>
+        </w:rPr>
+      </w:pPr>
+    </w:p>
+    <w:p>
+      <w:pPr>
+        <w:spacing w:before="0" w:after="0" w:line="276"/>
+        <w:ind w:right="0" w:left="0" w:firstLine="0"/>
+        <w:jc w:val="both"/>
+        <w:rPr>
+          <w:rFonts w:ascii="Calibri Light" w:hAnsi="Calibri Light" w:cs="Calibri Light" w:eastAsia="Calibri Light"/>
+          <w:color w:val="2F5496"/>
+          <w:spacing w:val="0"/>
+          <w:position w:val="0"/>
+          <w:sz w:val="28"/>
+          <w:shd w:fill="auto" w:val="clear"/>
+        </w:rPr>
+      </w:pPr>
+      <w:r>
+        <w:rPr>
+          <w:rFonts w:ascii="Calibri Light" w:hAnsi="Calibri Light" w:cs="Calibri Light" w:eastAsia="Calibri Light"/>
+          <w:color w:val="2F5496"/>
+          <w:spacing w:val="0"/>
+          <w:position w:val="0"/>
+          <w:sz w:val="36"/>
+          <w:shd w:fill="auto" w:val="clear"/>
+        </w:rPr>
+        <w:t xml:space="preserve">ENEMY DESIGNS</w:t>
+      </w:r>
     </w:p>
     <w:p>
       <w:pPr>
@@ -3069,18 +2971,18 @@
           <w:sz w:val="22"/>
           <w:shd w:fill="auto" w:val="clear"/>
         </w:rPr>
-        <w:t xml:space="preserve">Phantoms: </w:t>
-      </w:r>
-      <w:r>
-        <w:rPr>
-          <w:rFonts w:ascii="Arial" w:hAnsi="Arial" w:cs="Arial" w:eastAsia="Arial"/>
-          <w:color w:val="auto"/>
-          <w:spacing w:val="0"/>
-          <w:position w:val="0"/>
-          <w:sz w:val="22"/>
-          <w:shd w:fill="auto" w:val="clear"/>
-        </w:rPr>
-        <w:t xml:space="preserve">Similiar to a "Dementor" from the "Harry Potter" franchise in design, however with an inverse role: Inflicting happy memories into the player rather than draining them [1].</w:t>
+        <w:t xml:space="preserve">The Mimic: </w:t>
+      </w:r>
+      <w:r>
+        <w:rPr>
+          <w:rFonts w:ascii="Arial" w:hAnsi="Arial" w:cs="Arial" w:eastAsia="Arial"/>
+          <w:color w:val="auto"/>
+          <w:spacing w:val="0"/>
+          <w:position w:val="0"/>
+          <w:sz w:val="22"/>
+          <w:shd w:fill="auto" w:val="clear"/>
+        </w:rPr>
+        <w:t xml:space="preserve">Meant to represent a thin, white-skinned humanoid creature with glowing eyes and sharp claws. They are meant to blend in with the environment physically, with their glowing eyes being the only reliable indicator for the player that the mimic is in sight.</w:t>
       </w:r>
     </w:p>
     <w:p>
@@ -3113,8 +3015,8 @@
         </w:rPr>
       </w:pPr>
       <w:r>
-        <w:object w:dxaOrig="4020" w:dyaOrig="5249">
-          <v:rect xmlns:o="urn:schemas-microsoft-com:office:office" xmlns:v="urn:schemas-microsoft-com:vml" id="rectole0000000003" style="width:201.000000pt;height:262.450000pt" o:preferrelative="t" o:ole="">
+        <w:object w:dxaOrig="8422" w:dyaOrig="8422">
+          <v:rect xmlns:o="urn:schemas-microsoft-com:office:office" xmlns:v="urn:schemas-microsoft-com:vml" id="rectole0000000003" style="width:421.100000pt;height:421.100000pt" o:preferrelative="t" o:ole="">
             <o:lock v:ext="edit"/>
             <v:imagedata xmlns:r="http://schemas.openxmlformats.org/officeDocument/2006/relationships" r:id="docRId7" o:title=""/>
           </v:rect>
@@ -3124,35 +3026,9 @@
     </w:p>
     <w:p>
       <w:pPr>
-        <w:spacing w:before="0" w:after="0" w:line="240"/>
-        <w:ind w:right="0" w:left="0" w:firstLine="0"/>
-        <w:jc w:val="center"/>
-        <w:rPr>
-          <w:rFonts w:ascii="Arial" w:hAnsi="Arial" w:cs="Arial" w:eastAsia="Arial"/>
-          <w:color w:val="auto"/>
-          <w:spacing w:val="0"/>
-          <w:position w:val="0"/>
-          <w:sz w:val="22"/>
-          <w:shd w:fill="auto" w:val="clear"/>
-        </w:rPr>
-      </w:pPr>
-    </w:p>
-    <w:p>
-      <w:pPr>
-        <w:spacing w:before="0" w:after="0" w:line="276"/>
-        <w:ind w:right="0" w:left="0" w:firstLine="0"/>
-        <w:jc w:val="both"/>
-        <w:rPr>
-          <w:rFonts w:ascii="Arial" w:hAnsi="Arial" w:cs="Arial" w:eastAsia="Arial"/>
-          <w:b/>
-          <w:color w:val="auto"/>
-          <w:spacing w:val="0"/>
-          <w:position w:val="0"/>
-          <w:sz w:val="24"/>
-          <w:shd w:fill="auto" w:val="clear"/>
-        </w:rPr>
-      </w:pPr>
-      <w:r>
+        <w:spacing w:before="0" w:after="0" w:line="276"/>
+        <w:ind w:right="0" w:left="0" w:firstLine="0"/>
+        <w:jc w:val="both"/>
         <w:rPr>
           <w:rFonts w:ascii="Arial" w:hAnsi="Arial" w:cs="Arial" w:eastAsia="Arial"/>
           <w:color w:val="auto"/>
@@ -3162,6 +3038,169 @@
           <w:u w:val="single"/>
           <w:shd w:fill="auto" w:val="clear"/>
         </w:rPr>
+      </w:pPr>
+      <w:r>
+        <w:rPr>
+          <w:rFonts w:ascii="Arial" w:hAnsi="Arial" w:cs="Arial" w:eastAsia="Arial"/>
+          <w:color w:val="auto"/>
+          <w:spacing w:val="0"/>
+          <w:position w:val="0"/>
+          <w:sz w:val="16"/>
+          <w:u w:val="single"/>
+          <w:shd w:fill="auto" w:val="clear"/>
+        </w:rPr>
+        <w:t xml:space="preserve">Image: Artwork of The Rake's creature. Author of image unknown</w:t>
+      </w:r>
+    </w:p>
+    <w:p>
+      <w:pPr>
+        <w:spacing w:before="0" w:after="0" w:line="276"/>
+        <w:ind w:right="0" w:left="0" w:firstLine="0"/>
+        <w:jc w:val="both"/>
+        <w:rPr>
+          <w:rFonts w:ascii="Arial" w:hAnsi="Arial" w:cs="Arial" w:eastAsia="Arial"/>
+          <w:color w:val="auto"/>
+          <w:spacing w:val="0"/>
+          <w:position w:val="0"/>
+          <w:sz w:val="16"/>
+          <w:u w:val="single"/>
+          <w:shd w:fill="auto" w:val="clear"/>
+        </w:rPr>
+      </w:pPr>
+    </w:p>
+    <w:p>
+      <w:pPr>
+        <w:spacing w:before="0" w:after="0" w:line="276"/>
+        <w:ind w:right="0" w:left="0" w:firstLine="0"/>
+        <w:jc w:val="both"/>
+        <w:rPr>
+          <w:rFonts w:ascii="Calibri Light" w:hAnsi="Calibri Light" w:cs="Calibri Light" w:eastAsia="Calibri Light"/>
+          <w:color w:val="2F5496"/>
+          <w:spacing w:val="0"/>
+          <w:position w:val="0"/>
+          <w:sz w:val="24"/>
+          <w:u w:val="single"/>
+          <w:shd w:fill="auto" w:val="clear"/>
+        </w:rPr>
+      </w:pPr>
+    </w:p>
+    <w:p>
+      <w:pPr>
+        <w:spacing w:before="0" w:after="0" w:line="276"/>
+        <w:ind w:right="0" w:left="0" w:firstLine="0"/>
+        <w:jc w:val="both"/>
+        <w:rPr>
+          <w:rFonts w:ascii="Arial" w:hAnsi="Arial" w:cs="Arial" w:eastAsia="Arial"/>
+          <w:color w:val="auto"/>
+          <w:spacing w:val="0"/>
+          <w:position w:val="0"/>
+          <w:sz w:val="22"/>
+          <w:shd w:fill="auto" w:val="clear"/>
+        </w:rPr>
+      </w:pPr>
+      <w:r>
+        <w:rPr>
+          <w:rFonts w:ascii="Arial" w:hAnsi="Arial" w:cs="Arial" w:eastAsia="Arial"/>
+          <w:b/>
+          <w:color w:val="auto"/>
+          <w:spacing w:val="0"/>
+          <w:position w:val="0"/>
+          <w:sz w:val="22"/>
+          <w:shd w:fill="auto" w:val="clear"/>
+        </w:rPr>
+        <w:t xml:space="preserve">Phantoms: </w:t>
+      </w:r>
+      <w:r>
+        <w:rPr>
+          <w:rFonts w:ascii="Arial" w:hAnsi="Arial" w:cs="Arial" w:eastAsia="Arial"/>
+          <w:color w:val="auto"/>
+          <w:spacing w:val="0"/>
+          <w:position w:val="0"/>
+          <w:sz w:val="22"/>
+          <w:shd w:fill="auto" w:val="clear"/>
+        </w:rPr>
+        <w:t xml:space="preserve">Similiar to a "Dementor" from the "Harry Potter" franchise in design, however with an inverse role: Inflicting happy memories into the player rather than draining them [1].</w:t>
+      </w:r>
+    </w:p>
+    <w:p>
+      <w:pPr>
+        <w:spacing w:before="0" w:after="0" w:line="276"/>
+        <w:ind w:right="0" w:left="0" w:firstLine="0"/>
+        <w:jc w:val="both"/>
+        <w:rPr>
+          <w:rFonts w:ascii="Arial" w:hAnsi="Arial" w:cs="Arial" w:eastAsia="Arial"/>
+          <w:color w:val="auto"/>
+          <w:spacing w:val="0"/>
+          <w:position w:val="0"/>
+          <w:sz w:val="22"/>
+          <w:shd w:fill="auto" w:val="clear"/>
+        </w:rPr>
+      </w:pPr>
+    </w:p>
+    <w:p>
+      <w:pPr>
+        <w:spacing w:before="0" w:after="0" w:line="240"/>
+        <w:ind w:right="0" w:left="0" w:firstLine="0"/>
+        <w:jc w:val="center"/>
+        <w:rPr>
+          <w:rFonts w:ascii="Arial" w:hAnsi="Arial" w:cs="Arial" w:eastAsia="Arial"/>
+          <w:color w:val="auto"/>
+          <w:spacing w:val="0"/>
+          <w:position w:val="0"/>
+          <w:sz w:val="22"/>
+          <w:shd w:fill="auto" w:val="clear"/>
+        </w:rPr>
+      </w:pPr>
+      <w:r>
+        <w:object w:dxaOrig="4069" w:dyaOrig="5304">
+          <v:rect xmlns:o="urn:schemas-microsoft-com:office:office" xmlns:v="urn:schemas-microsoft-com:vml" id="rectole0000000004" style="width:203.450000pt;height:265.200000pt" o:preferrelative="t" o:ole="">
+            <o:lock v:ext="edit"/>
+            <v:imagedata xmlns:r="http://schemas.openxmlformats.org/officeDocument/2006/relationships" r:id="docRId9" o:title=""/>
+          </v:rect>
+          <o:OLEObject xmlns:r="http://schemas.openxmlformats.org/officeDocument/2006/relationships" xmlns:o="urn:schemas-microsoft-com:office:office" Type="Embed" ProgID="StaticDib" DrawAspect="Content" ObjectID="0000000004" ShapeID="rectole0000000004" r:id="docRId8"/>
+        </w:object>
+      </w:r>
+    </w:p>
+    <w:p>
+      <w:pPr>
+        <w:spacing w:before="0" w:after="0" w:line="240"/>
+        <w:ind w:right="0" w:left="0" w:firstLine="0"/>
+        <w:jc w:val="center"/>
+        <w:rPr>
+          <w:rFonts w:ascii="Arial" w:hAnsi="Arial" w:cs="Arial" w:eastAsia="Arial"/>
+          <w:color w:val="auto"/>
+          <w:spacing w:val="0"/>
+          <w:position w:val="0"/>
+          <w:sz w:val="22"/>
+          <w:shd w:fill="auto" w:val="clear"/>
+        </w:rPr>
+      </w:pPr>
+    </w:p>
+    <w:p>
+      <w:pPr>
+        <w:spacing w:before="0" w:after="0" w:line="276"/>
+        <w:ind w:right="0" w:left="0" w:firstLine="0"/>
+        <w:jc w:val="both"/>
+        <w:rPr>
+          <w:rFonts w:ascii="Arial" w:hAnsi="Arial" w:cs="Arial" w:eastAsia="Arial"/>
+          <w:b/>
+          <w:color w:val="auto"/>
+          <w:spacing w:val="0"/>
+          <w:position w:val="0"/>
+          <w:sz w:val="24"/>
+          <w:shd w:fill="auto" w:val="clear"/>
+        </w:rPr>
+      </w:pPr>
+      <w:r>
+        <w:rPr>
+          <w:rFonts w:ascii="Arial" w:hAnsi="Arial" w:cs="Arial" w:eastAsia="Arial"/>
+          <w:color w:val="auto"/>
+          <w:spacing w:val="0"/>
+          <w:position w:val="0"/>
+          <w:sz w:val="16"/>
+          <w:u w:val="single"/>
+          <w:shd w:fill="auto" w:val="clear"/>
+        </w:rPr>
         <w:t xml:space="preserve">Image: Concept Art of a Dementor from "Harry Potter", from the series wiki page.</w:t>
       </w:r>
     </w:p>
@@ -3237,7 +3276,7 @@
       <w:pPr>
         <w:numPr>
           <w:ilvl w:val="0"/>
-          <w:numId w:val="37"/>
+          <w:numId w:val="38"/>
         </w:numPr>
         <w:spacing w:before="0" w:after="160" w:line="278"/>
         <w:ind w:right="0" w:left="720" w:hanging="360"/>
@@ -3271,194 +3310,7 @@
           <w:sz w:val="24"/>
           <w:shd w:fill="auto" w:val="clear"/>
         </w:rPr>
-        <w:t xml:space="preserve">→</w:t>
-      </w:r>
-      <w:r>
-        <w:rPr>
-          <w:rFonts w:ascii="Cambria Math" w:hAnsi="Cambria Math" w:cs="Cambria Math" w:eastAsia="Cambria Math"/>
-          <w:color w:val="auto"/>
-          <w:spacing w:val="0"/>
-          <w:position w:val="0"/>
-          <w:sz w:val="24"/>
-          <w:shd w:fill="auto" w:val="clear"/>
-        </w:rPr>
-        <w:t xml:space="preserve"> Importants mechanics like Happiness Bar </w:t>
-      </w:r>
-      <w:r>
-        <w:rPr>
-          <w:rFonts w:ascii="Cambria Math" w:hAnsi="Cambria Math" w:cs="Cambria Math" w:eastAsia="Cambria Math"/>
-          <w:color w:val="auto"/>
-          <w:spacing w:val="0"/>
-          <w:position w:val="0"/>
-          <w:sz w:val="24"/>
-          <w:shd w:fill="auto" w:val="clear"/>
-        </w:rPr>
-        <w:t xml:space="preserve">→</w:t>
-      </w:r>
-      <w:r>
-        <w:rPr>
-          <w:rFonts w:ascii="Cambria Math" w:hAnsi="Cambria Math" w:cs="Cambria Math" w:eastAsia="Cambria Math"/>
-          <w:color w:val="auto"/>
-          <w:spacing w:val="0"/>
-          <w:position w:val="0"/>
-          <w:sz w:val="24"/>
-          <w:shd w:fill="auto" w:val="clear"/>
-        </w:rPr>
-        <w:t xml:space="preserve"> Enemy AI </w:t>
-      </w:r>
-      <w:r>
-        <w:rPr>
-          <w:rFonts w:ascii="Cambria Math" w:hAnsi="Cambria Math" w:cs="Cambria Math" w:eastAsia="Cambria Math"/>
-          <w:color w:val="auto"/>
-          <w:spacing w:val="0"/>
-          <w:position w:val="0"/>
-          <w:sz w:val="24"/>
-          <w:shd w:fill="auto" w:val="clear"/>
-        </w:rPr>
-        <w:t xml:space="preserve">→</w:t>
-      </w:r>
-      <w:r>
-        <w:rPr>
-          <w:rFonts w:ascii="Cambria Math" w:hAnsi="Cambria Math" w:cs="Cambria Math" w:eastAsia="Cambria Math"/>
-          <w:color w:val="auto"/>
-          <w:spacing w:val="0"/>
-          <w:position w:val="0"/>
-          <w:sz w:val="24"/>
-          <w:shd w:fill="auto" w:val="clear"/>
-        </w:rPr>
-        <w:t xml:space="preserve"> Hiding mechanic </w:t>
-      </w:r>
-      <w:r>
-        <w:rPr>
-          <w:rFonts w:ascii="Cambria Math" w:hAnsi="Cambria Math" w:cs="Cambria Math" w:eastAsia="Cambria Math"/>
-          <w:color w:val="auto"/>
-          <w:spacing w:val="0"/>
-          <w:position w:val="0"/>
-          <w:sz w:val="24"/>
-          <w:shd w:fill="auto" w:val="clear"/>
-        </w:rPr>
-        <w:t xml:space="preserve">→</w:t>
-      </w:r>
-      <w:r>
-        <w:rPr>
-          <w:rFonts w:ascii="Cambria Math" w:hAnsi="Cambria Math" w:cs="Cambria Math" w:eastAsia="Cambria Math"/>
-          <w:color w:val="auto"/>
-          <w:spacing w:val="0"/>
-          <w:position w:val="0"/>
-          <w:sz w:val="24"/>
-          <w:shd w:fill="auto" w:val="clear"/>
-        </w:rPr>
-        <w:t xml:space="preserve"> Traps </w:t>
-      </w:r>
-      <w:r>
-        <w:rPr>
-          <w:rFonts w:ascii="Cambria Math" w:hAnsi="Cambria Math" w:cs="Cambria Math" w:eastAsia="Cambria Math"/>
-          <w:color w:val="auto"/>
-          <w:spacing w:val="0"/>
-          <w:position w:val="0"/>
-          <w:sz w:val="24"/>
-          <w:shd w:fill="auto" w:val="clear"/>
-        </w:rPr>
-        <w:t xml:space="preserve">→</w:t>
-      </w:r>
-      <w:r>
-        <w:rPr>
-          <w:rFonts w:ascii="Cambria Math" w:hAnsi="Cambria Math" w:cs="Cambria Math" w:eastAsia="Cambria Math"/>
-          <w:color w:val="auto"/>
-          <w:spacing w:val="0"/>
-          <w:position w:val="0"/>
-          <w:sz w:val="24"/>
-          <w:shd w:fill="auto" w:val="clear"/>
-        </w:rPr>
-        <w:t xml:space="preserve"> Items </w:t>
-      </w:r>
-      <w:r>
-        <w:rPr>
-          <w:rFonts w:ascii="Cambria Math" w:hAnsi="Cambria Math" w:cs="Cambria Math" w:eastAsia="Cambria Math"/>
-          <w:color w:val="auto"/>
-          <w:spacing w:val="0"/>
-          <w:position w:val="0"/>
-          <w:sz w:val="24"/>
-          <w:shd w:fill="auto" w:val="clear"/>
-        </w:rPr>
-        <w:t xml:space="preserve">→</w:t>
-      </w:r>
-      <w:r>
-        <w:rPr>
-          <w:rFonts w:ascii="Cambria Math" w:hAnsi="Cambria Math" w:cs="Cambria Math" w:eastAsia="Cambria Math"/>
-          <w:color w:val="auto"/>
-          <w:spacing w:val="0"/>
-          <w:position w:val="0"/>
-          <w:sz w:val="24"/>
-          <w:shd w:fill="auto" w:val="clear"/>
-        </w:rPr>
-        <w:t xml:space="preserve"> playable map </w:t>
-      </w:r>
-      <w:r>
-        <w:rPr>
-          <w:rFonts w:ascii="Cambria Math" w:hAnsi="Cambria Math" w:cs="Cambria Math" w:eastAsia="Cambria Math"/>
-          <w:color w:val="auto"/>
-          <w:spacing w:val="0"/>
-          <w:position w:val="0"/>
-          <w:sz w:val="24"/>
-          <w:shd w:fill="auto" w:val="clear"/>
-        </w:rPr>
-        <w:t xml:space="preserve">→</w:t>
-      </w:r>
-      <w:r>
-        <w:rPr>
-          <w:rFonts w:ascii="Cambria Math" w:hAnsi="Cambria Math" w:cs="Cambria Math" w:eastAsia="Cambria Math"/>
-          <w:color w:val="auto"/>
-          <w:spacing w:val="0"/>
-          <w:position w:val="0"/>
-          <w:sz w:val="24"/>
-          <w:shd w:fill="auto" w:val="clear"/>
-        </w:rPr>
-        <w:t xml:space="preserve"> cutscenes/lore </w:t>
-      </w:r>
-      <w:r>
-        <w:rPr>
-          <w:rFonts w:ascii="Cambria Math" w:hAnsi="Cambria Math" w:cs="Cambria Math" w:eastAsia="Cambria Math"/>
-          <w:color w:val="auto"/>
-          <w:spacing w:val="0"/>
-          <w:position w:val="0"/>
-          <w:sz w:val="24"/>
-          <w:shd w:fill="auto" w:val="clear"/>
-        </w:rPr>
-        <w:t xml:space="preserve">→</w:t>
-      </w:r>
-      <w:r>
-        <w:rPr>
-          <w:rFonts w:ascii="Cambria Math" w:hAnsi="Cambria Math" w:cs="Cambria Math" w:eastAsia="Cambria Math"/>
-          <w:color w:val="auto"/>
-          <w:spacing w:val="0"/>
-          <w:position w:val="0"/>
-          <w:sz w:val="24"/>
-          <w:shd w:fill="auto" w:val="clear"/>
-        </w:rPr>
-        <w:t xml:space="preserve"> polishing </w:t>
-      </w:r>
-      <w:r>
-        <w:rPr>
-          <w:rFonts w:ascii="Cambria Math" w:hAnsi="Cambria Math" w:cs="Cambria Math" w:eastAsia="Cambria Math"/>
-          <w:color w:val="auto"/>
-          <w:spacing w:val="0"/>
-          <w:position w:val="0"/>
-          <w:sz w:val="24"/>
-          <w:shd w:fill="auto" w:val="clear"/>
-        </w:rPr>
-        <w:t xml:space="preserve">→</w:t>
-      </w:r>
-      <w:r>
-        <w:rPr>
-          <w:rFonts w:ascii="Cambria Math" w:hAnsi="Cambria Math" w:cs="Cambria Math" w:eastAsia="Cambria Math"/>
-          <w:color w:val="auto"/>
-          <w:spacing w:val="0"/>
-          <w:position w:val="0"/>
-          <w:sz w:val="24"/>
-          <w:shd w:fill="auto" w:val="clear"/>
-        </w:rPr>
-        <w:t xml:space="preserve"> release)</w:t>
+        <w:t xml:space="preserve">→ Importants mechanics like Happiness Bar → Enemy AI → Hiding mechanic → Traps → Items → playable map → cutscenes/lore → polishing → release)</w:t>
       </w:r>
     </w:p>
     <w:p>
@@ -3491,7 +3343,7 @@
       <w:pPr>
         <w:numPr>
           <w:ilvl w:val="0"/>
-          <w:numId w:val="39"/>
+          <w:numId w:val="40"/>
         </w:numPr>
         <w:spacing w:before="0" w:after="160" w:line="278"/>
         <w:ind w:right="0" w:left="720" w:hanging="360"/>
@@ -3547,7 +3399,7 @@
       <w:pPr>
         <w:numPr>
           <w:ilvl w:val="0"/>
-          <w:numId w:val="41"/>
+          <w:numId w:val="42"/>
         </w:numPr>
         <w:spacing w:before="0" w:after="160" w:line="278"/>
         <w:ind w:right="0" w:left="720" w:hanging="360"/>
@@ -3665,7 +3517,7 @@
         </w:rPr>
         <w:t xml:space="preserve">Harry Potter Wiki. (2018). Dementor. [online] Available at: </w:t>
       </w:r>
-      <w:hyperlink xmlns:r="http://schemas.openxmlformats.org/officeDocument/2006/relationships" r:id="docRId8">
+      <w:hyperlink xmlns:r="http://schemas.openxmlformats.org/officeDocument/2006/relationships" r:id="docRId10">
         <w:r>
           <w:rPr>
             <w:rFonts w:ascii="Calibri" w:hAnsi="Calibri" w:cs="Calibri" w:eastAsia="Calibri"/>
@@ -3889,19 +3741,19 @@
   <w:num w:numId="22">
     <w:abstractNumId w:val="30"/>
   </w:num>
-  <w:num w:numId="25">
+  <w:num w:numId="24">
     <w:abstractNumId w:val="24"/>
   </w:num>
-  <w:num w:numId="27">
+  <w:num w:numId="26">
     <w:abstractNumId w:val="18"/>
   </w:num>
-  <w:num w:numId="37">
+  <w:num w:numId="38">
     <w:abstractNumId w:val="12"/>
   </w:num>
-  <w:num w:numId="39">
+  <w:num w:numId="40">
     <w:abstractNumId w:val="6"/>
   </w:num>
-  <w:num w:numId="41">
+  <w:num w:numId="42">
     <w:abstractNumId w:val="0"/>
   </w:num>
 </w:numbering>

</xml_diff>